<commit_message>
fix: humanizar relatorio + d3 responsivo + motion parallax + fix lucide icon
</commit_message>
<xml_diff>
--- a/RELATORIO_FINAL.docx
+++ b/RELATORIO_FINAL.docx
@@ -223,7 +223,7 @@
         <w:rPr>
           <w:rFonts w:ascii="Times New Roman" w:hAnsi="Times New Roman"/>
         </w:rPr>
-        <w:t>. A sobreposição de subproblemas ocorre quando, ao decompor recursivamente o problema original, os mesmos subproblemas menores são gerados repetidamente — fenômeno que não ocorre, por exemplo, na ordenação por merge sort, em que cada subproblema é distinto. Já a subestrutura ótima é a propriedade que garante que a solução ótima do problema original pode ser construída a partir das soluções ótimas de seus subproblemas, permitindo a composição de respostas sem a necessidade de reavaliar decisões anteriores.</w:t>
+        <w:t>. A sobreposição de subproblemas ocorre quando, ao decompor recursivamente o problema original, os mesmos subproblemas menores são gerados repetidamente :  fenômeno que não ocorre, por exemplo, na ordenação por merge sort, em que cada subproblema é distinto. Já a subestrutura ótima é a propriedade que garante que a solução ótima do problema original pode ser construída a partir das soluções ótimas de seus subproblemas, permitindo a composição de respostas sem a necessidade de reavaliar decisões anteriores.</w:t>
       </w:r>
     </w:p>
     <w:p>
@@ -234,7 +234,7 @@
           <w:b w:val="0"/>
           <w:i w:val="0"/>
         </w:rPr>
-        <w:t>A diferença essencial entre Programação Dinâmica e a técnica de divisão-e-conquista reside justamente na natureza dos subproblemas. Na divisão-e-conquista, os subproblemas são independentes e disjuntos — pense no quicksort ou na busca binária —, de modo que cada subproblema é resolvido recursivamente exatamente uma vez. Na Programação Dinâmica, os subproblemas se sobrepõem, e resolvê-los repetidamente sem memorização resultaria em explosão combinatória. A DP resolve essa ineficiência armazenando resultados em estruturas de dados (tipicamente tabelas ou matrizes) e consultando-os quando necessário, um trade-off deliberado de espaço por tempo. A técnica deve ser empregada sempre que o problema exibir as duas propriedades mencionadas e o espaço de estados for gerenciável em memória.</w:t>
+        <w:t>A diferença essencial entre Programação Dinâmica e a técnica de divisão-e-conquista reside justamente na natureza dos subproblemas. Na divisão-e-conquista, os subproblemas são independentes e disjuntos :  pense no quicksort ou na busca binária : , de modo que cada subproblema é resolvido recursivamente exatamente uma vez. Na Programação Dinâmica, os subproblemas se sobrepõem, e resolvê-los repetidamente sem memorização resultaria em explosão combinatória. A DP resolve essa ineficiência armazenando resultados em estruturas de dados (tipicamente tabelas ou matrizes) e consultando-os quando necessário, um trade-off deliberado de espaço por tempo. A técnica deve ser empregada sempre que o problema exibir as duas propriedades mencionadas e o espaço de estados for gerenciável em memória.</w:t>
       </w:r>
     </w:p>
     <w:p>
@@ -253,7 +253,7 @@
           <w:b w:val="0"/>
           <w:i w:val="0"/>
         </w:rPr>
-        <w:t>A Programação Dinâmica admite duas estratégias clássicas de implementação, que diferem fundamentalmente na ordem em que os subproblemas são visitados. A primeira, conhecida como memoização (do inglês memoization), adota uma perspectiva top-down: parte-se do problema original e recorre-se aos subproblemas menores conforme necessário, armazenando os resultados em uma estrutura de cache — tipicamente um dicionário ou vetor indexado — de modo que cada subproblema seja resolvido no máximo uma vez. A principal vantagem da memoização é sua elegância conceitual: a implementação segue naturalmente a definição recursiva do problema, preservando a clareza do raciocínio matemático original. Além disso, a memoização resolve apenas os subproblemas estritamente necessários para a solução do problema original — se determinados estados nunca são visitados, seus valores jamais são computados. A desvantagem reside no overhead das chamadas recursivas, que consomem espaço na pilha de execução e podem causar estouro de pilha para problemas com profundidade de recursão elevada.</w:t>
+        <w:t>A Programação Dinâmica admite duas estratégias clássicas de implementação, que diferem fundamentalmente na ordem em que os subproblemas são visitados. A primeira, conhecida como memoização (do inglês memoization), adota uma perspectiva top-down: parte-se do problema original e recorre-se aos subproblemas menores conforme necessário, armazenando os resultados em uma estrutura de cache :  tipicamente um dicionário ou vetor indexado :  de modo que cada subproblema seja resolvido no máximo uma vez. A principal vantagem da memoização é sua elegância conceitual: a implementação segue naturalmente a definição recursiva do problema, preservando a clareza do raciocínio matemático original. Além disso, a memoização resolve apenas os subproblemas estritamente necessários para a solução do problema original :  se determinados estados nunca são visitados, seus valores jamais são computados. A desvantagem reside no overhead das chamadas recursivas, que consomem espaço na pilha de execução e podem causar estouro de pilha para problemas com profundidade de recursão elevada.</w:t>
       </w:r>
     </w:p>
     <w:p>
@@ -275,7 +275,7 @@
           <w:b w:val="0"/>
           <w:i w:val="0"/>
         </w:rPr>
-        <w:t>A análise de complexidade em Programação Dinâmica é parametrizada pelo número de estados distintos do problema e pelo custo de transição entre estados. Se um problema possui S estados distintos e cada transição pode ser computada em tempo T, a complexidade temporal será O(S · T). No caso do tabelamento, essa análise é direta: preenchemos S entradas da tabela, cada uma exigindo T operações. A complexidade espacial é O(S), podendo ser reduzida quando as transições dependem apenas de um subconjunto limitado de estados anteriores. É importante notar que, para problemas cujo número de estados depende de parâmetros numéricos do domínio (como a capacidade W no problema da mochila), a complexidade resultante é pseudo-polinomial — polinomial no valor numérico da entrada, mas não no número de bits necessários para representá-la —, o que distingue esses problemas dos genuinamente polinomiais.</w:t>
+        <w:t>A análise de complexidade em Programação Dinâmica é parametrizada pelo número de estados distintos do problema e pelo custo de transição entre estados. Se um problema possui S estados distintos e cada transição pode ser computada em tempo T, a complexidade temporal será O(S · T). No caso do tabelamento, essa análise é direta: preenchemos S entradas da tabela, cada uma exigindo T operações. A complexidade espacial é O(S), podendo ser reduzida quando as transições dependem apenas de um subconjunto limitado de estados anteriores. É importante notar que, para problemas cujo número de estados depende de parâmetros numéricos do domínio (como a capacidade W no problema da mochila), a complexidade resultante é pseudo-polinomial :  polinomial no valor numérico da entrada, mas não no número de bits necessários para representá-la : , o que distingue esses problemas dos genuinamente polinomiais.</w:t>
       </w:r>
     </w:p>
     <w:p>
@@ -294,7 +294,7 @@
           <w:b w:val="0"/>
           <w:i w:val="0"/>
         </w:rPr>
-        <w:t>O problema da Mochila 0/1 é um dos mais estudados na literatura de otimização combinatória e pertence à classe dos problemas NP-difíceis. Sua formulação clássica é notavelmente simples: dados n itens, cada qual com um peso w_i e um valor v_i, e uma mochila com capacidade máxima W, deseja-se selecionar um subconjunto de itens cujo peso total não exceda W e cujo valor total seja o maior possível. O qualificador "0/1" indica que cada item pode ser incluído no máximo uma vez — ou seja, trata-se de uma decisão binária: levar ou não levar o item. Formalmente, o problema pode ser expresso como:</w:t>
+        <w:t>O problema da Mochila 0/1 é um dos mais estudados na literatura de otimização combinatória e pertence à classe dos problemas NP-difíceis. Sua formulação clássica é notavelmente simples: dados n itens, cada qual com um peso w_i e um valor v_i, e uma mochila com capacidade máxima W, deseja-se selecionar um subconjunto de itens cujo peso total não exceda W e cujo valor total seja o maior possível. O qualificador "0/1" indica que cada item pode ser incluído no máximo uma vez :  ou seja, trata-se de uma decisão binária: levar ou não levar o item. Formalmente, o problema pode ser expresso como:</w:t>
       </w:r>
     </w:p>
     <w:p>
@@ -340,7 +340,7 @@
           <w:b/>
           <w:i/>
         </w:rPr>
-        <w:t>Tabela 1: Dados do exemplo didático — fretes disponíveis</w:t>
+        <w:t>Tabela 1: Dados do exemplo didático :  fretes disponíveis</w:t>
       </w:r>
     </w:p>
     <w:tbl>
@@ -689,7 +689,7 @@
           <w:b w:val="0"/>
           <w:i w:val="0"/>
         </w:rPr>
-        <w:t>A sobreposição de subproblemas torna-se evidente quando se observa que, durante a exploração do espaço de soluções, o mesmo par (i, w) — ou seja, a mesma combinação de "quantos itens considerar" e "quanta capacidade resta" — é visitado repetidamente por diferentes caminhos de decisão. Para n itens e capacidade W, existem exatamente (n+1) · (W+1) estados distintos no espaço de busca.</w:t>
+        <w:t>A sobreposição de subproblemas torna-se evidente quando se observa que, durante a exploração do espaço de soluções, o mesmo par (i, w) :  ou seja, a mesma combinação de "quantos itens considerar" e "quanta capacidade resta" :  é visitado repetidamente por diferentes caminhos de decisão. Para n itens e capacidade W, existem exatamente (n+1) · (W+1) estados distintos no espaço de busca.</w:t>
       </w:r>
     </w:p>
     <w:p>
@@ -1924,7 +1924,7 @@
         <w:pStyle w:val="Heading3"/>
       </w:pPr>
       <w:r>
-        <w:t>3.4.1. Versão Matricial — O(n·W)</w:t>
+        <w:t>3.4.1. Versão Matricial :  O(n·W)</w:t>
       </w:r>
     </w:p>
     <w:p>
@@ -2008,7 +2008,7 @@
         <w:pStyle w:val="Heading3"/>
       </w:pPr>
       <w:r>
-        <w:t>3.4.2. Versão Otimizada — O(W) de espaço</w:t>
+        <w:t>3.4.2. Versão Otimizada :  O(W) de espaço</w:t>
       </w:r>
     </w:p>
     <w:p>
@@ -2888,7 +2888,7 @@
           <w:b/>
           <w:i/>
         </w:rPr>
-        <w:t>Tabela 4: Comparativo de desempenho — 100 itens, W = 500</w:t>
+        <w:t>Tabela 4: Comparativo de desempenho :  100 itens, W = 500</w:t>
       </w:r>
     </w:p>
     <w:tbl>
@@ -3724,7 +3724,7 @@
           <w:b w:val="0"/>
           <w:i w:val="0"/>
         </w:rPr>
-        <w:t>A versão matricial da Programação Dinâmica para o problema da Mochila 0/1 preenche uma tabela de dimensões (n+1) × (W+1). Para cada uma das n·W células efetivamente computadas, realiza-se uma quantidade constante de operações — uma comparação e, no máximo, uma adição. Em termos assintóticos, a complexidade de tempo da solução é Θ(n·W).</w:t>
+        <w:t>A versão matricial da Programação Dinâmica para o problema da Mochila 0/1 preenche uma tabela de dimensões (n+1) × (W+1). Para cada uma das n·W células efetivamente computadas, realiza-se uma quantidade constante de operações :  uma comparação e, no máximo, uma adição. Em termos assintóticos, a complexidade de tempo da solução é Θ(n·W).</w:t>
       </w:r>
     </w:p>
     <w:p>
@@ -4344,7 +4344,7 @@
           <w:b w:val="0"/>
           <w:i w:val="0"/>
         </w:rPr>
-        <w:t>O presente trabalho percorreu o ciclo completo que vai da teoria à prática na aplicação da Programação Dinâmica ao problema da Mochila 0/1. Do ponto de vista teórico, consolidou-se a compreensão dos princípios que fundamentam a técnica — a subestrutura ótima e a sobreposição de subproblemas —, bem como a distinção entre as abordagens top-down (memoização) e bottom-up (tabelamento), com suas respectivas vantagens e limitações.</w:t>
+        <w:t>O presente trabalho percorreu o ciclo completo que vai da teoria à prática na aplicação da Programação Dinâmica ao problema da Mochila 0/1. Do ponto de vista teórico, consolidou-se a compreensão dos princípios que fundamentam a técnica :  a subestrutura ótima e a sobreposição de subproblemas : , bem como a distinção entre as abordagens top-down (memoização) e bottom-up (tabelamento), com suas respectivas vantagens e limitações.</w:t>
       </w:r>
     </w:p>
     <w:p>
@@ -4355,7 +4355,7 @@
           <w:b w:val="0"/>
           <w:i w:val="0"/>
         </w:rPr>
-        <w:t>Do ponto de vista prático, a implementação das duas versões — matricial e otimizada — evidenciou que as considerações de eficiência espacial não são meramente acadêmicas. A versão otimizada com vetor unidimensional provou ser consistentemente mais rápida que a versão matricial (aproximadamente 3,3× no teste com 100 itens), com resultados idênticos.</w:t>
+        <w:t>Do ponto de vista prático, a implementação das duas versões :  matricial e otimizada :  evidenciou que as considerações de eficiência espacial não são meramente acadêmicas. A versão otimizada com vetor unidimensional provou ser consistentemente mais rápida que a versão matricial (aproximadamente 3,3× no teste com 100 itens), com resultados idênticos.</w:t>
       </w:r>
     </w:p>
     <w:p>

</xml_diff>

<commit_message>
docs: PDF refinado — sem tracos, formatacao profissional, paginas numeradas
</commit_message>
<xml_diff>
--- a/RELATORIO_FINAL.docx
+++ b/RELATORIO_FINAL.docx
@@ -108,15 +108,17 @@
       </w:r>
     </w:p>
     <w:p>
-      <w:r>
-        <w:br w:type="page"/>
-      </w:r>
+      <w:r/>
     </w:p>
     <w:p>
       <w:pPr>
         <w:pStyle w:val="Heading1"/>
       </w:pPr>
       <w:r>
+        <w:rPr>
+          <w:rFonts w:ascii="Calibri" w:hAnsi="Calibri"/>
+          <w:color w:val="1A1A2E"/>
+        </w:rPr>
         <w:t>1. Introdução</w:t>
       </w:r>
     </w:p>
@@ -158,6 +160,10 @@
         <w:pStyle w:val="Heading1"/>
       </w:pPr>
       <w:r>
+        <w:rPr>
+          <w:rFonts w:ascii="Calibri" w:hAnsi="Calibri"/>
+          <w:color w:val="1A1A2E"/>
+        </w:rPr>
         <w:t>2. Fundamentação Teórica</w:t>
       </w:r>
     </w:p>
@@ -166,6 +172,10 @@
         <w:pStyle w:val="Heading2"/>
       </w:pPr>
       <w:r>
+        <w:rPr>
+          <w:rFonts w:ascii="Calibri" w:hAnsi="Calibri"/>
+          <w:color w:val="1A1A2E"/>
+        </w:rPr>
         <w:t>2.1. Programação Dinâmica: Conceitos Gerais</w:t>
       </w:r>
     </w:p>
@@ -223,7 +233,7 @@
         <w:rPr>
           <w:rFonts w:ascii="Times New Roman" w:hAnsi="Times New Roman"/>
         </w:rPr>
-        <w:t>. A sobreposição de subproblemas ocorre quando, ao decompor recursivamente o problema original, os mesmos subproblemas menores são gerados repetidamente :  fenômeno que não ocorre, por exemplo, na ordenação por merge sort, em que cada subproblema é distinto. Já a subestrutura ótima é a propriedade que garante que a solução ótima do problema original pode ser construída a partir das soluções ótimas de seus subproblemas, permitindo a composição de respostas sem a necessidade de reavaliar decisões anteriores.</w:t>
+        <w:t>. A sobreposição de subproblemas ocorre quando, ao decompor recursivamente o problema original, os mesmos subproblemas menores são gerados repetidamente: fenômeno que não ocorre, por exemplo, na ordenação por merge sort, em que cada subproblema é distinto. Já a subestrutura ótima é a propriedade que garante que a solução ótima do problema original pode ser construída a partir das soluções ótimas de seus subproblemas, permitindo a composição de respostas sem a necessidade de reavaliar decisões anteriores.</w:t>
       </w:r>
     </w:p>
     <w:p>
@@ -234,7 +244,7 @@
           <w:b w:val="0"/>
           <w:i w:val="0"/>
         </w:rPr>
-        <w:t>A diferença essencial entre Programação Dinâmica e a técnica de divisão-e-conquista reside justamente na natureza dos subproblemas. Na divisão-e-conquista, os subproblemas são independentes e disjuntos :  pense no quicksort ou na busca binária : , de modo que cada subproblema é resolvido recursivamente exatamente uma vez. Na Programação Dinâmica, os subproblemas se sobrepõem, e resolvê-los repetidamente sem memorização resultaria em explosão combinatória. A DP resolve essa ineficiência armazenando resultados em estruturas de dados (tipicamente tabelas ou matrizes) e consultando-os quando necessário, um trade-off deliberado de espaço por tempo. A técnica deve ser empregada sempre que o problema exibir as duas propriedades mencionadas e o espaço de estados for gerenciável em memória.</w:t>
+        <w:t>A diferença essencial entre Programação Dinâmica e a técnica de divisão-e-conquista reside justamente na natureza dos subproblemas. Na divisão-e-conquista, os subproblemas são independentes e disjuntos: pense no quicksort ou na busca binária:, de modo que cada subproblema é resolvido recursivamente exatamente uma vez. Na Programação Dinâmica, os subproblemas se sobrepõem, e resolvê-los repetidamente sem memorização resultaria em explosão combinatória. A DP resolve essa ineficiência armazenando resultados em estruturas de dados (tipicamente tabelas ou matrizes) e consultando-os quando necessário, um trade-off deliberado de espaço por tempo. A técnica deve ser empregada sempre que o problema exibir as duas propriedades mencionadas e o espaço de estados for gerenciável em memória.</w:t>
       </w:r>
     </w:p>
     <w:p>
@@ -242,6 +252,10 @@
         <w:pStyle w:val="Heading2"/>
       </w:pPr>
       <w:r>
+        <w:rPr>
+          <w:rFonts w:ascii="Calibri" w:hAnsi="Calibri"/>
+          <w:color w:val="1A1A2E"/>
+        </w:rPr>
         <w:t>2.2. Memoização e Tabelamento</w:t>
       </w:r>
     </w:p>
@@ -253,7 +267,7 @@
           <w:b w:val="0"/>
           <w:i w:val="0"/>
         </w:rPr>
-        <w:t>A Programação Dinâmica admite duas estratégias clássicas de implementação, que diferem fundamentalmente na ordem em que os subproblemas são visitados. A primeira, conhecida como memoização (do inglês memoization), adota uma perspectiva top-down: parte-se do problema original e recorre-se aos subproblemas menores conforme necessário, armazenando os resultados em uma estrutura de cache :  tipicamente um dicionário ou vetor indexado :  de modo que cada subproblema seja resolvido no máximo uma vez. A principal vantagem da memoização é sua elegância conceitual: a implementação segue naturalmente a definição recursiva do problema, preservando a clareza do raciocínio matemático original. Além disso, a memoização resolve apenas os subproblemas estritamente necessários para a solução do problema original :  se determinados estados nunca são visitados, seus valores jamais são computados. A desvantagem reside no overhead das chamadas recursivas, que consomem espaço na pilha de execução e podem causar estouro de pilha para problemas com profundidade de recursão elevada.</w:t>
+        <w:t>A Programação Dinâmica admite duas estratégias clássicas de implementação, que diferem fundamentalmente na ordem em que os subproblemas são visitados. A primeira, conhecida como memoização (do inglês memoization), adota uma perspectiva top-down: parte-se do problema original e recorre-se aos subproblemas menores conforme necessário, armazenando os resultados em uma estrutura de cache: tipicamente um dicionário ou vetor indexado: de modo que cada subproblema seja resolvido no máximo uma vez. A principal vantagem da memoização é sua elegância conceitual: a implementação segue naturalmente a definição recursiva do problema, preservando a clareza do raciocínio matemático original. Além disso, a memoização resolve apenas os subproblemas estritamente necessários para a solução do problema original: se determinados estados nunca são visitados, seus valores jamais são computados. A desvantagem reside no overhead das chamadas recursivas, que consomem espaço na pilha de execução e podem causar estouro de pilha para problemas com profundidade de recursão elevada.</w:t>
       </w:r>
     </w:p>
     <w:p>
@@ -275,7 +289,7 @@
           <w:b w:val="0"/>
           <w:i w:val="0"/>
         </w:rPr>
-        <w:t>A análise de complexidade em Programação Dinâmica é parametrizada pelo número de estados distintos do problema e pelo custo de transição entre estados. Se um problema possui S estados distintos e cada transição pode ser computada em tempo T, a complexidade temporal será O(S · T). No caso do tabelamento, essa análise é direta: preenchemos S entradas da tabela, cada uma exigindo T operações. A complexidade espacial é O(S), podendo ser reduzida quando as transições dependem apenas de um subconjunto limitado de estados anteriores. É importante notar que, para problemas cujo número de estados depende de parâmetros numéricos do domínio (como a capacidade W no problema da mochila), a complexidade resultante é pseudo-polinomial :  polinomial no valor numérico da entrada, mas não no número de bits necessários para representá-la : , o que distingue esses problemas dos genuinamente polinomiais.</w:t>
+        <w:t>A análise de complexidade em Programação Dinâmica é parametrizada pelo número de estados distintos do problema e pelo custo de transição entre estados. Se um problema possui S estados distintos e cada transição pode ser computada em tempo T, a complexidade temporal será O(S · T). No caso do tabelamento, essa análise é direta: preenchemos S entradas da tabela, cada uma exigindo T operações. A complexidade espacial é O(S), podendo ser reduzida quando as transições dependem apenas de um subconjunto limitado de estados anteriores. É importante notar que, para problemas cujo número de estados depende de parâmetros numéricos do domínio (como a capacidade W no problema da mochila), a complexidade resultante é pseudo-polinomial: polinomial no valor numérico da entrada, mas não no número de bits necessários para representá-la:, o que distingue esses problemas dos genuinamente polinomiais.</w:t>
       </w:r>
     </w:p>
     <w:p>
@@ -283,6 +297,10 @@
         <w:pStyle w:val="Heading2"/>
       </w:pPr>
       <w:r>
+        <w:rPr>
+          <w:rFonts w:ascii="Calibri" w:hAnsi="Calibri"/>
+          <w:color w:val="1A1A2E"/>
+        </w:rPr>
         <w:t>2.3. O Problema da Mochila 0/1</w:t>
       </w:r>
     </w:p>
@@ -294,7 +312,7 @@
           <w:b w:val="0"/>
           <w:i w:val="0"/>
         </w:rPr>
-        <w:t>O problema da Mochila 0/1 é um dos mais estudados na literatura de otimização combinatória e pertence à classe dos problemas NP-difíceis. Sua formulação clássica é notavelmente simples: dados n itens, cada qual com um peso w_i e um valor v_i, e uma mochila com capacidade máxima W, deseja-se selecionar um subconjunto de itens cujo peso total não exceda W e cujo valor total seja o maior possível. O qualificador "0/1" indica que cada item pode ser incluído no máximo uma vez :  ou seja, trata-se de uma decisão binária: levar ou não levar o item. Formalmente, o problema pode ser expresso como:</w:t>
+        <w:t>O problema da Mochila 0/1 é um dos mais estudados na literatura de otimização combinatória e pertence à classe dos problemas NP-difíceis. Sua formulação clássica é notavelmente simples: dados n itens, cada qual com um peso w_i e um valor v_i, e uma mochila com capacidade máxima W, deseja-se selecionar um subconjunto de itens cujo peso total não exceda W e cujo valor total seja o maior possível. O qualificador "0/1" indica que cada item pode ser incluído no máximo uma vez: ou seja, trata-se de uma decisão binária: levar ou não levar o item. Formalmente, o problema pode ser expresso como:</w:t>
       </w:r>
     </w:p>
     <w:p>
@@ -340,12 +358,12 @@
           <w:b/>
           <w:i/>
         </w:rPr>
-        <w:t>Tabela 1: Dados do exemplo didático :  fretes disponíveis</w:t>
+        <w:t>Tabela 1: Dados do exemplo didático: fretes disponíveis</w:t>
       </w:r>
     </w:p>
     <w:tbl>
       <w:tblPr>
-        <w:tblStyle w:val="TableGrid"/>
+        <w:tblStyle w:val="LightGrid-Accent1"/>
         <w:tblW w:type="auto" w:w="0"/>
         <w:jc w:val="center"/>
         <w:tblLook w:firstColumn="1" w:firstRow="1" w:lastColumn="0" w:lastRow="0" w:noHBand="0" w:noVBand="1" w:val="04A0"/>
@@ -365,10 +383,15 @@
             <w:pPr>
               <w:jc w:val="center"/>
             </w:pPr>
-            <w:r/>
-            <w:r>
-              <w:rPr>
-                <w:rFonts w:ascii="Times New Roman" w:hAnsi="Times New Roman"/>
+            <w:r>
+              <w:rPr>
+                <w:rFonts w:ascii="Calibri" w:hAnsi="Calibri"/>
+                <w:sz w:val="20"/>
+              </w:rPr>
+            </w:r>
+            <w:r>
+              <w:rPr>
+                <w:rFonts w:ascii="Calibri" w:hAnsi="Calibri"/>
                 <w:b/>
                 <w:sz w:val="20"/>
               </w:rPr>
@@ -385,10 +408,15 @@
             <w:pPr>
               <w:jc w:val="center"/>
             </w:pPr>
-            <w:r/>
-            <w:r>
-              <w:rPr>
-                <w:rFonts w:ascii="Times New Roman" w:hAnsi="Times New Roman"/>
+            <w:r>
+              <w:rPr>
+                <w:rFonts w:ascii="Calibri" w:hAnsi="Calibri"/>
+                <w:sz w:val="20"/>
+              </w:rPr>
+            </w:r>
+            <w:r>
+              <w:rPr>
+                <w:rFonts w:ascii="Calibri" w:hAnsi="Calibri"/>
                 <w:b/>
                 <w:sz w:val="20"/>
               </w:rPr>
@@ -405,10 +433,15 @@
             <w:pPr>
               <w:jc w:val="center"/>
             </w:pPr>
-            <w:r/>
-            <w:r>
-              <w:rPr>
-                <w:rFonts w:ascii="Times New Roman" w:hAnsi="Times New Roman"/>
+            <w:r>
+              <w:rPr>
+                <w:rFonts w:ascii="Calibri" w:hAnsi="Calibri"/>
+                <w:sz w:val="20"/>
+              </w:rPr>
+            </w:r>
+            <w:r>
+              <w:rPr>
+                <w:rFonts w:ascii="Calibri" w:hAnsi="Calibri"/>
                 <w:b/>
                 <w:sz w:val="20"/>
               </w:rPr>
@@ -426,10 +459,15 @@
             <w:pPr>
               <w:jc w:val="center"/>
             </w:pPr>
-            <w:r/>
-            <w:r>
-              <w:rPr>
-                <w:rFonts w:ascii="Times New Roman" w:hAnsi="Times New Roman"/>
+            <w:r>
+              <w:rPr>
+                <w:rFonts w:ascii="Calibri" w:hAnsi="Calibri"/>
+                <w:sz w:val="20"/>
+              </w:rPr>
+            </w:r>
+            <w:r>
+              <w:rPr>
+                <w:rFonts w:ascii="Calibri" w:hAnsi="Calibri"/>
                 <w:sz w:val="20"/>
               </w:rPr>
               <w:t>1</w:t>
@@ -444,10 +482,15 @@
             <w:pPr>
               <w:jc w:val="center"/>
             </w:pPr>
-            <w:r/>
-            <w:r>
-              <w:rPr>
-                <w:rFonts w:ascii="Times New Roman" w:hAnsi="Times New Roman"/>
+            <w:r>
+              <w:rPr>
+                <w:rFonts w:ascii="Calibri" w:hAnsi="Calibri"/>
+                <w:sz w:val="20"/>
+              </w:rPr>
+            </w:r>
+            <w:r>
+              <w:rPr>
+                <w:rFonts w:ascii="Calibri" w:hAnsi="Calibri"/>
                 <w:sz w:val="20"/>
               </w:rPr>
               <w:t>2</w:t>
@@ -462,10 +505,15 @@
             <w:pPr>
               <w:jc w:val="center"/>
             </w:pPr>
-            <w:r/>
-            <w:r>
-              <w:rPr>
-                <w:rFonts w:ascii="Times New Roman" w:hAnsi="Times New Roman"/>
+            <w:r>
+              <w:rPr>
+                <w:rFonts w:ascii="Calibri" w:hAnsi="Calibri"/>
+                <w:sz w:val="20"/>
+              </w:rPr>
+            </w:r>
+            <w:r>
+              <w:rPr>
+                <w:rFonts w:ascii="Calibri" w:hAnsi="Calibri"/>
                 <w:sz w:val="20"/>
               </w:rPr>
               <w:t>3.000</w:t>
@@ -482,10 +530,15 @@
             <w:pPr>
               <w:jc w:val="center"/>
             </w:pPr>
-            <w:r/>
-            <w:r>
-              <w:rPr>
-                <w:rFonts w:ascii="Times New Roman" w:hAnsi="Times New Roman"/>
+            <w:r>
+              <w:rPr>
+                <w:rFonts w:ascii="Calibri" w:hAnsi="Calibri"/>
+                <w:sz w:val="20"/>
+              </w:rPr>
+            </w:r>
+            <w:r>
+              <w:rPr>
+                <w:rFonts w:ascii="Calibri" w:hAnsi="Calibri"/>
                 <w:sz w:val="20"/>
               </w:rPr>
               <w:t>2</w:t>
@@ -500,10 +553,15 @@
             <w:pPr>
               <w:jc w:val="center"/>
             </w:pPr>
-            <w:r/>
-            <w:r>
-              <w:rPr>
-                <w:rFonts w:ascii="Times New Roman" w:hAnsi="Times New Roman"/>
+            <w:r>
+              <w:rPr>
+                <w:rFonts w:ascii="Calibri" w:hAnsi="Calibri"/>
+                <w:sz w:val="20"/>
+              </w:rPr>
+            </w:r>
+            <w:r>
+              <w:rPr>
+                <w:rFonts w:ascii="Calibri" w:hAnsi="Calibri"/>
                 <w:sz w:val="20"/>
               </w:rPr>
               <w:t>3</w:t>
@@ -518,10 +576,15 @@
             <w:pPr>
               <w:jc w:val="center"/>
             </w:pPr>
-            <w:r/>
-            <w:r>
-              <w:rPr>
-                <w:rFonts w:ascii="Times New Roman" w:hAnsi="Times New Roman"/>
+            <w:r>
+              <w:rPr>
+                <w:rFonts w:ascii="Calibri" w:hAnsi="Calibri"/>
+                <w:sz w:val="20"/>
+              </w:rPr>
+            </w:r>
+            <w:r>
+              <w:rPr>
+                <w:rFonts w:ascii="Calibri" w:hAnsi="Calibri"/>
                 <w:sz w:val="20"/>
               </w:rPr>
               <w:t>4.000</w:t>
@@ -538,10 +601,15 @@
             <w:pPr>
               <w:jc w:val="center"/>
             </w:pPr>
-            <w:r/>
-            <w:r>
-              <w:rPr>
-                <w:rFonts w:ascii="Times New Roman" w:hAnsi="Times New Roman"/>
+            <w:r>
+              <w:rPr>
+                <w:rFonts w:ascii="Calibri" w:hAnsi="Calibri"/>
+                <w:sz w:val="20"/>
+              </w:rPr>
+            </w:r>
+            <w:r>
+              <w:rPr>
+                <w:rFonts w:ascii="Calibri" w:hAnsi="Calibri"/>
                 <w:sz w:val="20"/>
               </w:rPr>
               <w:t>3</w:t>
@@ -556,10 +624,15 @@
             <w:pPr>
               <w:jc w:val="center"/>
             </w:pPr>
-            <w:r/>
-            <w:r>
-              <w:rPr>
-                <w:rFonts w:ascii="Times New Roman" w:hAnsi="Times New Roman"/>
+            <w:r>
+              <w:rPr>
+                <w:rFonts w:ascii="Calibri" w:hAnsi="Calibri"/>
+                <w:sz w:val="20"/>
+              </w:rPr>
+            </w:r>
+            <w:r>
+              <w:rPr>
+                <w:rFonts w:ascii="Calibri" w:hAnsi="Calibri"/>
                 <w:sz w:val="20"/>
               </w:rPr>
               <w:t>4</w:t>
@@ -574,10 +647,15 @@
             <w:pPr>
               <w:jc w:val="center"/>
             </w:pPr>
-            <w:r/>
-            <w:r>
-              <w:rPr>
-                <w:rFonts w:ascii="Times New Roman" w:hAnsi="Times New Roman"/>
+            <w:r>
+              <w:rPr>
+                <w:rFonts w:ascii="Calibri" w:hAnsi="Calibri"/>
+                <w:sz w:val="20"/>
+              </w:rPr>
+            </w:r>
+            <w:r>
+              <w:rPr>
+                <w:rFonts w:ascii="Calibri" w:hAnsi="Calibri"/>
                 <w:sz w:val="20"/>
               </w:rPr>
               <w:t>5.000</w:t>
@@ -594,10 +672,15 @@
             <w:pPr>
               <w:jc w:val="center"/>
             </w:pPr>
-            <w:r/>
-            <w:r>
-              <w:rPr>
-                <w:rFonts w:ascii="Times New Roman" w:hAnsi="Times New Roman"/>
+            <w:r>
+              <w:rPr>
+                <w:rFonts w:ascii="Calibri" w:hAnsi="Calibri"/>
+                <w:sz w:val="20"/>
+              </w:rPr>
+            </w:r>
+            <w:r>
+              <w:rPr>
+                <w:rFonts w:ascii="Calibri" w:hAnsi="Calibri"/>
                 <w:sz w:val="20"/>
               </w:rPr>
               <w:t>4</w:t>
@@ -612,10 +695,15 @@
             <w:pPr>
               <w:jc w:val="center"/>
             </w:pPr>
-            <w:r/>
-            <w:r>
-              <w:rPr>
-                <w:rFonts w:ascii="Times New Roman" w:hAnsi="Times New Roman"/>
+            <w:r>
+              <w:rPr>
+                <w:rFonts w:ascii="Calibri" w:hAnsi="Calibri"/>
+                <w:sz w:val="20"/>
+              </w:rPr>
+            </w:r>
+            <w:r>
+              <w:rPr>
+                <w:rFonts w:ascii="Calibri" w:hAnsi="Calibri"/>
                 <w:sz w:val="20"/>
               </w:rPr>
               <w:t>5</w:t>
@@ -630,10 +718,15 @@
             <w:pPr>
               <w:jc w:val="center"/>
             </w:pPr>
-            <w:r/>
-            <w:r>
-              <w:rPr>
-                <w:rFonts w:ascii="Times New Roman" w:hAnsi="Times New Roman"/>
+            <w:r>
+              <w:rPr>
+                <w:rFonts w:ascii="Calibri" w:hAnsi="Calibri"/>
+                <w:sz w:val="20"/>
+              </w:rPr>
+            </w:r>
+            <w:r>
+              <w:rPr>
+                <w:rFonts w:ascii="Calibri" w:hAnsi="Calibri"/>
                 <w:sz w:val="20"/>
               </w:rPr>
               <w:t>6.000</w:t>
@@ -659,6 +752,10 @@
         <w:pStyle w:val="Heading1"/>
       </w:pPr>
       <w:r>
+        <w:rPr>
+          <w:rFonts w:ascii="Calibri" w:hAnsi="Calibri"/>
+          <w:color w:val="1A1A2E"/>
+        </w:rPr>
         <w:t>3. Desenvolvimento Prático</w:t>
       </w:r>
     </w:p>
@@ -667,6 +764,10 @@
         <w:pStyle w:val="Heading2"/>
       </w:pPr>
       <w:r>
+        <w:rPr>
+          <w:rFonts w:ascii="Calibri" w:hAnsi="Calibri"/>
+          <w:color w:val="1A1A2E"/>
+        </w:rPr>
         <w:t>3.1. Estrutura da Solução via DP</w:t>
       </w:r>
     </w:p>
@@ -689,7 +790,7 @@
           <w:b w:val="0"/>
           <w:i w:val="0"/>
         </w:rPr>
-        <w:t>A sobreposição de subproblemas torna-se evidente quando se observa que, durante a exploração do espaço de soluções, o mesmo par (i, w) :  ou seja, a mesma combinação de "quantos itens considerar" e "quanta capacidade resta" :  é visitado repetidamente por diferentes caminhos de decisão. Para n itens e capacidade W, existem exatamente (n+1) · (W+1) estados distintos no espaço de busca.</w:t>
+        <w:t>A sobreposição de subproblemas torna-se evidente quando se observa que, durante a exploração do espaço de soluções, o mesmo par (i, w): ou seja, a mesma combinação de "quantos itens considerar" e "quanta capacidade resta": é visitado repetidamente por diferentes caminhos de decisão. Para n itens e capacidade W, existem exatamente (n+1) · (W+1) estados distintos no espaço de busca.</w:t>
       </w:r>
     </w:p>
     <w:p>
@@ -697,6 +798,10 @@
         <w:pStyle w:val="Heading2"/>
       </w:pPr>
       <w:r>
+        <w:rPr>
+          <w:rFonts w:ascii="Calibri" w:hAnsi="Calibri"/>
+          <w:color w:val="1A1A2E"/>
+        </w:rPr>
         <w:t>3.2. Definição da Recorrência</w:t>
       </w:r>
     </w:p>
@@ -740,6 +845,10 @@
         <w:pStyle w:val="Heading2"/>
       </w:pPr>
       <w:r>
+        <w:rPr>
+          <w:rFonts w:ascii="Calibri" w:hAnsi="Calibri"/>
+          <w:color w:val="1A1A2E"/>
+        </w:rPr>
         <w:t>3.3. Construção da Tabela e Reconstrução da Solução</w:t>
       </w:r>
     </w:p>
@@ -758,7 +867,7 @@
     </w:p>
     <w:tbl>
       <w:tblPr>
-        <w:tblStyle w:val="TableGrid"/>
+        <w:tblStyle w:val="LightGrid-Accent1"/>
         <w:tblW w:type="auto" w:w="0"/>
         <w:jc w:val="center"/>
         <w:tblLook w:firstColumn="1" w:firstRow="1" w:lastColumn="0" w:lastRow="0" w:noHBand="0" w:noVBand="1" w:val="04A0"/>
@@ -785,10 +894,15 @@
             <w:pPr>
               <w:jc w:val="center"/>
             </w:pPr>
-            <w:r/>
-            <w:r>
-              <w:rPr>
-                <w:rFonts w:ascii="Times New Roman" w:hAnsi="Times New Roman"/>
+            <w:r>
+              <w:rPr>
+                <w:rFonts w:ascii="Calibri" w:hAnsi="Calibri"/>
+                <w:sz w:val="20"/>
+              </w:rPr>
+            </w:r>
+            <w:r>
+              <w:rPr>
+                <w:rFonts w:ascii="Calibri" w:hAnsi="Calibri"/>
                 <w:b/>
                 <w:sz w:val="20"/>
               </w:rPr>
@@ -805,10 +919,15 @@
             <w:pPr>
               <w:jc w:val="center"/>
             </w:pPr>
-            <w:r/>
-            <w:r>
-              <w:rPr>
-                <w:rFonts w:ascii="Times New Roman" w:hAnsi="Times New Roman"/>
+            <w:r>
+              <w:rPr>
+                <w:rFonts w:ascii="Calibri" w:hAnsi="Calibri"/>
+                <w:sz w:val="20"/>
+              </w:rPr>
+            </w:r>
+            <w:r>
+              <w:rPr>
+                <w:rFonts w:ascii="Calibri" w:hAnsi="Calibri"/>
                 <w:b/>
                 <w:sz w:val="20"/>
               </w:rPr>
@@ -825,10 +944,15 @@
             <w:pPr>
               <w:jc w:val="center"/>
             </w:pPr>
-            <w:r/>
-            <w:r>
-              <w:rPr>
-                <w:rFonts w:ascii="Times New Roman" w:hAnsi="Times New Roman"/>
+            <w:r>
+              <w:rPr>
+                <w:rFonts w:ascii="Calibri" w:hAnsi="Calibri"/>
+                <w:sz w:val="20"/>
+              </w:rPr>
+            </w:r>
+            <w:r>
+              <w:rPr>
+                <w:rFonts w:ascii="Calibri" w:hAnsi="Calibri"/>
                 <w:b/>
                 <w:sz w:val="20"/>
               </w:rPr>
@@ -845,10 +969,15 @@
             <w:pPr>
               <w:jc w:val="center"/>
             </w:pPr>
-            <w:r/>
-            <w:r>
-              <w:rPr>
-                <w:rFonts w:ascii="Times New Roman" w:hAnsi="Times New Roman"/>
+            <w:r>
+              <w:rPr>
+                <w:rFonts w:ascii="Calibri" w:hAnsi="Calibri"/>
+                <w:sz w:val="20"/>
+              </w:rPr>
+            </w:r>
+            <w:r>
+              <w:rPr>
+                <w:rFonts w:ascii="Calibri" w:hAnsi="Calibri"/>
                 <w:b/>
                 <w:sz w:val="20"/>
               </w:rPr>
@@ -865,10 +994,15 @@
             <w:pPr>
               <w:jc w:val="center"/>
             </w:pPr>
-            <w:r/>
-            <w:r>
-              <w:rPr>
-                <w:rFonts w:ascii="Times New Roman" w:hAnsi="Times New Roman"/>
+            <w:r>
+              <w:rPr>
+                <w:rFonts w:ascii="Calibri" w:hAnsi="Calibri"/>
+                <w:sz w:val="20"/>
+              </w:rPr>
+            </w:r>
+            <w:r>
+              <w:rPr>
+                <w:rFonts w:ascii="Calibri" w:hAnsi="Calibri"/>
                 <w:b/>
                 <w:sz w:val="20"/>
               </w:rPr>
@@ -885,10 +1019,15 @@
             <w:pPr>
               <w:jc w:val="center"/>
             </w:pPr>
-            <w:r/>
-            <w:r>
-              <w:rPr>
-                <w:rFonts w:ascii="Times New Roman" w:hAnsi="Times New Roman"/>
+            <w:r>
+              <w:rPr>
+                <w:rFonts w:ascii="Calibri" w:hAnsi="Calibri"/>
+                <w:sz w:val="20"/>
+              </w:rPr>
+            </w:r>
+            <w:r>
+              <w:rPr>
+                <w:rFonts w:ascii="Calibri" w:hAnsi="Calibri"/>
                 <w:b/>
                 <w:sz w:val="20"/>
               </w:rPr>
@@ -905,10 +1044,15 @@
             <w:pPr>
               <w:jc w:val="center"/>
             </w:pPr>
-            <w:r/>
-            <w:r>
-              <w:rPr>
-                <w:rFonts w:ascii="Times New Roman" w:hAnsi="Times New Roman"/>
+            <w:r>
+              <w:rPr>
+                <w:rFonts w:ascii="Calibri" w:hAnsi="Calibri"/>
+                <w:sz w:val="20"/>
+              </w:rPr>
+            </w:r>
+            <w:r>
+              <w:rPr>
+                <w:rFonts w:ascii="Calibri" w:hAnsi="Calibri"/>
                 <w:b/>
                 <w:sz w:val="20"/>
               </w:rPr>
@@ -925,10 +1069,15 @@
             <w:pPr>
               <w:jc w:val="center"/>
             </w:pPr>
-            <w:r/>
-            <w:r>
-              <w:rPr>
-                <w:rFonts w:ascii="Times New Roman" w:hAnsi="Times New Roman"/>
+            <w:r>
+              <w:rPr>
+                <w:rFonts w:ascii="Calibri" w:hAnsi="Calibri"/>
+                <w:sz w:val="20"/>
+              </w:rPr>
+            </w:r>
+            <w:r>
+              <w:rPr>
+                <w:rFonts w:ascii="Calibri" w:hAnsi="Calibri"/>
                 <w:b/>
                 <w:sz w:val="20"/>
               </w:rPr>
@@ -945,10 +1094,15 @@
             <w:pPr>
               <w:jc w:val="center"/>
             </w:pPr>
-            <w:r/>
-            <w:r>
-              <w:rPr>
-                <w:rFonts w:ascii="Times New Roman" w:hAnsi="Times New Roman"/>
+            <w:r>
+              <w:rPr>
+                <w:rFonts w:ascii="Calibri" w:hAnsi="Calibri"/>
+                <w:sz w:val="20"/>
+              </w:rPr>
+            </w:r>
+            <w:r>
+              <w:rPr>
+                <w:rFonts w:ascii="Calibri" w:hAnsi="Calibri"/>
                 <w:b/>
                 <w:sz w:val="20"/>
               </w:rPr>
@@ -965,10 +1119,15 @@
             <w:pPr>
               <w:jc w:val="center"/>
             </w:pPr>
-            <w:r/>
-            <w:r>
-              <w:rPr>
-                <w:rFonts w:ascii="Times New Roman" w:hAnsi="Times New Roman"/>
+            <w:r>
+              <w:rPr>
+                <w:rFonts w:ascii="Calibri" w:hAnsi="Calibri"/>
+                <w:sz w:val="20"/>
+              </w:rPr>
+            </w:r>
+            <w:r>
+              <w:rPr>
+                <w:rFonts w:ascii="Calibri" w:hAnsi="Calibri"/>
                 <w:b/>
                 <w:sz w:val="20"/>
               </w:rPr>
@@ -986,10 +1145,15 @@
             <w:pPr>
               <w:jc w:val="center"/>
             </w:pPr>
-            <w:r/>
-            <w:r>
-              <w:rPr>
-                <w:rFonts w:ascii="Times New Roman" w:hAnsi="Times New Roman"/>
+            <w:r>
+              <w:rPr>
+                <w:rFonts w:ascii="Calibri" w:hAnsi="Calibri"/>
+                <w:sz w:val="20"/>
+              </w:rPr>
+            </w:r>
+            <w:r>
+              <w:rPr>
+                <w:rFonts w:ascii="Calibri" w:hAnsi="Calibri"/>
                 <w:sz w:val="20"/>
               </w:rPr>
               <w:t>0</w:t>
@@ -1004,10 +1168,15 @@
             <w:pPr>
               <w:jc w:val="center"/>
             </w:pPr>
-            <w:r/>
-            <w:r>
-              <w:rPr>
-                <w:rFonts w:ascii="Times New Roman" w:hAnsi="Times New Roman"/>
+            <w:r>
+              <w:rPr>
+                <w:rFonts w:ascii="Calibri" w:hAnsi="Calibri"/>
+                <w:sz w:val="20"/>
+              </w:rPr>
+            </w:r>
+            <w:r>
+              <w:rPr>
+                <w:rFonts w:ascii="Calibri" w:hAnsi="Calibri"/>
                 <w:sz w:val="20"/>
               </w:rPr>
               <w:t>0</w:t>
@@ -1022,10 +1191,15 @@
             <w:pPr>
               <w:jc w:val="center"/>
             </w:pPr>
-            <w:r/>
-            <w:r>
-              <w:rPr>
-                <w:rFonts w:ascii="Times New Roman" w:hAnsi="Times New Roman"/>
+            <w:r>
+              <w:rPr>
+                <w:rFonts w:ascii="Calibri" w:hAnsi="Calibri"/>
+                <w:sz w:val="20"/>
+              </w:rPr>
+            </w:r>
+            <w:r>
+              <w:rPr>
+                <w:rFonts w:ascii="Calibri" w:hAnsi="Calibri"/>
                 <w:sz w:val="20"/>
               </w:rPr>
               <w:t>0</w:t>
@@ -1040,10 +1214,15 @@
             <w:pPr>
               <w:jc w:val="center"/>
             </w:pPr>
-            <w:r/>
-            <w:r>
-              <w:rPr>
-                <w:rFonts w:ascii="Times New Roman" w:hAnsi="Times New Roman"/>
+            <w:r>
+              <w:rPr>
+                <w:rFonts w:ascii="Calibri" w:hAnsi="Calibri"/>
+                <w:sz w:val="20"/>
+              </w:rPr>
+            </w:r>
+            <w:r>
+              <w:rPr>
+                <w:rFonts w:ascii="Calibri" w:hAnsi="Calibri"/>
                 <w:sz w:val="20"/>
               </w:rPr>
               <w:t>0</w:t>
@@ -1058,10 +1237,15 @@
             <w:pPr>
               <w:jc w:val="center"/>
             </w:pPr>
-            <w:r/>
-            <w:r>
-              <w:rPr>
-                <w:rFonts w:ascii="Times New Roman" w:hAnsi="Times New Roman"/>
+            <w:r>
+              <w:rPr>
+                <w:rFonts w:ascii="Calibri" w:hAnsi="Calibri"/>
+                <w:sz w:val="20"/>
+              </w:rPr>
+            </w:r>
+            <w:r>
+              <w:rPr>
+                <w:rFonts w:ascii="Calibri" w:hAnsi="Calibri"/>
                 <w:sz w:val="20"/>
               </w:rPr>
               <w:t>0</w:t>
@@ -1076,10 +1260,15 @@
             <w:pPr>
               <w:jc w:val="center"/>
             </w:pPr>
-            <w:r/>
-            <w:r>
-              <w:rPr>
-                <w:rFonts w:ascii="Times New Roman" w:hAnsi="Times New Roman"/>
+            <w:r>
+              <w:rPr>
+                <w:rFonts w:ascii="Calibri" w:hAnsi="Calibri"/>
+                <w:sz w:val="20"/>
+              </w:rPr>
+            </w:r>
+            <w:r>
+              <w:rPr>
+                <w:rFonts w:ascii="Calibri" w:hAnsi="Calibri"/>
                 <w:sz w:val="20"/>
               </w:rPr>
               <w:t>0</w:t>
@@ -1094,10 +1283,15 @@
             <w:pPr>
               <w:jc w:val="center"/>
             </w:pPr>
-            <w:r/>
-            <w:r>
-              <w:rPr>
-                <w:rFonts w:ascii="Times New Roman" w:hAnsi="Times New Roman"/>
+            <w:r>
+              <w:rPr>
+                <w:rFonts w:ascii="Calibri" w:hAnsi="Calibri"/>
+                <w:sz w:val="20"/>
+              </w:rPr>
+            </w:r>
+            <w:r>
+              <w:rPr>
+                <w:rFonts w:ascii="Calibri" w:hAnsi="Calibri"/>
                 <w:sz w:val="20"/>
               </w:rPr>
               <w:t>0</w:t>
@@ -1112,10 +1306,15 @@
             <w:pPr>
               <w:jc w:val="center"/>
             </w:pPr>
-            <w:r/>
-            <w:r>
-              <w:rPr>
-                <w:rFonts w:ascii="Times New Roman" w:hAnsi="Times New Roman"/>
+            <w:r>
+              <w:rPr>
+                <w:rFonts w:ascii="Calibri" w:hAnsi="Calibri"/>
+                <w:sz w:val="20"/>
+              </w:rPr>
+            </w:r>
+            <w:r>
+              <w:rPr>
+                <w:rFonts w:ascii="Calibri" w:hAnsi="Calibri"/>
                 <w:sz w:val="20"/>
               </w:rPr>
               <w:t>0</w:t>
@@ -1130,10 +1329,15 @@
             <w:pPr>
               <w:jc w:val="center"/>
             </w:pPr>
-            <w:r/>
-            <w:r>
-              <w:rPr>
-                <w:rFonts w:ascii="Times New Roman" w:hAnsi="Times New Roman"/>
+            <w:r>
+              <w:rPr>
+                <w:rFonts w:ascii="Calibri" w:hAnsi="Calibri"/>
+                <w:sz w:val="20"/>
+              </w:rPr>
+            </w:r>
+            <w:r>
+              <w:rPr>
+                <w:rFonts w:ascii="Calibri" w:hAnsi="Calibri"/>
                 <w:sz w:val="20"/>
               </w:rPr>
               <w:t>0</w:t>
@@ -1148,10 +1352,15 @@
             <w:pPr>
               <w:jc w:val="center"/>
             </w:pPr>
-            <w:r/>
-            <w:r>
-              <w:rPr>
-                <w:rFonts w:ascii="Times New Roman" w:hAnsi="Times New Roman"/>
+            <w:r>
+              <w:rPr>
+                <w:rFonts w:ascii="Calibri" w:hAnsi="Calibri"/>
+                <w:sz w:val="20"/>
+              </w:rPr>
+            </w:r>
+            <w:r>
+              <w:rPr>
+                <w:rFonts w:ascii="Calibri" w:hAnsi="Calibri"/>
                 <w:sz w:val="20"/>
               </w:rPr>
               <w:t>0</w:t>
@@ -1168,10 +1377,15 @@
             <w:pPr>
               <w:jc w:val="center"/>
             </w:pPr>
-            <w:r/>
-            <w:r>
-              <w:rPr>
-                <w:rFonts w:ascii="Times New Roman" w:hAnsi="Times New Roman"/>
+            <w:r>
+              <w:rPr>
+                <w:rFonts w:ascii="Calibri" w:hAnsi="Calibri"/>
+                <w:sz w:val="20"/>
+              </w:rPr>
+            </w:r>
+            <w:r>
+              <w:rPr>
+                <w:rFonts w:ascii="Calibri" w:hAnsi="Calibri"/>
                 <w:sz w:val="20"/>
               </w:rPr>
               <w:t>1 (item 1)</w:t>
@@ -1186,10 +1400,15 @@
             <w:pPr>
               <w:jc w:val="center"/>
             </w:pPr>
-            <w:r/>
-            <w:r>
-              <w:rPr>
-                <w:rFonts w:ascii="Times New Roman" w:hAnsi="Times New Roman"/>
+            <w:r>
+              <w:rPr>
+                <w:rFonts w:ascii="Calibri" w:hAnsi="Calibri"/>
+                <w:sz w:val="20"/>
+              </w:rPr>
+            </w:r>
+            <w:r>
+              <w:rPr>
+                <w:rFonts w:ascii="Calibri" w:hAnsi="Calibri"/>
                 <w:sz w:val="20"/>
               </w:rPr>
               <w:t>0</w:t>
@@ -1204,10 +1423,15 @@
             <w:pPr>
               <w:jc w:val="center"/>
             </w:pPr>
-            <w:r/>
-            <w:r>
-              <w:rPr>
-                <w:rFonts w:ascii="Times New Roman" w:hAnsi="Times New Roman"/>
+            <w:r>
+              <w:rPr>
+                <w:rFonts w:ascii="Calibri" w:hAnsi="Calibri"/>
+                <w:sz w:val="20"/>
+              </w:rPr>
+            </w:r>
+            <w:r>
+              <w:rPr>
+                <w:rFonts w:ascii="Calibri" w:hAnsi="Calibri"/>
                 <w:sz w:val="20"/>
               </w:rPr>
               <w:t>0</w:t>
@@ -1222,10 +1446,15 @@
             <w:pPr>
               <w:jc w:val="center"/>
             </w:pPr>
-            <w:r/>
-            <w:r>
-              <w:rPr>
-                <w:rFonts w:ascii="Times New Roman" w:hAnsi="Times New Roman"/>
+            <w:r>
+              <w:rPr>
+                <w:rFonts w:ascii="Calibri" w:hAnsi="Calibri"/>
+                <w:sz w:val="20"/>
+              </w:rPr>
+            </w:r>
+            <w:r>
+              <w:rPr>
+                <w:rFonts w:ascii="Calibri" w:hAnsi="Calibri"/>
                 <w:sz w:val="20"/>
               </w:rPr>
               <w:t>3</w:t>
@@ -1240,10 +1469,15 @@
             <w:pPr>
               <w:jc w:val="center"/>
             </w:pPr>
-            <w:r/>
-            <w:r>
-              <w:rPr>
-                <w:rFonts w:ascii="Times New Roman" w:hAnsi="Times New Roman"/>
+            <w:r>
+              <w:rPr>
+                <w:rFonts w:ascii="Calibri" w:hAnsi="Calibri"/>
+                <w:sz w:val="20"/>
+              </w:rPr>
+            </w:r>
+            <w:r>
+              <w:rPr>
+                <w:rFonts w:ascii="Calibri" w:hAnsi="Calibri"/>
                 <w:sz w:val="20"/>
               </w:rPr>
               <w:t>3</w:t>
@@ -1258,10 +1492,15 @@
             <w:pPr>
               <w:jc w:val="center"/>
             </w:pPr>
-            <w:r/>
-            <w:r>
-              <w:rPr>
-                <w:rFonts w:ascii="Times New Roman" w:hAnsi="Times New Roman"/>
+            <w:r>
+              <w:rPr>
+                <w:rFonts w:ascii="Calibri" w:hAnsi="Calibri"/>
+                <w:sz w:val="20"/>
+              </w:rPr>
+            </w:r>
+            <w:r>
+              <w:rPr>
+                <w:rFonts w:ascii="Calibri" w:hAnsi="Calibri"/>
                 <w:sz w:val="20"/>
               </w:rPr>
               <w:t>3</w:t>
@@ -1276,10 +1515,15 @@
             <w:pPr>
               <w:jc w:val="center"/>
             </w:pPr>
-            <w:r/>
-            <w:r>
-              <w:rPr>
-                <w:rFonts w:ascii="Times New Roman" w:hAnsi="Times New Roman"/>
+            <w:r>
+              <w:rPr>
+                <w:rFonts w:ascii="Calibri" w:hAnsi="Calibri"/>
+                <w:sz w:val="20"/>
+              </w:rPr>
+            </w:r>
+            <w:r>
+              <w:rPr>
+                <w:rFonts w:ascii="Calibri" w:hAnsi="Calibri"/>
                 <w:sz w:val="20"/>
               </w:rPr>
               <w:t>3</w:t>
@@ -1294,10 +1538,15 @@
             <w:pPr>
               <w:jc w:val="center"/>
             </w:pPr>
-            <w:r/>
-            <w:r>
-              <w:rPr>
-                <w:rFonts w:ascii="Times New Roman" w:hAnsi="Times New Roman"/>
+            <w:r>
+              <w:rPr>
+                <w:rFonts w:ascii="Calibri" w:hAnsi="Calibri"/>
+                <w:sz w:val="20"/>
+              </w:rPr>
+            </w:r>
+            <w:r>
+              <w:rPr>
+                <w:rFonts w:ascii="Calibri" w:hAnsi="Calibri"/>
                 <w:sz w:val="20"/>
               </w:rPr>
               <w:t>3</w:t>
@@ -1312,10 +1561,15 @@
             <w:pPr>
               <w:jc w:val="center"/>
             </w:pPr>
-            <w:r/>
-            <w:r>
-              <w:rPr>
-                <w:rFonts w:ascii="Times New Roman" w:hAnsi="Times New Roman"/>
+            <w:r>
+              <w:rPr>
+                <w:rFonts w:ascii="Calibri" w:hAnsi="Calibri"/>
+                <w:sz w:val="20"/>
+              </w:rPr>
+            </w:r>
+            <w:r>
+              <w:rPr>
+                <w:rFonts w:ascii="Calibri" w:hAnsi="Calibri"/>
                 <w:sz w:val="20"/>
               </w:rPr>
               <w:t>3</w:t>
@@ -1330,10 +1584,15 @@
             <w:pPr>
               <w:jc w:val="center"/>
             </w:pPr>
-            <w:r/>
-            <w:r>
-              <w:rPr>
-                <w:rFonts w:ascii="Times New Roman" w:hAnsi="Times New Roman"/>
+            <w:r>
+              <w:rPr>
+                <w:rFonts w:ascii="Calibri" w:hAnsi="Calibri"/>
+                <w:sz w:val="20"/>
+              </w:rPr>
+            </w:r>
+            <w:r>
+              <w:rPr>
+                <w:rFonts w:ascii="Calibri" w:hAnsi="Calibri"/>
                 <w:sz w:val="20"/>
               </w:rPr>
               <w:t>3</w:t>
@@ -1350,10 +1609,15 @@
             <w:pPr>
               <w:jc w:val="center"/>
             </w:pPr>
-            <w:r/>
-            <w:r>
-              <w:rPr>
-                <w:rFonts w:ascii="Times New Roman" w:hAnsi="Times New Roman"/>
+            <w:r>
+              <w:rPr>
+                <w:rFonts w:ascii="Calibri" w:hAnsi="Calibri"/>
+                <w:sz w:val="20"/>
+              </w:rPr>
+            </w:r>
+            <w:r>
+              <w:rPr>
+                <w:rFonts w:ascii="Calibri" w:hAnsi="Calibri"/>
                 <w:sz w:val="20"/>
               </w:rPr>
               <w:t>2 (item 2)</w:t>
@@ -1368,10 +1632,15 @@
             <w:pPr>
               <w:jc w:val="center"/>
             </w:pPr>
-            <w:r/>
-            <w:r>
-              <w:rPr>
-                <w:rFonts w:ascii="Times New Roman" w:hAnsi="Times New Roman"/>
+            <w:r>
+              <w:rPr>
+                <w:rFonts w:ascii="Calibri" w:hAnsi="Calibri"/>
+                <w:sz w:val="20"/>
+              </w:rPr>
+            </w:r>
+            <w:r>
+              <w:rPr>
+                <w:rFonts w:ascii="Calibri" w:hAnsi="Calibri"/>
                 <w:sz w:val="20"/>
               </w:rPr>
               <w:t>0</w:t>
@@ -1386,10 +1655,15 @@
             <w:pPr>
               <w:jc w:val="center"/>
             </w:pPr>
-            <w:r/>
-            <w:r>
-              <w:rPr>
-                <w:rFonts w:ascii="Times New Roman" w:hAnsi="Times New Roman"/>
+            <w:r>
+              <w:rPr>
+                <w:rFonts w:ascii="Calibri" w:hAnsi="Calibri"/>
+                <w:sz w:val="20"/>
+              </w:rPr>
+            </w:r>
+            <w:r>
+              <w:rPr>
+                <w:rFonts w:ascii="Calibri" w:hAnsi="Calibri"/>
                 <w:sz w:val="20"/>
               </w:rPr>
               <w:t>0</w:t>
@@ -1404,10 +1678,15 @@
             <w:pPr>
               <w:jc w:val="center"/>
             </w:pPr>
-            <w:r/>
-            <w:r>
-              <w:rPr>
-                <w:rFonts w:ascii="Times New Roman" w:hAnsi="Times New Roman"/>
+            <w:r>
+              <w:rPr>
+                <w:rFonts w:ascii="Calibri" w:hAnsi="Calibri"/>
+                <w:sz w:val="20"/>
+              </w:rPr>
+            </w:r>
+            <w:r>
+              <w:rPr>
+                <w:rFonts w:ascii="Calibri" w:hAnsi="Calibri"/>
                 <w:sz w:val="20"/>
               </w:rPr>
               <w:t>3</w:t>
@@ -1422,10 +1701,15 @@
             <w:pPr>
               <w:jc w:val="center"/>
             </w:pPr>
-            <w:r/>
-            <w:r>
-              <w:rPr>
-                <w:rFonts w:ascii="Times New Roman" w:hAnsi="Times New Roman"/>
+            <w:r>
+              <w:rPr>
+                <w:rFonts w:ascii="Calibri" w:hAnsi="Calibri"/>
+                <w:sz w:val="20"/>
+              </w:rPr>
+            </w:r>
+            <w:r>
+              <w:rPr>
+                <w:rFonts w:ascii="Calibri" w:hAnsi="Calibri"/>
                 <w:sz w:val="20"/>
               </w:rPr>
               <w:t>4</w:t>
@@ -1440,10 +1724,15 @@
             <w:pPr>
               <w:jc w:val="center"/>
             </w:pPr>
-            <w:r/>
-            <w:r>
-              <w:rPr>
-                <w:rFonts w:ascii="Times New Roman" w:hAnsi="Times New Roman"/>
+            <w:r>
+              <w:rPr>
+                <w:rFonts w:ascii="Calibri" w:hAnsi="Calibri"/>
+                <w:sz w:val="20"/>
+              </w:rPr>
+            </w:r>
+            <w:r>
+              <w:rPr>
+                <w:rFonts w:ascii="Calibri" w:hAnsi="Calibri"/>
                 <w:sz w:val="20"/>
               </w:rPr>
               <w:t>4</w:t>
@@ -1458,10 +1747,15 @@
             <w:pPr>
               <w:jc w:val="center"/>
             </w:pPr>
-            <w:r/>
-            <w:r>
-              <w:rPr>
-                <w:rFonts w:ascii="Times New Roman" w:hAnsi="Times New Roman"/>
+            <w:r>
+              <w:rPr>
+                <w:rFonts w:ascii="Calibri" w:hAnsi="Calibri"/>
+                <w:sz w:val="20"/>
+              </w:rPr>
+            </w:r>
+            <w:r>
+              <w:rPr>
+                <w:rFonts w:ascii="Calibri" w:hAnsi="Calibri"/>
                 <w:sz w:val="20"/>
               </w:rPr>
               <w:t>7</w:t>
@@ -1476,10 +1770,15 @@
             <w:pPr>
               <w:jc w:val="center"/>
             </w:pPr>
-            <w:r/>
-            <w:r>
-              <w:rPr>
-                <w:rFonts w:ascii="Times New Roman" w:hAnsi="Times New Roman"/>
+            <w:r>
+              <w:rPr>
+                <w:rFonts w:ascii="Calibri" w:hAnsi="Calibri"/>
+                <w:sz w:val="20"/>
+              </w:rPr>
+            </w:r>
+            <w:r>
+              <w:rPr>
+                <w:rFonts w:ascii="Calibri" w:hAnsi="Calibri"/>
                 <w:sz w:val="20"/>
               </w:rPr>
               <w:t>7</w:t>
@@ -1494,10 +1793,15 @@
             <w:pPr>
               <w:jc w:val="center"/>
             </w:pPr>
-            <w:r/>
-            <w:r>
-              <w:rPr>
-                <w:rFonts w:ascii="Times New Roman" w:hAnsi="Times New Roman"/>
+            <w:r>
+              <w:rPr>
+                <w:rFonts w:ascii="Calibri" w:hAnsi="Calibri"/>
+                <w:sz w:val="20"/>
+              </w:rPr>
+            </w:r>
+            <w:r>
+              <w:rPr>
+                <w:rFonts w:ascii="Calibri" w:hAnsi="Calibri"/>
                 <w:sz w:val="20"/>
               </w:rPr>
               <w:t>7</w:t>
@@ -1512,10 +1816,15 @@
             <w:pPr>
               <w:jc w:val="center"/>
             </w:pPr>
-            <w:r/>
-            <w:r>
-              <w:rPr>
-                <w:rFonts w:ascii="Times New Roman" w:hAnsi="Times New Roman"/>
+            <w:r>
+              <w:rPr>
+                <w:rFonts w:ascii="Calibri" w:hAnsi="Calibri"/>
+                <w:sz w:val="20"/>
+              </w:rPr>
+            </w:r>
+            <w:r>
+              <w:rPr>
+                <w:rFonts w:ascii="Calibri" w:hAnsi="Calibri"/>
                 <w:sz w:val="20"/>
               </w:rPr>
               <w:t>7</w:t>
@@ -1532,10 +1841,15 @@
             <w:pPr>
               <w:jc w:val="center"/>
             </w:pPr>
-            <w:r/>
-            <w:r>
-              <w:rPr>
-                <w:rFonts w:ascii="Times New Roman" w:hAnsi="Times New Roman"/>
+            <w:r>
+              <w:rPr>
+                <w:rFonts w:ascii="Calibri" w:hAnsi="Calibri"/>
+                <w:sz w:val="20"/>
+              </w:rPr>
+            </w:r>
+            <w:r>
+              <w:rPr>
+                <w:rFonts w:ascii="Calibri" w:hAnsi="Calibri"/>
                 <w:sz w:val="20"/>
               </w:rPr>
               <w:t>3 (item 3)</w:t>
@@ -1550,10 +1864,15 @@
             <w:pPr>
               <w:jc w:val="center"/>
             </w:pPr>
-            <w:r/>
-            <w:r>
-              <w:rPr>
-                <w:rFonts w:ascii="Times New Roman" w:hAnsi="Times New Roman"/>
+            <w:r>
+              <w:rPr>
+                <w:rFonts w:ascii="Calibri" w:hAnsi="Calibri"/>
+                <w:sz w:val="20"/>
+              </w:rPr>
+            </w:r>
+            <w:r>
+              <w:rPr>
+                <w:rFonts w:ascii="Calibri" w:hAnsi="Calibri"/>
                 <w:sz w:val="20"/>
               </w:rPr>
               <w:t>0</w:t>
@@ -1568,10 +1887,15 @@
             <w:pPr>
               <w:jc w:val="center"/>
             </w:pPr>
-            <w:r/>
-            <w:r>
-              <w:rPr>
-                <w:rFonts w:ascii="Times New Roman" w:hAnsi="Times New Roman"/>
+            <w:r>
+              <w:rPr>
+                <w:rFonts w:ascii="Calibri" w:hAnsi="Calibri"/>
+                <w:sz w:val="20"/>
+              </w:rPr>
+            </w:r>
+            <w:r>
+              <w:rPr>
+                <w:rFonts w:ascii="Calibri" w:hAnsi="Calibri"/>
                 <w:sz w:val="20"/>
               </w:rPr>
               <w:t>0</w:t>
@@ -1586,10 +1910,15 @@
             <w:pPr>
               <w:jc w:val="center"/>
             </w:pPr>
-            <w:r/>
-            <w:r>
-              <w:rPr>
-                <w:rFonts w:ascii="Times New Roman" w:hAnsi="Times New Roman"/>
+            <w:r>
+              <w:rPr>
+                <w:rFonts w:ascii="Calibri" w:hAnsi="Calibri"/>
+                <w:sz w:val="20"/>
+              </w:rPr>
+            </w:r>
+            <w:r>
+              <w:rPr>
+                <w:rFonts w:ascii="Calibri" w:hAnsi="Calibri"/>
                 <w:sz w:val="20"/>
               </w:rPr>
               <w:t>3</w:t>
@@ -1604,10 +1933,15 @@
             <w:pPr>
               <w:jc w:val="center"/>
             </w:pPr>
-            <w:r/>
-            <w:r>
-              <w:rPr>
-                <w:rFonts w:ascii="Times New Roman" w:hAnsi="Times New Roman"/>
+            <w:r>
+              <w:rPr>
+                <w:rFonts w:ascii="Calibri" w:hAnsi="Calibri"/>
+                <w:sz w:val="20"/>
+              </w:rPr>
+            </w:r>
+            <w:r>
+              <w:rPr>
+                <w:rFonts w:ascii="Calibri" w:hAnsi="Calibri"/>
                 <w:sz w:val="20"/>
               </w:rPr>
               <w:t>4</w:t>
@@ -1622,10 +1956,15 @@
             <w:pPr>
               <w:jc w:val="center"/>
             </w:pPr>
-            <w:r/>
-            <w:r>
-              <w:rPr>
-                <w:rFonts w:ascii="Times New Roman" w:hAnsi="Times New Roman"/>
+            <w:r>
+              <w:rPr>
+                <w:rFonts w:ascii="Calibri" w:hAnsi="Calibri"/>
+                <w:sz w:val="20"/>
+              </w:rPr>
+            </w:r>
+            <w:r>
+              <w:rPr>
+                <w:rFonts w:ascii="Calibri" w:hAnsi="Calibri"/>
                 <w:sz w:val="20"/>
               </w:rPr>
               <w:t>5</w:t>
@@ -1640,10 +1979,15 @@
             <w:pPr>
               <w:jc w:val="center"/>
             </w:pPr>
-            <w:r/>
-            <w:r>
-              <w:rPr>
-                <w:rFonts w:ascii="Times New Roman" w:hAnsi="Times New Roman"/>
+            <w:r>
+              <w:rPr>
+                <w:rFonts w:ascii="Calibri" w:hAnsi="Calibri"/>
+                <w:sz w:val="20"/>
+              </w:rPr>
+            </w:r>
+            <w:r>
+              <w:rPr>
+                <w:rFonts w:ascii="Calibri" w:hAnsi="Calibri"/>
                 <w:sz w:val="20"/>
               </w:rPr>
               <w:t>7</w:t>
@@ -1658,10 +2002,15 @@
             <w:pPr>
               <w:jc w:val="center"/>
             </w:pPr>
-            <w:r/>
-            <w:r>
-              <w:rPr>
-                <w:rFonts w:ascii="Times New Roman" w:hAnsi="Times New Roman"/>
+            <w:r>
+              <w:rPr>
+                <w:rFonts w:ascii="Calibri" w:hAnsi="Calibri"/>
+                <w:sz w:val="20"/>
+              </w:rPr>
+            </w:r>
+            <w:r>
+              <w:rPr>
+                <w:rFonts w:ascii="Calibri" w:hAnsi="Calibri"/>
                 <w:sz w:val="20"/>
               </w:rPr>
               <w:t>8</w:t>
@@ -1676,10 +2025,15 @@
             <w:pPr>
               <w:jc w:val="center"/>
             </w:pPr>
-            <w:r/>
-            <w:r>
-              <w:rPr>
-                <w:rFonts w:ascii="Times New Roman" w:hAnsi="Times New Roman"/>
+            <w:r>
+              <w:rPr>
+                <w:rFonts w:ascii="Calibri" w:hAnsi="Calibri"/>
+                <w:sz w:val="20"/>
+              </w:rPr>
+            </w:r>
+            <w:r>
+              <w:rPr>
+                <w:rFonts w:ascii="Calibri" w:hAnsi="Calibri"/>
                 <w:sz w:val="20"/>
               </w:rPr>
               <w:t>9</w:t>
@@ -1694,10 +2048,15 @@
             <w:pPr>
               <w:jc w:val="center"/>
             </w:pPr>
-            <w:r/>
-            <w:r>
-              <w:rPr>
-                <w:rFonts w:ascii="Times New Roman" w:hAnsi="Times New Roman"/>
+            <w:r>
+              <w:rPr>
+                <w:rFonts w:ascii="Calibri" w:hAnsi="Calibri"/>
+                <w:sz w:val="20"/>
+              </w:rPr>
+            </w:r>
+            <w:r>
+              <w:rPr>
+                <w:rFonts w:ascii="Calibri" w:hAnsi="Calibri"/>
                 <w:sz w:val="20"/>
               </w:rPr>
               <w:t>9</w:t>
@@ -1714,10 +2073,15 @@
             <w:pPr>
               <w:jc w:val="center"/>
             </w:pPr>
-            <w:r/>
-            <w:r>
-              <w:rPr>
-                <w:rFonts w:ascii="Times New Roman" w:hAnsi="Times New Roman"/>
+            <w:r>
+              <w:rPr>
+                <w:rFonts w:ascii="Calibri" w:hAnsi="Calibri"/>
+                <w:sz w:val="20"/>
+              </w:rPr>
+            </w:r>
+            <w:r>
+              <w:rPr>
+                <w:rFonts w:ascii="Calibri" w:hAnsi="Calibri"/>
                 <w:sz w:val="20"/>
               </w:rPr>
               <w:t>4 (item 4)</w:t>
@@ -1732,10 +2096,15 @@
             <w:pPr>
               <w:jc w:val="center"/>
             </w:pPr>
-            <w:r/>
-            <w:r>
-              <w:rPr>
-                <w:rFonts w:ascii="Times New Roman" w:hAnsi="Times New Roman"/>
+            <w:r>
+              <w:rPr>
+                <w:rFonts w:ascii="Calibri" w:hAnsi="Calibri"/>
+                <w:sz w:val="20"/>
+              </w:rPr>
+            </w:r>
+            <w:r>
+              <w:rPr>
+                <w:rFonts w:ascii="Calibri" w:hAnsi="Calibri"/>
                 <w:sz w:val="20"/>
               </w:rPr>
               <w:t>0</w:t>
@@ -1750,10 +2119,15 @@
             <w:pPr>
               <w:jc w:val="center"/>
             </w:pPr>
-            <w:r/>
-            <w:r>
-              <w:rPr>
-                <w:rFonts w:ascii="Times New Roman" w:hAnsi="Times New Roman"/>
+            <w:r>
+              <w:rPr>
+                <w:rFonts w:ascii="Calibri" w:hAnsi="Calibri"/>
+                <w:sz w:val="20"/>
+              </w:rPr>
+            </w:r>
+            <w:r>
+              <w:rPr>
+                <w:rFonts w:ascii="Calibri" w:hAnsi="Calibri"/>
                 <w:sz w:val="20"/>
               </w:rPr>
               <w:t>0</w:t>
@@ -1768,10 +2142,15 @@
             <w:pPr>
               <w:jc w:val="center"/>
             </w:pPr>
-            <w:r/>
-            <w:r>
-              <w:rPr>
-                <w:rFonts w:ascii="Times New Roman" w:hAnsi="Times New Roman"/>
+            <w:r>
+              <w:rPr>
+                <w:rFonts w:ascii="Calibri" w:hAnsi="Calibri"/>
+                <w:sz w:val="20"/>
+              </w:rPr>
+            </w:r>
+            <w:r>
+              <w:rPr>
+                <w:rFonts w:ascii="Calibri" w:hAnsi="Calibri"/>
                 <w:sz w:val="20"/>
               </w:rPr>
               <w:t>3</w:t>
@@ -1786,10 +2165,15 @@
             <w:pPr>
               <w:jc w:val="center"/>
             </w:pPr>
-            <w:r/>
-            <w:r>
-              <w:rPr>
-                <w:rFonts w:ascii="Times New Roman" w:hAnsi="Times New Roman"/>
+            <w:r>
+              <w:rPr>
+                <w:rFonts w:ascii="Calibri" w:hAnsi="Calibri"/>
+                <w:sz w:val="20"/>
+              </w:rPr>
+            </w:r>
+            <w:r>
+              <w:rPr>
+                <w:rFonts w:ascii="Calibri" w:hAnsi="Calibri"/>
                 <w:sz w:val="20"/>
               </w:rPr>
               <w:t>4</w:t>
@@ -1804,10 +2188,15 @@
             <w:pPr>
               <w:jc w:val="center"/>
             </w:pPr>
-            <w:r/>
-            <w:r>
-              <w:rPr>
-                <w:rFonts w:ascii="Times New Roman" w:hAnsi="Times New Roman"/>
+            <w:r>
+              <w:rPr>
+                <w:rFonts w:ascii="Calibri" w:hAnsi="Calibri"/>
+                <w:sz w:val="20"/>
+              </w:rPr>
+            </w:r>
+            <w:r>
+              <w:rPr>
+                <w:rFonts w:ascii="Calibri" w:hAnsi="Calibri"/>
                 <w:sz w:val="20"/>
               </w:rPr>
               <w:t>5</w:t>
@@ -1822,10 +2211,15 @@
             <w:pPr>
               <w:jc w:val="center"/>
             </w:pPr>
-            <w:r/>
-            <w:r>
-              <w:rPr>
-                <w:rFonts w:ascii="Times New Roman" w:hAnsi="Times New Roman"/>
+            <w:r>
+              <w:rPr>
+                <w:rFonts w:ascii="Calibri" w:hAnsi="Calibri"/>
+                <w:sz w:val="20"/>
+              </w:rPr>
+            </w:r>
+            <w:r>
+              <w:rPr>
+                <w:rFonts w:ascii="Calibri" w:hAnsi="Calibri"/>
                 <w:sz w:val="20"/>
               </w:rPr>
               <w:t>7</w:t>
@@ -1840,10 +2234,15 @@
             <w:pPr>
               <w:jc w:val="center"/>
             </w:pPr>
-            <w:r/>
-            <w:r>
-              <w:rPr>
-                <w:rFonts w:ascii="Times New Roman" w:hAnsi="Times New Roman"/>
+            <w:r>
+              <w:rPr>
+                <w:rFonts w:ascii="Calibri" w:hAnsi="Calibri"/>
+                <w:sz w:val="20"/>
+              </w:rPr>
+            </w:r>
+            <w:r>
+              <w:rPr>
+                <w:rFonts w:ascii="Calibri" w:hAnsi="Calibri"/>
                 <w:sz w:val="20"/>
               </w:rPr>
               <w:t>8</w:t>
@@ -1858,10 +2257,15 @@
             <w:pPr>
               <w:jc w:val="center"/>
             </w:pPr>
-            <w:r/>
-            <w:r>
-              <w:rPr>
-                <w:rFonts w:ascii="Times New Roman" w:hAnsi="Times New Roman"/>
+            <w:r>
+              <w:rPr>
+                <w:rFonts w:ascii="Calibri" w:hAnsi="Calibri"/>
+                <w:sz w:val="20"/>
+              </w:rPr>
+            </w:r>
+            <w:r>
+              <w:rPr>
+                <w:rFonts w:ascii="Calibri" w:hAnsi="Calibri"/>
                 <w:sz w:val="20"/>
               </w:rPr>
               <w:t>9</w:t>
@@ -1876,10 +2280,15 @@
             <w:pPr>
               <w:jc w:val="center"/>
             </w:pPr>
-            <w:r/>
-            <w:r>
-              <w:rPr>
-                <w:rFonts w:ascii="Times New Roman" w:hAnsi="Times New Roman"/>
+            <w:r>
+              <w:rPr>
+                <w:rFonts w:ascii="Calibri" w:hAnsi="Calibri"/>
+                <w:sz w:val="20"/>
+              </w:rPr>
+            </w:r>
+            <w:r>
+              <w:rPr>
+                <w:rFonts w:ascii="Calibri" w:hAnsi="Calibri"/>
                 <w:sz w:val="20"/>
               </w:rPr>
               <w:t>10</w:t>
@@ -1905,6 +2314,10 @@
         <w:pStyle w:val="Heading2"/>
       </w:pPr>
       <w:r>
+        <w:rPr>
+          <w:rFonts w:ascii="Calibri" w:hAnsi="Calibri"/>
+          <w:color w:val="1A1A2E"/>
+        </w:rPr>
         <w:t>3.4. Implementação em JavaScript</w:t>
       </w:r>
     </w:p>
@@ -1924,7 +2337,11 @@
         <w:pStyle w:val="Heading3"/>
       </w:pPr>
       <w:r>
-        <w:t>3.4.1. Versão Matricial :  O(n·W)</w:t>
+        <w:rPr>
+          <w:rFonts w:ascii="Calibri" w:hAnsi="Calibri"/>
+          <w:color w:val="1A1A2E"/>
+        </w:rPr>
+        <w:t>3.4.1. Versão Matricial: O(n·W)</w:t>
       </w:r>
     </w:p>
     <w:p>
@@ -1940,65 +2357,65 @@
         </w:rPr>
         <w:t>function mochila01(pesos, valores, capacidade) {</w:t>
         <w:br/>
-        <w:t xml:space="preserve">  const n = pesos.length;</w:t>
+        <w:t xml:space="preserve"> const n = pesos.length;</w:t>
         <w:br/>
-        <w:t xml:space="preserve">  const dp = Array.from({ length: n + 1 }, () =&gt; Array(capacidade + 1).fill(0));</w:t>
+        <w:t xml:space="preserve"> const dp = Array.from({ length: n + 1 }, () =&gt; Array(capacidade + 1).fill(0));</w:t>
         <w:br/>
-        <w:t xml:space="preserve">  const keep = Array.from({ length: n + 1 }, () =&gt; Array(capacidade + 1).fill(false));</w:t>
+        <w:t xml:space="preserve"> const keep = Array.from({ length: n + 1 }, () =&gt; Array(capacidade + 1).fill(false));</w:t>
         <w:br/>
         <w:br/>
-        <w:t xml:space="preserve">  for (let i = 1; i &lt;= n; i++) {</w:t>
+        <w:t xml:space="preserve"> for (let i = 1; i &lt;= n; i++) {</w:t>
         <w:br/>
-        <w:t xml:space="preserve">    const pesoItem = pesos[i - 1];</w:t>
+        <w:t xml:space="preserve"> const pesoItem = pesos[i - 1];</w:t>
         <w:br/>
-        <w:t xml:space="preserve">    const valorItem = valores[i - 1];</w:t>
+        <w:t xml:space="preserve"> const valorItem = valores[i - 1];</w:t>
         <w:br/>
         <w:br/>
-        <w:t xml:space="preserve">    for (let w = 0; w &lt;= capacidade; w++) {</w:t>
+        <w:t xml:space="preserve"> for (let w = 0; w &lt;= capacidade; w++) {</w:t>
         <w:br/>
-        <w:t xml:space="preserve">      if (pesoItem &lt;= w) {</w:t>
+        <w:t xml:space="preserve"> if (pesoItem &lt;= w) {</w:t>
         <w:br/>
-        <w:t xml:space="preserve">        const semItem = dp[i - 1][w];</w:t>
+        <w:t xml:space="preserve"> const semItem = dp[i - 1][w];</w:t>
         <w:br/>
-        <w:t xml:space="preserve">        const comItem = dp[i - 1][w - pesoItem] + valorItem;</w:t>
+        <w:t xml:space="preserve"> const comItem = dp[i - 1][w - pesoItem] + valorItem;</w:t>
         <w:br/>
-        <w:t xml:space="preserve">        if (comItem &gt; semItem) {</w:t>
+        <w:t xml:space="preserve"> if (comItem &gt; semItem) {</w:t>
         <w:br/>
-        <w:t xml:space="preserve">          dp[i][w] = comItem;</w:t>
+        <w:t xml:space="preserve"> dp[i][w] = comItem;</w:t>
         <w:br/>
-        <w:t xml:space="preserve">          keep[i][w] = true;</w:t>
+        <w:t xml:space="preserve"> keep[i][w] = true;</w:t>
         <w:br/>
-        <w:t xml:space="preserve">        } else { dp[i][w] = semItem; }</w:t>
+        <w:t xml:space="preserve"> } else { dp[i][w] = semItem; }</w:t>
         <w:br/>
-        <w:t xml:space="preserve">      } else { dp[i][w] = dp[i - 1][w]; }</w:t>
+        <w:t xml:space="preserve"> } else { dp[i][w] = dp[i - 1][w]; }</w:t>
         <w:br/>
-        <w:t xml:space="preserve">    }</w:t>
+        <w:t xml:space="preserve"> }</w:t>
         <w:br/>
-        <w:t xml:space="preserve">  }</w:t>
+        <w:t xml:space="preserve"> }</w:t>
         <w:br/>
         <w:br/>
-        <w:t xml:space="preserve">  // Reconstrução (backtracking)</w:t>
+        <w:t xml:space="preserve"> // Reconstrução (backtracking)</w:t>
         <w:br/>
-        <w:t xml:space="preserve">  const itensSelecionados = [];</w:t>
+        <w:t xml:space="preserve"> const itensSelecionados = [];</w:t>
         <w:br/>
-        <w:t xml:space="preserve">  let w = capacidade;</w:t>
+        <w:t xml:space="preserve"> let w = capacidade;</w:t>
         <w:br/>
-        <w:t xml:space="preserve">  for (let i = n; i &gt;= 1; i--) {</w:t>
+        <w:t xml:space="preserve"> for (let i = n; i &gt;= 1; i--) {</w:t>
         <w:br/>
-        <w:t xml:space="preserve">    if (keep[i][w]) {</w:t>
+        <w:t xml:space="preserve"> if (keep[i][w]) {</w:t>
         <w:br/>
-        <w:t xml:space="preserve">      itensSelecionados.push(i - 1);</w:t>
+        <w:t xml:space="preserve"> itensSelecionados.push(i - 1);</w:t>
         <w:br/>
-        <w:t xml:space="preserve">      w -= pesos[i - 1];</w:t>
+        <w:t xml:space="preserve"> w -= pesos[i - 1];</w:t>
         <w:br/>
-        <w:t xml:space="preserve">    }</w:t>
+        <w:t xml:space="preserve"> }</w:t>
         <w:br/>
-        <w:t xml:space="preserve">  }</w:t>
+        <w:t xml:space="preserve"> }</w:t>
         <w:br/>
-        <w:t xml:space="preserve">  itensSelecionados.reverse();</w:t>
+        <w:t xml:space="preserve"> itensSelecionados.reverse();</w:t>
         <w:br/>
         <w:br/>
-        <w:t xml:space="preserve">  return { valorMaximo: dp[n][capacidade], itensSelecionados };</w:t>
+        <w:t xml:space="preserve"> return { valorMaximo: dp[n][capacidade], itensSelecionados };</w:t>
         <w:br/>
         <w:t>}</w:t>
       </w:r>
@@ -2008,7 +2425,11 @@
         <w:pStyle w:val="Heading3"/>
       </w:pPr>
       <w:r>
-        <w:t>3.4.2. Versão Otimizada :  O(W) de espaço</w:t>
+        <w:rPr>
+          <w:rFonts w:ascii="Calibri" w:hAnsi="Calibri"/>
+          <w:color w:val="1A1A2E"/>
+        </w:rPr>
+        <w:t>3.4.2. Versão Otimizada: O(W) de espaço</w:t>
       </w:r>
     </w:p>
     <w:p>
@@ -2024,59 +2445,59 @@
         </w:rPr>
         <w:t>function mochila01Otimizada(pesos, valores, capacidade) {</w:t>
         <w:br/>
-        <w:t xml:space="preserve">  const n = pesos.length;</w:t>
+        <w:t xml:space="preserve"> const n = pesos.length;</w:t>
         <w:br/>
-        <w:t xml:space="preserve">  const dp = Array(capacidade + 1).fill(0);</w:t>
+        <w:t xml:space="preserve"> const dp = Array(capacidade + 1).fill(0);</w:t>
         <w:br/>
-        <w:t xml:space="preserve">  const keep = Array.from({ length: n + 1 }, () =&gt; Array(capacidade + 1).fill(false));</w:t>
+        <w:t xml:space="preserve"> const keep = Array.from({ length: n + 1 }, () =&gt; Array(capacidade + 1).fill(false));</w:t>
         <w:br/>
         <w:br/>
-        <w:t xml:space="preserve">  for (let i = 1; i &lt;= n; i++) {</w:t>
+        <w:t xml:space="preserve"> for (let i = 1; i &lt;= n; i++) {</w:t>
         <w:br/>
-        <w:t xml:space="preserve">    const pesoItem = pesos[i - 1];</w:t>
+        <w:t xml:space="preserve"> const pesoItem = pesos[i - 1];</w:t>
         <w:br/>
-        <w:t xml:space="preserve">    const valorItem = valores[i - 1];</w:t>
+        <w:t xml:space="preserve"> const valorItem = valores[i - 1];</w:t>
         <w:br/>
         <w:br/>
-        <w:t xml:space="preserve">    for (let w = capacidade; w &gt;= pesoItem; w--) {</w:t>
+        <w:t xml:space="preserve"> for (let w = capacidade; w &gt;= pesoItem; w--) {</w:t>
         <w:br/>
-        <w:t xml:space="preserve">      const comItem = dp[w - pesoItem] + valorItem;</w:t>
+        <w:t xml:space="preserve"> const comItem = dp[w - pesoItem] + valorItem;</w:t>
         <w:br/>
-        <w:t xml:space="preserve">      if (comItem &gt; dp[w]) {</w:t>
+        <w:t xml:space="preserve"> if (comItem &gt; dp[w]) {</w:t>
         <w:br/>
-        <w:t xml:space="preserve">        dp[w] = comItem;</w:t>
+        <w:t xml:space="preserve"> dp[w] = comItem;</w:t>
         <w:br/>
-        <w:t xml:space="preserve">        keep[i][w] = true;</w:t>
+        <w:t xml:space="preserve"> keep[i][w] = true;</w:t>
         <w:br/>
-        <w:t xml:space="preserve">      }</w:t>
+        <w:t xml:space="preserve"> }</w:t>
         <w:br/>
-        <w:t xml:space="preserve">    }</w:t>
+        <w:t xml:space="preserve"> }</w:t>
         <w:br/>
-        <w:t xml:space="preserve">  }</w:t>
+        <w:t xml:space="preserve"> }</w:t>
         <w:br/>
         <w:br/>
-        <w:t xml:space="preserve">  // Reconstrução (igual à versão matricial)</w:t>
+        <w:t xml:space="preserve"> // Reconstrução (igual à versão matricial)</w:t>
         <w:br/>
-        <w:t xml:space="preserve">  const itensSelecionados = [];</w:t>
+        <w:t xml:space="preserve"> const itensSelecionados = [];</w:t>
         <w:br/>
-        <w:t xml:space="preserve">  let w = capacidade;</w:t>
+        <w:t xml:space="preserve"> let w = capacidade;</w:t>
         <w:br/>
-        <w:t xml:space="preserve">  for (let i = n; i &gt;= 1; i--) {</w:t>
+        <w:t xml:space="preserve"> for (let i = n; i &gt;= 1; i--) {</w:t>
         <w:br/>
-        <w:t xml:space="preserve">    if (keep[i][w]) {</w:t>
+        <w:t xml:space="preserve"> if (keep[i][w]) {</w:t>
         <w:br/>
-        <w:t xml:space="preserve">      itensSelecionados.push(i - 1);</w:t>
+        <w:t xml:space="preserve"> itensSelecionados.push(i - 1);</w:t>
         <w:br/>
-        <w:t xml:space="preserve">      w -= pesos[i - 1];</w:t>
+        <w:t xml:space="preserve"> w -= pesos[i - 1];</w:t>
         <w:br/>
-        <w:t xml:space="preserve">    }</w:t>
+        <w:t xml:space="preserve"> }</w:t>
         <w:br/>
-        <w:t xml:space="preserve">  }</w:t>
+        <w:t xml:space="preserve"> }</w:t>
         <w:br/>
-        <w:t xml:space="preserve">  itensSelecionados.reverse();</w:t>
+        <w:t xml:space="preserve"> itensSelecionados.reverse();</w:t>
         <w:br/>
         <w:br/>
-        <w:t xml:space="preserve">  return { valorMaximo: dp[capacidade], itensSelecionados };</w:t>
+        <w:t xml:space="preserve"> return { valorMaximo: dp[capacidade], itensSelecionados };</w:t>
         <w:br/>
         <w:t>}</w:t>
       </w:r>
@@ -2097,6 +2518,10 @@
         <w:pStyle w:val="Heading3"/>
       </w:pPr>
       <w:r>
+        <w:rPr>
+          <w:rFonts w:ascii="Calibri" w:hAnsi="Calibri"/>
+          <w:color w:val="1A1A2E"/>
+        </w:rPr>
         <w:t>3.4.3. Exemplos de Execução</w:t>
       </w:r>
     </w:p>
@@ -2115,7 +2540,7 @@
     </w:p>
     <w:tbl>
       <w:tblPr>
-        <w:tblStyle w:val="TableGrid"/>
+        <w:tblStyle w:val="LightGrid-Accent1"/>
         <w:tblW w:type="auto" w:w="0"/>
         <w:jc w:val="center"/>
         <w:tblLook w:firstColumn="1" w:firstRow="1" w:lastColumn="0" w:lastRow="0" w:noHBand="0" w:noVBand="1" w:val="04A0"/>
@@ -2140,10 +2565,15 @@
             <w:pPr>
               <w:jc w:val="center"/>
             </w:pPr>
-            <w:r/>
-            <w:r>
-              <w:rPr>
-                <w:rFonts w:ascii="Times New Roman" w:hAnsi="Times New Roman"/>
+            <w:r>
+              <w:rPr>
+                <w:rFonts w:ascii="Calibri" w:hAnsi="Calibri"/>
+                <w:sz w:val="20"/>
+              </w:rPr>
+            </w:r>
+            <w:r>
+              <w:rPr>
+                <w:rFonts w:ascii="Calibri" w:hAnsi="Calibri"/>
                 <w:b/>
                 <w:sz w:val="20"/>
               </w:rPr>
@@ -2160,10 +2590,15 @@
             <w:pPr>
               <w:jc w:val="center"/>
             </w:pPr>
-            <w:r/>
-            <w:r>
-              <w:rPr>
-                <w:rFonts w:ascii="Times New Roman" w:hAnsi="Times New Roman"/>
+            <w:r>
+              <w:rPr>
+                <w:rFonts w:ascii="Calibri" w:hAnsi="Calibri"/>
+                <w:sz w:val="20"/>
+              </w:rPr>
+            </w:r>
+            <w:r>
+              <w:rPr>
+                <w:rFonts w:ascii="Calibri" w:hAnsi="Calibri"/>
                 <w:b/>
                 <w:sz w:val="20"/>
               </w:rPr>
@@ -2180,10 +2615,15 @@
             <w:pPr>
               <w:jc w:val="center"/>
             </w:pPr>
-            <w:r/>
-            <w:r>
-              <w:rPr>
-                <w:rFonts w:ascii="Times New Roman" w:hAnsi="Times New Roman"/>
+            <w:r>
+              <w:rPr>
+                <w:rFonts w:ascii="Calibri" w:hAnsi="Calibri"/>
+                <w:sz w:val="20"/>
+              </w:rPr>
+            </w:r>
+            <w:r>
+              <w:rPr>
+                <w:rFonts w:ascii="Calibri" w:hAnsi="Calibri"/>
                 <w:b/>
                 <w:sz w:val="20"/>
               </w:rPr>
@@ -2200,10 +2640,15 @@
             <w:pPr>
               <w:jc w:val="center"/>
             </w:pPr>
-            <w:r/>
-            <w:r>
-              <w:rPr>
-                <w:rFonts w:ascii="Times New Roman" w:hAnsi="Times New Roman"/>
+            <w:r>
+              <w:rPr>
+                <w:rFonts w:ascii="Calibri" w:hAnsi="Calibri"/>
+                <w:sz w:val="20"/>
+              </w:rPr>
+            </w:r>
+            <w:r>
+              <w:rPr>
+                <w:rFonts w:ascii="Calibri" w:hAnsi="Calibri"/>
                 <w:b/>
                 <w:sz w:val="20"/>
               </w:rPr>
@@ -2220,10 +2665,15 @@
             <w:pPr>
               <w:jc w:val="center"/>
             </w:pPr>
-            <w:r/>
-            <w:r>
-              <w:rPr>
-                <w:rFonts w:ascii="Times New Roman" w:hAnsi="Times New Roman"/>
+            <w:r>
+              <w:rPr>
+                <w:rFonts w:ascii="Calibri" w:hAnsi="Calibri"/>
+                <w:sz w:val="20"/>
+              </w:rPr>
+            </w:r>
+            <w:r>
+              <w:rPr>
+                <w:rFonts w:ascii="Calibri" w:hAnsi="Calibri"/>
                 <w:b/>
                 <w:sz w:val="20"/>
               </w:rPr>
@@ -2240,10 +2690,15 @@
             <w:pPr>
               <w:jc w:val="center"/>
             </w:pPr>
-            <w:r/>
-            <w:r>
-              <w:rPr>
-                <w:rFonts w:ascii="Times New Roman" w:hAnsi="Times New Roman"/>
+            <w:r>
+              <w:rPr>
+                <w:rFonts w:ascii="Calibri" w:hAnsi="Calibri"/>
+                <w:sz w:val="20"/>
+              </w:rPr>
+            </w:r>
+            <w:r>
+              <w:rPr>
+                <w:rFonts w:ascii="Calibri" w:hAnsi="Calibri"/>
                 <w:b/>
                 <w:sz w:val="20"/>
               </w:rPr>
@@ -2260,10 +2715,15 @@
             <w:pPr>
               <w:jc w:val="center"/>
             </w:pPr>
-            <w:r/>
-            <w:r>
-              <w:rPr>
-                <w:rFonts w:ascii="Times New Roman" w:hAnsi="Times New Roman"/>
+            <w:r>
+              <w:rPr>
+                <w:rFonts w:ascii="Calibri" w:hAnsi="Calibri"/>
+                <w:sz w:val="20"/>
+              </w:rPr>
+            </w:r>
+            <w:r>
+              <w:rPr>
+                <w:rFonts w:ascii="Calibri" w:hAnsi="Calibri"/>
                 <w:b/>
                 <w:sz w:val="20"/>
               </w:rPr>
@@ -2280,10 +2740,15 @@
             <w:pPr>
               <w:jc w:val="center"/>
             </w:pPr>
-            <w:r/>
-            <w:r>
-              <w:rPr>
-                <w:rFonts w:ascii="Times New Roman" w:hAnsi="Times New Roman"/>
+            <w:r>
+              <w:rPr>
+                <w:rFonts w:ascii="Calibri" w:hAnsi="Calibri"/>
+                <w:sz w:val="20"/>
+              </w:rPr>
+            </w:r>
+            <w:r>
+              <w:rPr>
+                <w:rFonts w:ascii="Calibri" w:hAnsi="Calibri"/>
                 <w:b/>
                 <w:sz w:val="20"/>
               </w:rPr>
@@ -2301,10 +2766,15 @@
             <w:pPr>
               <w:jc w:val="center"/>
             </w:pPr>
-            <w:r/>
-            <w:r>
-              <w:rPr>
-                <w:rFonts w:ascii="Times New Roman" w:hAnsi="Times New Roman"/>
+            <w:r>
+              <w:rPr>
+                <w:rFonts w:ascii="Calibri" w:hAnsi="Calibri"/>
+                <w:sz w:val="20"/>
+              </w:rPr>
+            </w:r>
+            <w:r>
+              <w:rPr>
+                <w:rFonts w:ascii="Calibri" w:hAnsi="Calibri"/>
                 <w:sz w:val="20"/>
               </w:rPr>
               <w:t>1. Caso Didático</w:t>
@@ -2319,10 +2789,15 @@
             <w:pPr>
               <w:jc w:val="center"/>
             </w:pPr>
-            <w:r/>
-            <w:r>
-              <w:rPr>
-                <w:rFonts w:ascii="Times New Roman" w:hAnsi="Times New Roman"/>
+            <w:r>
+              <w:rPr>
+                <w:rFonts w:ascii="Calibri" w:hAnsi="Calibri"/>
+                <w:sz w:val="20"/>
+              </w:rPr>
+            </w:r>
+            <w:r>
+              <w:rPr>
+                <w:rFonts w:ascii="Calibri" w:hAnsi="Calibri"/>
                 <w:sz w:val="20"/>
               </w:rPr>
               <w:t>4</w:t>
@@ -2337,10 +2812,15 @@
             <w:pPr>
               <w:jc w:val="center"/>
             </w:pPr>
-            <w:r/>
-            <w:r>
-              <w:rPr>
-                <w:rFonts w:ascii="Times New Roman" w:hAnsi="Times New Roman"/>
+            <w:r>
+              <w:rPr>
+                <w:rFonts w:ascii="Calibri" w:hAnsi="Calibri"/>
+                <w:sz w:val="20"/>
+              </w:rPr>
+            </w:r>
+            <w:r>
+              <w:rPr>
+                <w:rFonts w:ascii="Calibri" w:hAnsi="Calibri"/>
                 <w:sz w:val="20"/>
               </w:rPr>
               <w:t>8</w:t>
@@ -2355,10 +2835,15 @@
             <w:pPr>
               <w:jc w:val="center"/>
             </w:pPr>
-            <w:r/>
-            <w:r>
-              <w:rPr>
-                <w:rFonts w:ascii="Times New Roman" w:hAnsi="Times New Roman"/>
+            <w:r>
+              <w:rPr>
+                <w:rFonts w:ascii="Calibri" w:hAnsi="Calibri"/>
+                <w:sz w:val="20"/>
+              </w:rPr>
+            </w:r>
+            <w:r>
+              <w:rPr>
+                <w:rFonts w:ascii="Calibri" w:hAnsi="Calibri"/>
                 <w:sz w:val="20"/>
               </w:rPr>
               <w:t>10</w:t>
@@ -2373,10 +2858,15 @@
             <w:pPr>
               <w:jc w:val="center"/>
             </w:pPr>
-            <w:r/>
-            <w:r>
-              <w:rPr>
-                <w:rFonts w:ascii="Times New Roman" w:hAnsi="Times New Roman"/>
+            <w:r>
+              <w:rPr>
+                <w:rFonts w:ascii="Calibri" w:hAnsi="Calibri"/>
+                <w:sz w:val="20"/>
+              </w:rPr>
+            </w:r>
+            <w:r>
+              <w:rPr>
+                <w:rFonts w:ascii="Calibri" w:hAnsi="Calibri"/>
                 <w:sz w:val="20"/>
               </w:rPr>
               <w:t>[2, 4]</w:t>
@@ -2391,10 +2881,15 @@
             <w:pPr>
               <w:jc w:val="center"/>
             </w:pPr>
-            <w:r/>
-            <w:r>
-              <w:rPr>
-                <w:rFonts w:ascii="Times New Roman" w:hAnsi="Times New Roman"/>
+            <w:r>
+              <w:rPr>
+                <w:rFonts w:ascii="Calibri" w:hAnsi="Calibri"/>
+                <w:sz w:val="20"/>
+              </w:rPr>
+            </w:r>
+            <w:r>
+              <w:rPr>
+                <w:rFonts w:ascii="Calibri" w:hAnsi="Calibri"/>
                 <w:sz w:val="20"/>
               </w:rPr>
               <w:t>8/8 (100%)</w:t>
@@ -2409,10 +2904,15 @@
             <w:pPr>
               <w:jc w:val="center"/>
             </w:pPr>
-            <w:r/>
-            <w:r>
-              <w:rPr>
-                <w:rFonts w:ascii="Times New Roman" w:hAnsi="Times New Roman"/>
+            <w:r>
+              <w:rPr>
+                <w:rFonts w:ascii="Calibri" w:hAnsi="Calibri"/>
+                <w:sz w:val="20"/>
+              </w:rPr>
+            </w:r>
+            <w:r>
+              <w:rPr>
+                <w:rFonts w:ascii="Calibri" w:hAnsi="Calibri"/>
                 <w:sz w:val="20"/>
               </w:rPr>
               <w:t>0,79 ms</w:t>
@@ -2427,10 +2927,15 @@
             <w:pPr>
               <w:jc w:val="center"/>
             </w:pPr>
-            <w:r/>
-            <w:r>
-              <w:rPr>
-                <w:rFonts w:ascii="Times New Roman" w:hAnsi="Times New Roman"/>
+            <w:r>
+              <w:rPr>
+                <w:rFonts w:ascii="Calibri" w:hAnsi="Calibri"/>
+                <w:sz w:val="20"/>
+              </w:rPr>
+            </w:r>
+            <w:r>
+              <w:rPr>
+                <w:rFonts w:ascii="Calibri" w:hAnsi="Calibri"/>
                 <w:sz w:val="20"/>
               </w:rPr>
               <w:t>0,29 ms</w:t>
@@ -2447,10 +2952,15 @@
             <w:pPr>
               <w:jc w:val="center"/>
             </w:pPr>
-            <w:r/>
-            <w:r>
-              <w:rPr>
-                <w:rFonts w:ascii="Times New Roman" w:hAnsi="Times New Roman"/>
+            <w:r>
+              <w:rPr>
+                <w:rFonts w:ascii="Calibri" w:hAnsi="Calibri"/>
+                <w:sz w:val="20"/>
+              </w:rPr>
+            </w:r>
+            <w:r>
+              <w:rPr>
+                <w:rFonts w:ascii="Calibri" w:hAnsi="Calibri"/>
                 <w:sz w:val="20"/>
               </w:rPr>
               <w:t>2. Seleção de Cargas</w:t>
@@ -2465,10 +2975,15 @@
             <w:pPr>
               <w:jc w:val="center"/>
             </w:pPr>
-            <w:r/>
-            <w:r>
-              <w:rPr>
-                <w:rFonts w:ascii="Times New Roman" w:hAnsi="Times New Roman"/>
+            <w:r>
+              <w:rPr>
+                <w:rFonts w:ascii="Calibri" w:hAnsi="Calibri"/>
+                <w:sz w:val="20"/>
+              </w:rPr>
+            </w:r>
+            <w:r>
+              <w:rPr>
+                <w:rFonts w:ascii="Calibri" w:hAnsi="Calibri"/>
                 <w:sz w:val="20"/>
               </w:rPr>
               <w:t>7</w:t>
@@ -2483,10 +2998,15 @@
             <w:pPr>
               <w:jc w:val="center"/>
             </w:pPr>
-            <w:r/>
-            <w:r>
-              <w:rPr>
-                <w:rFonts w:ascii="Times New Roman" w:hAnsi="Times New Roman"/>
+            <w:r>
+              <w:rPr>
+                <w:rFonts w:ascii="Calibri" w:hAnsi="Calibri"/>
+                <w:sz w:val="20"/>
+              </w:rPr>
+            </w:r>
+            <w:r>
+              <w:rPr>
+                <w:rFonts w:ascii="Calibri" w:hAnsi="Calibri"/>
                 <w:sz w:val="20"/>
               </w:rPr>
               <w:t>50</w:t>
@@ -2501,10 +3021,15 @@
             <w:pPr>
               <w:jc w:val="center"/>
             </w:pPr>
-            <w:r/>
-            <w:r>
-              <w:rPr>
-                <w:rFonts w:ascii="Times New Roman" w:hAnsi="Times New Roman"/>
+            <w:r>
+              <w:rPr>
+                <w:rFonts w:ascii="Calibri" w:hAnsi="Calibri"/>
+                <w:sz w:val="20"/>
+              </w:rPr>
+            </w:r>
+            <w:r>
+              <w:rPr>
+                <w:rFonts w:ascii="Calibri" w:hAnsi="Calibri"/>
                 <w:sz w:val="20"/>
               </w:rPr>
               <w:t>260</w:t>
@@ -2519,10 +3044,15 @@
             <w:pPr>
               <w:jc w:val="center"/>
             </w:pPr>
-            <w:r/>
-            <w:r>
-              <w:rPr>
-                <w:rFonts w:ascii="Times New Roman" w:hAnsi="Times New Roman"/>
+            <w:r>
+              <w:rPr>
+                <w:rFonts w:ascii="Calibri" w:hAnsi="Calibri"/>
+                <w:sz w:val="20"/>
+              </w:rPr>
+            </w:r>
+            <w:r>
+              <w:rPr>
+                <w:rFonts w:ascii="Calibri" w:hAnsi="Calibri"/>
                 <w:sz w:val="20"/>
               </w:rPr>
               <w:t>[1, 6]</w:t>
@@ -2537,10 +3067,15 @@
             <w:pPr>
               <w:jc w:val="center"/>
             </w:pPr>
-            <w:r/>
-            <w:r>
-              <w:rPr>
-                <w:rFonts w:ascii="Times New Roman" w:hAnsi="Times New Roman"/>
+            <w:r>
+              <w:rPr>
+                <w:rFonts w:ascii="Calibri" w:hAnsi="Calibri"/>
+                <w:sz w:val="20"/>
+              </w:rPr>
+            </w:r>
+            <w:r>
+              <w:rPr>
+                <w:rFonts w:ascii="Calibri" w:hAnsi="Calibri"/>
                 <w:sz w:val="20"/>
               </w:rPr>
               <w:t>50/50 (100%)</w:t>
@@ -2555,10 +3090,15 @@
             <w:pPr>
               <w:jc w:val="center"/>
             </w:pPr>
-            <w:r/>
-            <w:r>
-              <w:rPr>
-                <w:rFonts w:ascii="Times New Roman" w:hAnsi="Times New Roman"/>
+            <w:r>
+              <w:rPr>
+                <w:rFonts w:ascii="Calibri" w:hAnsi="Calibri"/>
+                <w:sz w:val="20"/>
+              </w:rPr>
+            </w:r>
+            <w:r>
+              <w:rPr>
+                <w:rFonts w:ascii="Calibri" w:hAnsi="Calibri"/>
                 <w:sz w:val="20"/>
               </w:rPr>
               <w:t>0,16 ms</w:t>
@@ -2573,10 +3113,15 @@
             <w:pPr>
               <w:jc w:val="center"/>
             </w:pPr>
-            <w:r/>
-            <w:r>
-              <w:rPr>
-                <w:rFonts w:ascii="Times New Roman" w:hAnsi="Times New Roman"/>
+            <w:r>
+              <w:rPr>
+                <w:rFonts w:ascii="Calibri" w:hAnsi="Calibri"/>
+                <w:sz w:val="20"/>
+              </w:rPr>
+            </w:r>
+            <w:r>
+              <w:rPr>
+                <w:rFonts w:ascii="Calibri" w:hAnsi="Calibri"/>
                 <w:sz w:val="20"/>
               </w:rPr>
               <w:t>0,14 ms</w:t>
@@ -2593,10 +3138,15 @@
             <w:pPr>
               <w:jc w:val="center"/>
             </w:pPr>
-            <w:r/>
-            <w:r>
-              <w:rPr>
-                <w:rFonts w:ascii="Times New Roman" w:hAnsi="Times New Roman"/>
+            <w:r>
+              <w:rPr>
+                <w:rFonts w:ascii="Calibri" w:hAnsi="Calibri"/>
+                <w:sz w:val="20"/>
+              </w:rPr>
+            </w:r>
+            <w:r>
+              <w:rPr>
+                <w:rFonts w:ascii="Calibri" w:hAnsi="Calibri"/>
                 <w:sz w:val="20"/>
               </w:rPr>
               <w:t>3. Gestão de Inventário</w:t>
@@ -2611,10 +3161,15 @@
             <w:pPr>
               <w:jc w:val="center"/>
             </w:pPr>
-            <w:r/>
-            <w:r>
-              <w:rPr>
-                <w:rFonts w:ascii="Times New Roman" w:hAnsi="Times New Roman"/>
+            <w:r>
+              <w:rPr>
+                <w:rFonts w:ascii="Calibri" w:hAnsi="Calibri"/>
+                <w:sz w:val="20"/>
+              </w:rPr>
+            </w:r>
+            <w:r>
+              <w:rPr>
+                <w:rFonts w:ascii="Calibri" w:hAnsi="Calibri"/>
                 <w:sz w:val="20"/>
               </w:rPr>
               <w:t>8</w:t>
@@ -2629,10 +3184,15 @@
             <w:pPr>
               <w:jc w:val="center"/>
             </w:pPr>
-            <w:r/>
-            <w:r>
-              <w:rPr>
-                <w:rFonts w:ascii="Times New Roman" w:hAnsi="Times New Roman"/>
+            <w:r>
+              <w:rPr>
+                <w:rFonts w:ascii="Calibri" w:hAnsi="Calibri"/>
+                <w:sz w:val="20"/>
+              </w:rPr>
+            </w:r>
+            <w:r>
+              <w:rPr>
+                <w:rFonts w:ascii="Calibri" w:hAnsi="Calibri"/>
                 <w:sz w:val="20"/>
               </w:rPr>
               <w:t>30</w:t>
@@ -2647,10 +3207,15 @@
             <w:pPr>
               <w:jc w:val="center"/>
             </w:pPr>
-            <w:r/>
-            <w:r>
-              <w:rPr>
-                <w:rFonts w:ascii="Times New Roman" w:hAnsi="Times New Roman"/>
+            <w:r>
+              <w:rPr>
+                <w:rFonts w:ascii="Calibri" w:hAnsi="Calibri"/>
+                <w:sz w:val="20"/>
+              </w:rPr>
+            </w:r>
+            <w:r>
+              <w:rPr>
+                <w:rFonts w:ascii="Calibri" w:hAnsi="Calibri"/>
                 <w:sz w:val="20"/>
               </w:rPr>
               <w:t>112</w:t>
@@ -2665,10 +3230,15 @@
             <w:pPr>
               <w:jc w:val="center"/>
             </w:pPr>
-            <w:r/>
-            <w:r>
-              <w:rPr>
-                <w:rFonts w:ascii="Times New Roman" w:hAnsi="Times New Roman"/>
+            <w:r>
+              <w:rPr>
+                <w:rFonts w:ascii="Calibri" w:hAnsi="Calibri"/>
+                <w:sz w:val="20"/>
+              </w:rPr>
+            </w:r>
+            <w:r>
+              <w:rPr>
+                <w:rFonts w:ascii="Calibri" w:hAnsi="Calibri"/>
                 <w:sz w:val="20"/>
               </w:rPr>
               <w:t>[1, 2, 4, 8]</w:t>
@@ -2683,10 +3253,15 @@
             <w:pPr>
               <w:jc w:val="center"/>
             </w:pPr>
-            <w:r/>
-            <w:r>
-              <w:rPr>
-                <w:rFonts w:ascii="Times New Roman" w:hAnsi="Times New Roman"/>
+            <w:r>
+              <w:rPr>
+                <w:rFonts w:ascii="Calibri" w:hAnsi="Calibri"/>
+                <w:sz w:val="20"/>
+              </w:rPr>
+            </w:r>
+            <w:r>
+              <w:rPr>
+                <w:rFonts w:ascii="Calibri" w:hAnsi="Calibri"/>
                 <w:sz w:val="20"/>
               </w:rPr>
               <w:t>30/30 (100%)</w:t>
@@ -2701,10 +3276,15 @@
             <w:pPr>
               <w:jc w:val="center"/>
             </w:pPr>
-            <w:r/>
-            <w:r>
-              <w:rPr>
-                <w:rFonts w:ascii="Times New Roman" w:hAnsi="Times New Roman"/>
+            <w:r>
+              <w:rPr>
+                <w:rFonts w:ascii="Calibri" w:hAnsi="Calibri"/>
+                <w:sz w:val="20"/>
+              </w:rPr>
+            </w:r>
+            <w:r>
+              <w:rPr>
+                <w:rFonts w:ascii="Calibri" w:hAnsi="Calibri"/>
                 <w:sz w:val="20"/>
               </w:rPr>
               <w:t>0,30 ms</w:t>
@@ -2719,10 +3299,15 @@
             <w:pPr>
               <w:jc w:val="center"/>
             </w:pPr>
-            <w:r/>
-            <w:r>
-              <w:rPr>
-                <w:rFonts w:ascii="Times New Roman" w:hAnsi="Times New Roman"/>
+            <w:r>
+              <w:rPr>
+                <w:rFonts w:ascii="Calibri" w:hAnsi="Calibri"/>
+                <w:sz w:val="20"/>
+              </w:rPr>
+            </w:r>
+            <w:r>
+              <w:rPr>
+                <w:rFonts w:ascii="Calibri" w:hAnsi="Calibri"/>
                 <w:sz w:val="20"/>
               </w:rPr>
               <w:t>0,23 ms</w:t>
@@ -2739,10 +3324,15 @@
             <w:pPr>
               <w:jc w:val="center"/>
             </w:pPr>
-            <w:r/>
-            <w:r>
-              <w:rPr>
-                <w:rFonts w:ascii="Times New Roman" w:hAnsi="Times New Roman"/>
+            <w:r>
+              <w:rPr>
+                <w:rFonts w:ascii="Calibri" w:hAnsi="Calibri"/>
+                <w:sz w:val="20"/>
+              </w:rPr>
+            </w:r>
+            <w:r>
+              <w:rPr>
+                <w:rFonts w:ascii="Calibri" w:hAnsi="Calibri"/>
                 <w:sz w:val="20"/>
               </w:rPr>
               <w:t>4. Caso com 12 Itens</w:t>
@@ -2757,10 +3347,15 @@
             <w:pPr>
               <w:jc w:val="center"/>
             </w:pPr>
-            <w:r/>
-            <w:r>
-              <w:rPr>
-                <w:rFonts w:ascii="Times New Roman" w:hAnsi="Times New Roman"/>
+            <w:r>
+              <w:rPr>
+                <w:rFonts w:ascii="Calibri" w:hAnsi="Calibri"/>
+                <w:sz w:val="20"/>
+              </w:rPr>
+            </w:r>
+            <w:r>
+              <w:rPr>
+                <w:rFonts w:ascii="Calibri" w:hAnsi="Calibri"/>
                 <w:sz w:val="20"/>
               </w:rPr>
               <w:t>12</w:t>
@@ -2775,10 +3370,15 @@
             <w:pPr>
               <w:jc w:val="center"/>
             </w:pPr>
-            <w:r/>
-            <w:r>
-              <w:rPr>
-                <w:rFonts w:ascii="Times New Roman" w:hAnsi="Times New Roman"/>
+            <w:r>
+              <w:rPr>
+                <w:rFonts w:ascii="Calibri" w:hAnsi="Calibri"/>
+                <w:sz w:val="20"/>
+              </w:rPr>
+            </w:r>
+            <w:r>
+              <w:rPr>
+                <w:rFonts w:ascii="Calibri" w:hAnsi="Calibri"/>
                 <w:sz w:val="20"/>
               </w:rPr>
               <w:t>40</w:t>
@@ -2793,10 +3393,15 @@
             <w:pPr>
               <w:jc w:val="center"/>
             </w:pPr>
-            <w:r/>
-            <w:r>
-              <w:rPr>
-                <w:rFonts w:ascii="Times New Roman" w:hAnsi="Times New Roman"/>
+            <w:r>
+              <w:rPr>
+                <w:rFonts w:ascii="Calibri" w:hAnsi="Calibri"/>
+                <w:sz w:val="20"/>
+              </w:rPr>
+            </w:r>
+            <w:r>
+              <w:rPr>
+                <w:rFonts w:ascii="Calibri" w:hAnsi="Calibri"/>
                 <w:sz w:val="20"/>
               </w:rPr>
               <w:t>515</w:t>
@@ -2811,10 +3416,15 @@
             <w:pPr>
               <w:jc w:val="center"/>
             </w:pPr>
-            <w:r/>
-            <w:r>
-              <w:rPr>
-                <w:rFonts w:ascii="Times New Roman" w:hAnsi="Times New Roman"/>
+            <w:r>
+              <w:rPr>
+                <w:rFonts w:ascii="Calibri" w:hAnsi="Calibri"/>
+                <w:sz w:val="20"/>
+              </w:rPr>
+            </w:r>
+            <w:r>
+              <w:rPr>
+                <w:rFonts w:ascii="Calibri" w:hAnsi="Calibri"/>
                 <w:sz w:val="20"/>
               </w:rPr>
               <w:t>[1, 2, 3, 6, 8, 10, 11]</w:t>
@@ -2829,10 +3439,15 @@
             <w:pPr>
               <w:jc w:val="center"/>
             </w:pPr>
-            <w:r/>
-            <w:r>
-              <w:rPr>
-                <w:rFonts w:ascii="Times New Roman" w:hAnsi="Times New Roman"/>
+            <w:r>
+              <w:rPr>
+                <w:rFonts w:ascii="Calibri" w:hAnsi="Calibri"/>
+                <w:sz w:val="20"/>
+              </w:rPr>
+            </w:r>
+            <w:r>
+              <w:rPr>
+                <w:rFonts w:ascii="Calibri" w:hAnsi="Calibri"/>
                 <w:sz w:val="20"/>
               </w:rPr>
               <w:t>40/40 (100%)</w:t>
@@ -2847,10 +3462,15 @@
             <w:pPr>
               <w:jc w:val="center"/>
             </w:pPr>
-            <w:r/>
-            <w:r>
-              <w:rPr>
-                <w:rFonts w:ascii="Times New Roman" w:hAnsi="Times New Roman"/>
+            <w:r>
+              <w:rPr>
+                <w:rFonts w:ascii="Calibri" w:hAnsi="Calibri"/>
+                <w:sz w:val="20"/>
+              </w:rPr>
+            </w:r>
+            <w:r>
+              <w:rPr>
+                <w:rFonts w:ascii="Calibri" w:hAnsi="Calibri"/>
                 <w:sz w:val="20"/>
               </w:rPr>
               <w:t>0,07 ms</w:t>
@@ -2865,10 +3485,15 @@
             <w:pPr>
               <w:jc w:val="center"/>
             </w:pPr>
-            <w:r/>
-            <w:r>
-              <w:rPr>
-                <w:rFonts w:ascii="Times New Roman" w:hAnsi="Times New Roman"/>
+            <w:r>
+              <w:rPr>
+                <w:rFonts w:ascii="Calibri" w:hAnsi="Calibri"/>
+                <w:sz w:val="20"/>
+              </w:rPr>
+            </w:r>
+            <w:r>
+              <w:rPr>
+                <w:rFonts w:ascii="Calibri" w:hAnsi="Calibri"/>
                 <w:sz w:val="20"/>
               </w:rPr>
               <w:t>0,05 ms</w:t>
@@ -2888,12 +3513,12 @@
           <w:b/>
           <w:i/>
         </w:rPr>
-        <w:t>Tabela 4: Comparativo de desempenho :  100 itens, W = 500</w:t>
+        <w:t>Tabela 4: Comparativo de desempenho: 100 itens, W = 500</w:t>
       </w:r>
     </w:p>
     <w:tbl>
       <w:tblPr>
-        <w:tblStyle w:val="TableGrid"/>
+        <w:tblStyle w:val="LightGrid-Accent1"/>
         <w:tblW w:type="auto" w:w="0"/>
         <w:jc w:val="center"/>
         <w:tblLook w:firstColumn="1" w:firstRow="1" w:lastColumn="0" w:lastRow="0" w:noHBand="0" w:noVBand="1" w:val="04A0"/>
@@ -2913,10 +3538,15 @@
             <w:pPr>
               <w:jc w:val="center"/>
             </w:pPr>
-            <w:r/>
-            <w:r>
-              <w:rPr>
-                <w:rFonts w:ascii="Times New Roman" w:hAnsi="Times New Roman"/>
+            <w:r>
+              <w:rPr>
+                <w:rFonts w:ascii="Calibri" w:hAnsi="Calibri"/>
+                <w:sz w:val="20"/>
+              </w:rPr>
+            </w:r>
+            <w:r>
+              <w:rPr>
+                <w:rFonts w:ascii="Calibri" w:hAnsi="Calibri"/>
                 <w:b/>
                 <w:sz w:val="20"/>
               </w:rPr>
@@ -2933,10 +3563,15 @@
             <w:pPr>
               <w:jc w:val="center"/>
             </w:pPr>
-            <w:r/>
-            <w:r>
-              <w:rPr>
-                <w:rFonts w:ascii="Times New Roman" w:hAnsi="Times New Roman"/>
+            <w:r>
+              <w:rPr>
+                <w:rFonts w:ascii="Calibri" w:hAnsi="Calibri"/>
+                <w:sz w:val="20"/>
+              </w:rPr>
+            </w:r>
+            <w:r>
+              <w:rPr>
+                <w:rFonts w:ascii="Calibri" w:hAnsi="Calibri"/>
                 <w:b/>
                 <w:sz w:val="20"/>
               </w:rPr>
@@ -2953,10 +3588,15 @@
             <w:pPr>
               <w:jc w:val="center"/>
             </w:pPr>
-            <w:r/>
-            <w:r>
-              <w:rPr>
-                <w:rFonts w:ascii="Times New Roman" w:hAnsi="Times New Roman"/>
+            <w:r>
+              <w:rPr>
+                <w:rFonts w:ascii="Calibri" w:hAnsi="Calibri"/>
+                <w:sz w:val="20"/>
+              </w:rPr>
+            </w:r>
+            <w:r>
+              <w:rPr>
+                <w:rFonts w:ascii="Calibri" w:hAnsi="Calibri"/>
                 <w:b/>
                 <w:sz w:val="20"/>
               </w:rPr>
@@ -2974,10 +3614,15 @@
             <w:pPr>
               <w:jc w:val="center"/>
             </w:pPr>
-            <w:r/>
-            <w:r>
-              <w:rPr>
-                <w:rFonts w:ascii="Times New Roman" w:hAnsi="Times New Roman"/>
+            <w:r>
+              <w:rPr>
+                <w:rFonts w:ascii="Calibri" w:hAnsi="Calibri"/>
+                <w:sz w:val="20"/>
+              </w:rPr>
+            </w:r>
+            <w:r>
+              <w:rPr>
+                <w:rFonts w:ascii="Calibri" w:hAnsi="Calibri"/>
                 <w:sz w:val="20"/>
               </w:rPr>
               <w:t>Tempo de execução</w:t>
@@ -2992,10 +3637,15 @@
             <w:pPr>
               <w:jc w:val="center"/>
             </w:pPr>
-            <w:r/>
-            <w:r>
-              <w:rPr>
-                <w:rFonts w:ascii="Times New Roman" w:hAnsi="Times New Roman"/>
+            <w:r>
+              <w:rPr>
+                <w:rFonts w:ascii="Calibri" w:hAnsi="Calibri"/>
+                <w:sz w:val="20"/>
+              </w:rPr>
+            </w:r>
+            <w:r>
+              <w:rPr>
+                <w:rFonts w:ascii="Calibri" w:hAnsi="Calibri"/>
                 <w:sz w:val="20"/>
               </w:rPr>
               <w:t>22,90 ms</w:t>
@@ -3010,10 +3660,15 @@
             <w:pPr>
               <w:jc w:val="center"/>
             </w:pPr>
-            <w:r/>
-            <w:r>
-              <w:rPr>
-                <w:rFonts w:ascii="Times New Roman" w:hAnsi="Times New Roman"/>
+            <w:r>
+              <w:rPr>
+                <w:rFonts w:ascii="Calibri" w:hAnsi="Calibri"/>
+                <w:sz w:val="20"/>
+              </w:rPr>
+            </w:r>
+            <w:r>
+              <w:rPr>
+                <w:rFonts w:ascii="Calibri" w:hAnsi="Calibri"/>
                 <w:sz w:val="20"/>
               </w:rPr>
               <w:t>6,86 ms</w:t>
@@ -3030,10 +3685,15 @@
             <w:pPr>
               <w:jc w:val="center"/>
             </w:pPr>
-            <w:r/>
-            <w:r>
-              <w:rPr>
-                <w:rFonts w:ascii="Times New Roman" w:hAnsi="Times New Roman"/>
+            <w:r>
+              <w:rPr>
+                <w:rFonts w:ascii="Calibri" w:hAnsi="Calibri"/>
+                <w:sz w:val="20"/>
+              </w:rPr>
+            </w:r>
+            <w:r>
+              <w:rPr>
+                <w:rFonts w:ascii="Calibri" w:hAnsi="Calibri"/>
                 <w:sz w:val="20"/>
               </w:rPr>
               <w:t>Valor máximo encontrado</w:t>
@@ -3048,10 +3708,15 @@
             <w:pPr>
               <w:jc w:val="center"/>
             </w:pPr>
-            <w:r/>
-            <w:r>
-              <w:rPr>
-                <w:rFonts w:ascii="Times New Roman" w:hAnsi="Times New Roman"/>
+            <w:r>
+              <w:rPr>
+                <w:rFonts w:ascii="Calibri" w:hAnsi="Calibri"/>
+                <w:sz w:val="20"/>
+              </w:rPr>
+            </w:r>
+            <w:r>
+              <w:rPr>
+                <w:rFonts w:ascii="Calibri" w:hAnsi="Calibri"/>
                 <w:sz w:val="20"/>
               </w:rPr>
               <w:t>2526</w:t>
@@ -3066,10 +3731,15 @@
             <w:pPr>
               <w:jc w:val="center"/>
             </w:pPr>
-            <w:r/>
-            <w:r>
-              <w:rPr>
-                <w:rFonts w:ascii="Times New Roman" w:hAnsi="Times New Roman"/>
+            <w:r>
+              <w:rPr>
+                <w:rFonts w:ascii="Calibri" w:hAnsi="Calibri"/>
+                <w:sz w:val="20"/>
+              </w:rPr>
+            </w:r>
+            <w:r>
+              <w:rPr>
+                <w:rFonts w:ascii="Calibri" w:hAnsi="Calibri"/>
                 <w:sz w:val="20"/>
               </w:rPr>
               <w:t>2526</w:t>
@@ -3086,10 +3756,15 @@
             <w:pPr>
               <w:jc w:val="center"/>
             </w:pPr>
-            <w:r/>
-            <w:r>
-              <w:rPr>
-                <w:rFonts w:ascii="Times New Roman" w:hAnsi="Times New Roman"/>
+            <w:r>
+              <w:rPr>
+                <w:rFonts w:ascii="Calibri" w:hAnsi="Calibri"/>
+                <w:sz w:val="20"/>
+              </w:rPr>
+            </w:r>
+            <w:r>
+              <w:rPr>
+                <w:rFonts w:ascii="Calibri" w:hAnsi="Calibri"/>
                 <w:sz w:val="20"/>
               </w:rPr>
               <w:t>Itens selecionados</w:t>
@@ -3104,10 +3779,15 @@
             <w:pPr>
               <w:jc w:val="center"/>
             </w:pPr>
-            <w:r/>
-            <w:r>
-              <w:rPr>
-                <w:rFonts w:ascii="Times New Roman" w:hAnsi="Times New Roman"/>
+            <w:r>
+              <w:rPr>
+                <w:rFonts w:ascii="Calibri" w:hAnsi="Calibri"/>
+                <w:sz w:val="20"/>
+              </w:rPr>
+            </w:r>
+            <w:r>
+              <w:rPr>
+                <w:rFonts w:ascii="Calibri" w:hAnsi="Calibri"/>
                 <w:sz w:val="20"/>
               </w:rPr>
               <w:t>35 de 100</w:t>
@@ -3122,10 +3802,15 @@
             <w:pPr>
               <w:jc w:val="center"/>
             </w:pPr>
-            <w:r/>
-            <w:r>
-              <w:rPr>
-                <w:rFonts w:ascii="Times New Roman" w:hAnsi="Times New Roman"/>
+            <w:r>
+              <w:rPr>
+                <w:rFonts w:ascii="Calibri" w:hAnsi="Calibri"/>
+                <w:sz w:val="20"/>
+              </w:rPr>
+            </w:r>
+            <w:r>
+              <w:rPr>
+                <w:rFonts w:ascii="Calibri" w:hAnsi="Calibri"/>
                 <w:sz w:val="20"/>
               </w:rPr>
               <w:t>35 de 100</w:t>
@@ -3142,10 +3827,15 @@
             <w:pPr>
               <w:jc w:val="center"/>
             </w:pPr>
-            <w:r/>
-            <w:r>
-              <w:rPr>
-                <w:rFonts w:ascii="Times New Roman" w:hAnsi="Times New Roman"/>
+            <w:r>
+              <w:rPr>
+                <w:rFonts w:ascii="Calibri" w:hAnsi="Calibri"/>
+                <w:sz w:val="20"/>
+              </w:rPr>
+            </w:r>
+            <w:r>
+              <w:rPr>
+                <w:rFonts w:ascii="Calibri" w:hAnsi="Calibri"/>
                 <w:sz w:val="20"/>
               </w:rPr>
               <w:t>Espaço para valores</w:t>
@@ -3160,10 +3850,15 @@
             <w:pPr>
               <w:jc w:val="center"/>
             </w:pPr>
-            <w:r/>
-            <w:r>
-              <w:rPr>
-                <w:rFonts w:ascii="Times New Roman" w:hAnsi="Times New Roman"/>
+            <w:r>
+              <w:rPr>
+                <w:rFonts w:ascii="Calibri" w:hAnsi="Calibri"/>
+                <w:sz w:val="20"/>
+              </w:rPr>
+            </w:r>
+            <w:r>
+              <w:rPr>
+                <w:rFonts w:ascii="Calibri" w:hAnsi="Calibri"/>
                 <w:sz w:val="20"/>
               </w:rPr>
               <w:t>O(n·W) = ~50.000</w:t>
@@ -3178,10 +3873,15 @@
             <w:pPr>
               <w:jc w:val="center"/>
             </w:pPr>
-            <w:r/>
-            <w:r>
-              <w:rPr>
-                <w:rFonts w:ascii="Times New Roman" w:hAnsi="Times New Roman"/>
+            <w:r>
+              <w:rPr>
+                <w:rFonts w:ascii="Calibri" w:hAnsi="Calibri"/>
+                <w:sz w:val="20"/>
+              </w:rPr>
+            </w:r>
+            <w:r>
+              <w:rPr>
+                <w:rFonts w:ascii="Calibri" w:hAnsi="Calibri"/>
                 <w:sz w:val="20"/>
               </w:rPr>
               <w:t>O(W) = 501</w:t>
@@ -3196,6 +3896,10 @@
         <w:pStyle w:val="Heading3"/>
       </w:pPr>
       <w:r>
+        <w:rPr>
+          <w:rFonts w:ascii="Calibri" w:hAnsi="Calibri"/>
+          <w:color w:val="1A1A2E"/>
+        </w:rPr>
         <w:t>3.4.4. Evidências de Funcionamento</w:t>
       </w:r>
     </w:p>
@@ -3233,7 +3937,7 @@
           <w:rFonts w:ascii="Courier New" w:hAnsi="Courier New"/>
           <w:sz w:val="16"/>
         </w:rPr>
-        <w:t>║   MOCHILA 0/1 - Programação Dinâmica (Bottom-Up)             ║</w:t>
+        <w:t>║ MOCHILA 0/1 - Programação Dinâmica (Bottom-Up) ║</w:t>
       </w:r>
     </w:p>
     <w:p>
@@ -3283,7 +3987,7 @@
           <w:rFonts w:ascii="Courier New" w:hAnsi="Courier New"/>
           <w:sz w:val="16"/>
         </w:rPr>
-        <w:t xml:space="preserve">  EXEMPLO 1 - Caso básico com 4 itens (didático)</w:t>
+        <w:t xml:space="preserve"> EXEMPLO 1 - Caso básico com 4 itens (didático)</w:t>
       </w:r>
     </w:p>
     <w:p>
@@ -3322,7 +4026,7 @@
           <w:rFonts w:ascii="Courier New" w:hAnsi="Courier New"/>
           <w:sz w:val="16"/>
         </w:rPr>
-        <w:t xml:space="preserve">  Capacidade da mochila: 8</w:t>
+        <w:t xml:space="preserve"> Capacidade da mochila: 8</w:t>
       </w:r>
     </w:p>
     <w:p>
@@ -3348,7 +4052,7 @@
           <w:rFonts w:ascii="Courier New" w:hAnsi="Courier New"/>
           <w:sz w:val="16"/>
         </w:rPr>
-        <w:t xml:space="preserve">  -- Versão Matricial (O(n·W) espaço) --</w:t>
+        <w:t xml:space="preserve"> -- Versão Matricial (O(n·W) espaço) --</w:t>
       </w:r>
     </w:p>
     <w:p>
@@ -3361,7 +4065,7 @@
           <w:rFonts w:ascii="Courier New" w:hAnsi="Courier New"/>
           <w:sz w:val="16"/>
         </w:rPr>
-        <w:t xml:space="preserve">  Tempo (matricial): 0.793ms</w:t>
+        <w:t xml:space="preserve"> Tempo (matricial): 0.793ms</w:t>
       </w:r>
     </w:p>
     <w:p>
@@ -3374,7 +4078,7 @@
           <w:rFonts w:ascii="Courier New" w:hAnsi="Courier New"/>
           <w:sz w:val="16"/>
         </w:rPr>
-        <w:t xml:space="preserve">  Valor máximo obtido: 10</w:t>
+        <w:t xml:space="preserve"> Valor máximo obtido: 10</w:t>
       </w:r>
     </w:p>
     <w:p>
@@ -3387,7 +4091,7 @@
           <w:rFonts w:ascii="Courier New" w:hAnsi="Courier New"/>
           <w:sz w:val="16"/>
         </w:rPr>
-        <w:t xml:space="preserve">  Itens selecionados  : [2, 4]</w:t>
+        <w:t xml:space="preserve"> Itens selecionados: [2, 4]</w:t>
       </w:r>
     </w:p>
     <w:p>
@@ -3400,7 +4104,7 @@
           <w:rFonts w:ascii="Courier New" w:hAnsi="Courier New"/>
           <w:sz w:val="16"/>
         </w:rPr>
-        <w:t xml:space="preserve">  Peso utilizado: 8 / 8 (100.0%)</w:t>
+        <w:t xml:space="preserve"> Peso utilizado: 8 / 8 (100.0%)</w:t>
       </w:r>
     </w:p>
     <w:p>
@@ -3426,7 +4130,7 @@
           <w:rFonts w:ascii="Courier New" w:hAnsi="Courier New"/>
           <w:sz w:val="16"/>
         </w:rPr>
-        <w:t xml:space="preserve">  -- Versão Otimizada (O(W) espaço para valores) --</w:t>
+        <w:t xml:space="preserve"> -- Versão Otimizada (O(W) espaço para valores) --</w:t>
       </w:r>
     </w:p>
     <w:p>
@@ -3439,7 +4143,7 @@
           <w:rFonts w:ascii="Courier New" w:hAnsi="Courier New"/>
           <w:sz w:val="16"/>
         </w:rPr>
-        <w:t xml:space="preserve">  Tempo (otimizada): 0.293ms</w:t>
+        <w:t xml:space="preserve"> Tempo (otimizada): 0.293ms</w:t>
       </w:r>
     </w:p>
     <w:p>
@@ -3452,7 +4156,7 @@
           <w:rFonts w:ascii="Courier New" w:hAnsi="Courier New"/>
           <w:sz w:val="16"/>
         </w:rPr>
-        <w:t xml:space="preserve">  Valor máximo obtido: 10</w:t>
+        <w:t xml:space="preserve"> Valor máximo obtido: 10</w:t>
       </w:r>
     </w:p>
     <w:p>
@@ -3465,7 +4169,7 @@
           <w:rFonts w:ascii="Courier New" w:hAnsi="Courier New"/>
           <w:sz w:val="16"/>
         </w:rPr>
-        <w:t xml:space="preserve">  Itens selecionados  : [2, 4]</w:t>
+        <w:t xml:space="preserve"> Itens selecionados: [2, 4]</w:t>
       </w:r>
     </w:p>
     <w:p>
@@ -3502,7 +4206,7 @@
           <w:rFonts w:ascii="Courier New" w:hAnsi="Courier New"/>
           <w:sz w:val="16"/>
         </w:rPr>
-        <w:t xml:space="preserve">  COMPARATIVO: Matricial × Otimizada</w:t>
+        <w:t xml:space="preserve"> COMPARATIVO: Matricial × Otimizada</w:t>
       </w:r>
     </w:p>
     <w:p>
@@ -3541,7 +4245,7 @@
           <w:rFonts w:ascii="Courier New" w:hAnsi="Courier New"/>
           <w:sz w:val="16"/>
         </w:rPr>
-        <w:t xml:space="preserve">  Caso de teste: 100 itens, capacidade 500</w:t>
+        <w:t xml:space="preserve"> Caso de teste: 100 itens, capacidade 500</w:t>
       </w:r>
     </w:p>
     <w:p>
@@ -3567,7 +4271,7 @@
           <w:rFonts w:ascii="Courier New" w:hAnsi="Courier New"/>
           <w:sz w:val="16"/>
         </w:rPr>
-        <w:t xml:space="preserve">  Versão Matricial (O(n·W) espaço):</w:t>
+        <w:t xml:space="preserve"> Versão Matricial (O(n·W) espaço):</w:t>
       </w:r>
     </w:p>
     <w:p>
@@ -3580,7 +4284,7 @@
           <w:rFonts w:ascii="Courier New" w:hAnsi="Courier New"/>
           <w:sz w:val="16"/>
         </w:rPr>
-        <w:t xml:space="preserve">  matricial: 22.903ms</w:t>
+        <w:t xml:space="preserve"> matricial: 22.903ms</w:t>
       </w:r>
     </w:p>
     <w:p>
@@ -3593,7 +4297,7 @@
           <w:rFonts w:ascii="Courier New" w:hAnsi="Courier New"/>
           <w:sz w:val="16"/>
         </w:rPr>
-        <w:t xml:space="preserve">  Valor máximo: 2526</w:t>
+        <w:t xml:space="preserve"> Valor máximo: 2526</w:t>
       </w:r>
     </w:p>
     <w:p>
@@ -3606,7 +4310,7 @@
           <w:rFonts w:ascii="Courier New" w:hAnsi="Courier New"/>
           <w:sz w:val="16"/>
         </w:rPr>
-        <w:t xml:space="preserve">  Itens selecionados: 35 de 100</w:t>
+        <w:t xml:space="preserve"> Itens selecionados: 35 de 100</w:t>
       </w:r>
     </w:p>
     <w:p>
@@ -3632,7 +4336,7 @@
           <w:rFonts w:ascii="Courier New" w:hAnsi="Courier New"/>
           <w:sz w:val="16"/>
         </w:rPr>
-        <w:t xml:space="preserve">  Versão Otimizada (O(W) espaço para dp):</w:t>
+        <w:t xml:space="preserve"> Versão Otimizada (O(W) espaço para dp):</w:t>
       </w:r>
     </w:p>
     <w:p>
@@ -3645,7 +4349,7 @@
           <w:rFonts w:ascii="Courier New" w:hAnsi="Courier New"/>
           <w:sz w:val="16"/>
         </w:rPr>
-        <w:t xml:space="preserve">  otimizada: 6.862ms</w:t>
+        <w:t xml:space="preserve"> otimizada: 6.862ms</w:t>
       </w:r>
     </w:p>
     <w:p>
@@ -3658,7 +4362,7 @@
           <w:rFonts w:ascii="Courier New" w:hAnsi="Courier New"/>
           <w:sz w:val="16"/>
         </w:rPr>
-        <w:t xml:space="preserve">  Valor máximo: 2526</w:t>
+        <w:t xml:space="preserve"> Valor máximo: 2526</w:t>
       </w:r>
     </w:p>
     <w:p>
@@ -3671,7 +4375,7 @@
           <w:rFonts w:ascii="Courier New" w:hAnsi="Courier New"/>
           <w:sz w:val="16"/>
         </w:rPr>
-        <w:t xml:space="preserve">  Itens selecionados: 35 de 100</w:t>
+        <w:t xml:space="preserve"> Itens selecionados: 35 de 100</w:t>
       </w:r>
     </w:p>
     <w:p>
@@ -3697,7 +4401,7 @@
           <w:rFonts w:ascii="Courier New" w:hAnsi="Courier New"/>
           <w:sz w:val="16"/>
         </w:rPr>
-        <w:t xml:space="preserve">  ✓ Ambos os algoritmos retornaram o mesmo valor máximo? SIM</w:t>
+        <w:t xml:space="preserve"> ✓ Ambos os algoritmos retornaram o mesmo valor máximo? SIM</w:t>
       </w:r>
     </w:p>
     <w:p>
@@ -3705,6 +4409,10 @@
         <w:pStyle w:val="Heading1"/>
       </w:pPr>
       <w:r>
+        <w:rPr>
+          <w:rFonts w:ascii="Calibri" w:hAnsi="Calibri"/>
+          <w:color w:val="1A1A2E"/>
+        </w:rPr>
         <w:t>4. Análise do Algoritmo</w:t>
       </w:r>
     </w:p>
@@ -3713,6 +4421,10 @@
         <w:pStyle w:val="Heading2"/>
       </w:pPr>
       <w:r>
+        <w:rPr>
+          <w:rFonts w:ascii="Calibri" w:hAnsi="Calibri"/>
+          <w:color w:val="1A1A2E"/>
+        </w:rPr>
         <w:t>4.1. Complexidade de Tempo</w:t>
       </w:r>
     </w:p>
@@ -3724,7 +4436,7 @@
           <w:b w:val="0"/>
           <w:i w:val="0"/>
         </w:rPr>
-        <w:t>A versão matricial da Programação Dinâmica para o problema da Mochila 0/1 preenche uma tabela de dimensões (n+1) × (W+1). Para cada uma das n·W células efetivamente computadas, realiza-se uma quantidade constante de operações :  uma comparação e, no máximo, uma adição. Em termos assintóticos, a complexidade de tempo da solução é Θ(n·W).</w:t>
+        <w:t>A versão matricial da Programação Dinâmica para o problema da Mochila 0/1 preenche uma tabela de dimensões (n+1) × (W+1). Para cada uma das n·W células efetivamente computadas, realiza-se uma quantidade constante de operações: uma comparação e, no máximo, uma adição. Em termos assintóticos, a complexidade de tempo da solução é Θ(n·W).</w:t>
       </w:r>
     </w:p>
     <w:p>
@@ -3743,6 +4455,10 @@
         <w:pStyle w:val="Heading2"/>
       </w:pPr>
       <w:r>
+        <w:rPr>
+          <w:rFonts w:ascii="Calibri" w:hAnsi="Calibri"/>
+          <w:color w:val="1A1A2E"/>
+        </w:rPr>
         <w:t>4.2. Complexidade de Espaço</w:t>
       </w:r>
     </w:p>
@@ -3773,6 +4489,10 @@
         <w:pStyle w:val="Heading2"/>
       </w:pPr>
       <w:r>
+        <w:rPr>
+          <w:rFonts w:ascii="Calibri" w:hAnsi="Calibri"/>
+          <w:color w:val="1A1A2E"/>
+        </w:rPr>
         <w:t>4.3. Análise Pseudo-Polinomial</w:t>
       </w:r>
     </w:p>
@@ -3792,6 +4512,10 @@
         <w:pStyle w:val="Heading2"/>
       </w:pPr>
       <w:r>
+        <w:rPr>
+          <w:rFonts w:ascii="Calibri" w:hAnsi="Calibri"/>
+          <w:color w:val="1A1A2E"/>
+        </w:rPr>
         <w:t>4.4. Comparação com Abordagens Alternativas</w:t>
       </w:r>
     </w:p>
@@ -3810,7 +4534,7 @@
     </w:p>
     <w:tbl>
       <w:tblPr>
-        <w:tblStyle w:val="TableGrid"/>
+        <w:tblStyle w:val="LightGrid-Accent1"/>
         <w:tblW w:type="auto" w:w="0"/>
         <w:jc w:val="center"/>
         <w:tblLook w:firstColumn="1" w:firstRow="1" w:lastColumn="0" w:lastRow="0" w:noHBand="0" w:noVBand="1" w:val="04A0"/>
@@ -3831,10 +4555,15 @@
             <w:pPr>
               <w:jc w:val="center"/>
             </w:pPr>
-            <w:r/>
-            <w:r>
-              <w:rPr>
-                <w:rFonts w:ascii="Times New Roman" w:hAnsi="Times New Roman"/>
+            <w:r>
+              <w:rPr>
+                <w:rFonts w:ascii="Calibri" w:hAnsi="Calibri"/>
+                <w:sz w:val="20"/>
+              </w:rPr>
+            </w:r>
+            <w:r>
+              <w:rPr>
+                <w:rFonts w:ascii="Calibri" w:hAnsi="Calibri"/>
                 <w:b/>
                 <w:sz w:val="20"/>
               </w:rPr>
@@ -3851,10 +4580,15 @@
             <w:pPr>
               <w:jc w:val="center"/>
             </w:pPr>
-            <w:r/>
-            <w:r>
-              <w:rPr>
-                <w:rFonts w:ascii="Times New Roman" w:hAnsi="Times New Roman"/>
+            <w:r>
+              <w:rPr>
+                <w:rFonts w:ascii="Calibri" w:hAnsi="Calibri"/>
+                <w:sz w:val="20"/>
+              </w:rPr>
+            </w:r>
+            <w:r>
+              <w:rPr>
+                <w:rFonts w:ascii="Calibri" w:hAnsi="Calibri"/>
                 <w:b/>
                 <w:sz w:val="20"/>
               </w:rPr>
@@ -3871,10 +4605,15 @@
             <w:pPr>
               <w:jc w:val="center"/>
             </w:pPr>
-            <w:r/>
-            <w:r>
-              <w:rPr>
-                <w:rFonts w:ascii="Times New Roman" w:hAnsi="Times New Roman"/>
+            <w:r>
+              <w:rPr>
+                <w:rFonts w:ascii="Calibri" w:hAnsi="Calibri"/>
+                <w:sz w:val="20"/>
+              </w:rPr>
+            </w:r>
+            <w:r>
+              <w:rPr>
+                <w:rFonts w:ascii="Calibri" w:hAnsi="Calibri"/>
                 <w:b/>
                 <w:sz w:val="20"/>
               </w:rPr>
@@ -3891,10 +4630,15 @@
             <w:pPr>
               <w:jc w:val="center"/>
             </w:pPr>
-            <w:r/>
-            <w:r>
-              <w:rPr>
-                <w:rFonts w:ascii="Times New Roman" w:hAnsi="Times New Roman"/>
+            <w:r>
+              <w:rPr>
+                <w:rFonts w:ascii="Calibri" w:hAnsi="Calibri"/>
+                <w:sz w:val="20"/>
+              </w:rPr>
+            </w:r>
+            <w:r>
+              <w:rPr>
+                <w:rFonts w:ascii="Calibri" w:hAnsi="Calibri"/>
                 <w:b/>
                 <w:sz w:val="20"/>
               </w:rPr>
@@ -3912,10 +4656,15 @@
             <w:pPr>
               <w:jc w:val="center"/>
             </w:pPr>
-            <w:r/>
-            <w:r>
-              <w:rPr>
-                <w:rFonts w:ascii="Times New Roman" w:hAnsi="Times New Roman"/>
+            <w:r>
+              <w:rPr>
+                <w:rFonts w:ascii="Calibri" w:hAnsi="Calibri"/>
+                <w:sz w:val="20"/>
+              </w:rPr>
+            </w:r>
+            <w:r>
+              <w:rPr>
+                <w:rFonts w:ascii="Calibri" w:hAnsi="Calibri"/>
                 <w:sz w:val="20"/>
               </w:rPr>
               <w:t>Força Bruta</w:t>
@@ -3930,10 +4679,15 @@
             <w:pPr>
               <w:jc w:val="center"/>
             </w:pPr>
-            <w:r/>
-            <w:r>
-              <w:rPr>
-                <w:rFonts w:ascii="Times New Roman" w:hAnsi="Times New Roman"/>
+            <w:r>
+              <w:rPr>
+                <w:rFonts w:ascii="Calibri" w:hAnsi="Calibri"/>
+                <w:sz w:val="20"/>
+              </w:rPr>
+            </w:r>
+            <w:r>
+              <w:rPr>
+                <w:rFonts w:ascii="Calibri" w:hAnsi="Calibri"/>
                 <w:sz w:val="20"/>
               </w:rPr>
               <w:t>O(2^n)</w:t>
@@ -3948,10 +4702,15 @@
             <w:pPr>
               <w:jc w:val="center"/>
             </w:pPr>
-            <w:r/>
-            <w:r>
-              <w:rPr>
-                <w:rFonts w:ascii="Times New Roman" w:hAnsi="Times New Roman"/>
+            <w:r>
+              <w:rPr>
+                <w:rFonts w:ascii="Calibri" w:hAnsi="Calibri"/>
+                <w:sz w:val="20"/>
+              </w:rPr>
+            </w:r>
+            <w:r>
+              <w:rPr>
+                <w:rFonts w:ascii="Calibri" w:hAnsi="Calibri"/>
                 <w:sz w:val="20"/>
               </w:rPr>
               <w:t>Garantida</w:t>
@@ -3966,10 +4725,15 @@
             <w:pPr>
               <w:jc w:val="center"/>
             </w:pPr>
-            <w:r/>
-            <w:r>
-              <w:rPr>
-                <w:rFonts w:ascii="Times New Roman" w:hAnsi="Times New Roman"/>
+            <w:r>
+              <w:rPr>
+                <w:rFonts w:ascii="Calibri" w:hAnsi="Calibri"/>
+                <w:sz w:val="20"/>
+              </w:rPr>
+            </w:r>
+            <w:r>
+              <w:rPr>
+                <w:rFonts w:ascii="Calibri" w:hAnsi="Calibri"/>
                 <w:sz w:val="20"/>
               </w:rPr>
               <w:t>Inviável para n &gt; 40</w:t>
@@ -3986,10 +4750,15 @@
             <w:pPr>
               <w:jc w:val="center"/>
             </w:pPr>
-            <w:r/>
-            <w:r>
-              <w:rPr>
-                <w:rFonts w:ascii="Times New Roman" w:hAnsi="Times New Roman"/>
+            <w:r>
+              <w:rPr>
+                <w:rFonts w:ascii="Calibri" w:hAnsi="Calibri"/>
+                <w:sz w:val="20"/>
+              </w:rPr>
+            </w:r>
+            <w:r>
+              <w:rPr>
+                <w:rFonts w:ascii="Calibri" w:hAnsi="Calibri"/>
                 <w:sz w:val="20"/>
               </w:rPr>
               <w:t>Guloso (valor/peso)</w:t>
@@ -4004,10 +4773,15 @@
             <w:pPr>
               <w:jc w:val="center"/>
             </w:pPr>
-            <w:r/>
-            <w:r>
-              <w:rPr>
-                <w:rFonts w:ascii="Times New Roman" w:hAnsi="Times New Roman"/>
+            <w:r>
+              <w:rPr>
+                <w:rFonts w:ascii="Calibri" w:hAnsi="Calibri"/>
+                <w:sz w:val="20"/>
+              </w:rPr>
+            </w:r>
+            <w:r>
+              <w:rPr>
+                <w:rFonts w:ascii="Calibri" w:hAnsi="Calibri"/>
                 <w:sz w:val="20"/>
               </w:rPr>
               <w:t>O(n log n)</w:t>
@@ -4022,10 +4796,15 @@
             <w:pPr>
               <w:jc w:val="center"/>
             </w:pPr>
-            <w:r/>
-            <w:r>
-              <w:rPr>
-                <w:rFonts w:ascii="Times New Roman" w:hAnsi="Times New Roman"/>
+            <w:r>
+              <w:rPr>
+                <w:rFonts w:ascii="Calibri" w:hAnsi="Calibri"/>
+                <w:sz w:val="20"/>
+              </w:rPr>
+            </w:r>
+            <w:r>
+              <w:rPr>
+                <w:rFonts w:ascii="Calibri" w:hAnsi="Calibri"/>
                 <w:sz w:val="20"/>
               </w:rPr>
               <w:t>Não garantida</w:t>
@@ -4040,10 +4819,15 @@
             <w:pPr>
               <w:jc w:val="center"/>
             </w:pPr>
-            <w:r/>
-            <w:r>
-              <w:rPr>
-                <w:rFonts w:ascii="Times New Roman" w:hAnsi="Times New Roman"/>
+            <w:r>
+              <w:rPr>
+                <w:rFonts w:ascii="Calibri" w:hAnsi="Calibri"/>
+                <w:sz w:val="20"/>
+              </w:rPr>
+            </w:r>
+            <w:r>
+              <w:rPr>
+                <w:rFonts w:ascii="Calibri" w:hAnsi="Calibri"/>
                 <w:sz w:val="20"/>
               </w:rPr>
               <w:t>Rápido, mas existem contraexemplos</w:t>
@@ -4060,10 +4844,15 @@
             <w:pPr>
               <w:jc w:val="center"/>
             </w:pPr>
-            <w:r/>
-            <w:r>
-              <w:rPr>
-                <w:rFonts w:ascii="Times New Roman" w:hAnsi="Times New Roman"/>
+            <w:r>
+              <w:rPr>
+                <w:rFonts w:ascii="Calibri" w:hAnsi="Calibri"/>
+                <w:sz w:val="20"/>
+              </w:rPr>
+            </w:r>
+            <w:r>
+              <w:rPr>
+                <w:rFonts w:ascii="Calibri" w:hAnsi="Calibri"/>
                 <w:sz w:val="20"/>
               </w:rPr>
               <w:t>Branch-and-Bound</w:t>
@@ -4078,10 +4867,15 @@
             <w:pPr>
               <w:jc w:val="center"/>
             </w:pPr>
-            <w:r/>
-            <w:r>
-              <w:rPr>
-                <w:rFonts w:ascii="Times New Roman" w:hAnsi="Times New Roman"/>
+            <w:r>
+              <w:rPr>
+                <w:rFonts w:ascii="Calibri" w:hAnsi="Calibri"/>
+                <w:sz w:val="20"/>
+              </w:rPr>
+            </w:r>
+            <w:r>
+              <w:rPr>
+                <w:rFonts w:ascii="Calibri" w:hAnsi="Calibri"/>
                 <w:sz w:val="20"/>
               </w:rPr>
               <w:t>O(2^n) pior caso</w:t>
@@ -4096,10 +4890,15 @@
             <w:pPr>
               <w:jc w:val="center"/>
             </w:pPr>
-            <w:r/>
-            <w:r>
-              <w:rPr>
-                <w:rFonts w:ascii="Times New Roman" w:hAnsi="Times New Roman"/>
+            <w:r>
+              <w:rPr>
+                <w:rFonts w:ascii="Calibri" w:hAnsi="Calibri"/>
+                <w:sz w:val="20"/>
+              </w:rPr>
+            </w:r>
+            <w:r>
+              <w:rPr>
+                <w:rFonts w:ascii="Calibri" w:hAnsi="Calibri"/>
                 <w:sz w:val="20"/>
               </w:rPr>
               <w:t>Garantida</w:t>
@@ -4114,10 +4913,15 @@
             <w:pPr>
               <w:jc w:val="center"/>
             </w:pPr>
-            <w:r/>
-            <w:r>
-              <w:rPr>
-                <w:rFonts w:ascii="Times New Roman" w:hAnsi="Times New Roman"/>
+            <w:r>
+              <w:rPr>
+                <w:rFonts w:ascii="Calibri" w:hAnsi="Calibri"/>
+                <w:sz w:val="20"/>
+              </w:rPr>
+            </w:r>
+            <w:r>
+              <w:rPr>
+                <w:rFonts w:ascii="Calibri" w:hAnsi="Calibri"/>
                 <w:sz w:val="20"/>
               </w:rPr>
               <w:t>Bom desempenho médio</w:t>
@@ -4134,10 +4938,15 @@
             <w:pPr>
               <w:jc w:val="center"/>
             </w:pPr>
-            <w:r/>
-            <w:r>
-              <w:rPr>
-                <w:rFonts w:ascii="Times New Roman" w:hAnsi="Times New Roman"/>
+            <w:r>
+              <w:rPr>
+                <w:rFonts w:ascii="Calibri" w:hAnsi="Calibri"/>
+                <w:sz w:val="20"/>
+              </w:rPr>
+            </w:r>
+            <w:r>
+              <w:rPr>
+                <w:rFonts w:ascii="Calibri" w:hAnsi="Calibri"/>
                 <w:sz w:val="20"/>
               </w:rPr>
               <w:t>Programação Dinâmica</w:t>
@@ -4152,10 +4961,15 @@
             <w:pPr>
               <w:jc w:val="center"/>
             </w:pPr>
-            <w:r/>
-            <w:r>
-              <w:rPr>
-                <w:rFonts w:ascii="Times New Roman" w:hAnsi="Times New Roman"/>
+            <w:r>
+              <w:rPr>
+                <w:rFonts w:ascii="Calibri" w:hAnsi="Calibri"/>
+                <w:sz w:val="20"/>
+              </w:rPr>
+            </w:r>
+            <w:r>
+              <w:rPr>
+                <w:rFonts w:ascii="Calibri" w:hAnsi="Calibri"/>
                 <w:sz w:val="20"/>
               </w:rPr>
               <w:t>O(n·W)</w:t>
@@ -4170,10 +4984,15 @@
             <w:pPr>
               <w:jc w:val="center"/>
             </w:pPr>
-            <w:r/>
-            <w:r>
-              <w:rPr>
-                <w:rFonts w:ascii="Times New Roman" w:hAnsi="Times New Roman"/>
+            <w:r>
+              <w:rPr>
+                <w:rFonts w:ascii="Calibri" w:hAnsi="Calibri"/>
+                <w:sz w:val="20"/>
+              </w:rPr>
+            </w:r>
+            <w:r>
+              <w:rPr>
+                <w:rFonts w:ascii="Calibri" w:hAnsi="Calibri"/>
                 <w:sz w:val="20"/>
               </w:rPr>
               <w:t>Garantida</w:t>
@@ -4188,10 +5007,15 @@
             <w:pPr>
               <w:jc w:val="center"/>
             </w:pPr>
-            <w:r/>
-            <w:r>
-              <w:rPr>
-                <w:rFonts w:ascii="Times New Roman" w:hAnsi="Times New Roman"/>
+            <w:r>
+              <w:rPr>
+                <w:rFonts w:ascii="Calibri" w:hAnsi="Calibri"/>
+                <w:sz w:val="20"/>
+              </w:rPr>
+            </w:r>
+            <w:r>
+              <w:rPr>
+                <w:rFonts w:ascii="Calibri" w:hAnsi="Calibri"/>
                 <w:sz w:val="20"/>
               </w:rPr>
               <w:t>Pseudo-polinomial; limitado por W</w:t>
@@ -4206,6 +5030,10 @@
         <w:pStyle w:val="Heading2"/>
       </w:pPr>
       <w:r>
+        <w:rPr>
+          <w:rFonts w:ascii="Calibri" w:hAnsi="Calibri"/>
+          <w:color w:val="1A1A2E"/>
+        </w:rPr>
         <w:t>4.5. Limitações da Implementação</w:t>
       </w:r>
     </w:p>
@@ -4250,6 +5078,10 @@
         <w:pStyle w:val="Heading1"/>
       </w:pPr>
       <w:r>
+        <w:rPr>
+          <w:rFonts w:ascii="Calibri" w:hAnsi="Calibri"/>
+          <w:color w:val="1A1A2E"/>
+        </w:rPr>
         <w:t>5. Aplicações em Sistemas Reais</w:t>
       </w:r>
     </w:p>
@@ -4333,6 +5165,10 @@
         <w:pStyle w:val="Heading1"/>
       </w:pPr>
       <w:r>
+        <w:rPr>
+          <w:rFonts w:ascii="Calibri" w:hAnsi="Calibri"/>
+          <w:color w:val="1A1A2E"/>
+        </w:rPr>
         <w:t>6. Conclusão</w:t>
       </w:r>
     </w:p>
@@ -4344,7 +5180,7 @@
           <w:b w:val="0"/>
           <w:i w:val="0"/>
         </w:rPr>
-        <w:t>O presente trabalho percorreu o ciclo completo que vai da teoria à prática na aplicação da Programação Dinâmica ao problema da Mochila 0/1. Do ponto de vista teórico, consolidou-se a compreensão dos princípios que fundamentam a técnica :  a subestrutura ótima e a sobreposição de subproblemas : , bem como a distinção entre as abordagens top-down (memoização) e bottom-up (tabelamento), com suas respectivas vantagens e limitações.</w:t>
+        <w:t>O presente trabalho percorreu o ciclo completo que vai da teoria à prática na aplicação da Programação Dinâmica ao problema da Mochila 0/1. Do ponto de vista teórico, consolidou-se a compreensão dos princípios que fundamentam a técnica: a subestrutura ótima e a sobreposição de subproblemas:, bem como a distinção entre as abordagens top-down (memoização) e bottom-up (tabelamento), com suas respectivas vantagens e limitações.</w:t>
       </w:r>
     </w:p>
     <w:p>
@@ -4355,7 +5191,7 @@
           <w:b w:val="0"/>
           <w:i w:val="0"/>
         </w:rPr>
-        <w:t>Do ponto de vista prático, a implementação das duas versões :  matricial e otimizada :  evidenciou que as considerações de eficiência espacial não são meramente acadêmicas. A versão otimizada com vetor unidimensional provou ser consistentemente mais rápida que a versão matricial (aproximadamente 3,3× no teste com 100 itens), com resultados idênticos.</w:t>
+        <w:t>Do ponto de vista prático, a implementação das duas versões: matricial e otimizada: evidenciou que as considerações de eficiência espacial não são meramente acadêmicas. A versão otimizada com vetor unidimensional provou ser consistentemente mais rápida que a versão matricial (aproximadamente 3,3× no teste com 100 itens), com resultados idênticos.</w:t>
       </w:r>
     </w:p>
     <w:p>
@@ -4374,6 +5210,10 @@
         <w:pStyle w:val="Heading1"/>
       </w:pPr>
       <w:r>
+        <w:rPr>
+          <w:rFonts w:ascii="Calibri" w:hAnsi="Calibri"/>
+          <w:color w:val="1A1A2E"/>
+        </w:rPr>
         <w:t>Referências</w:t>
       </w:r>
     </w:p>
@@ -4450,13 +5290,34 @@
       </w:r>
     </w:p>
     <w:sectPr>
+      <w:footerReference w:type="default" r:id="rId9"/>
       <w:pgSz w:w="12240" w:h="15840"/>
-      <w:pgMar w:top="1701" w:right="1417" w:bottom="1417" w:left="1701" w:header="720" w:footer="720" w:gutter="0"/>
+      <w:pgMar w:top="1417" w:right="1701" w:bottom="1417" w:left="1701" w:header="720" w:footer="720" w:gutter="0"/>
       <w:cols w:space="720"/>
       <w:docGrid w:linePitch="360"/>
     </w:sectPr>
   </w:body>
 </w:document>
+</file>
+
+<file path=word/footer1.xml><?xml version="1.0" encoding="utf-8"?>
+<w:ftr xmlns:m="http://schemas.openxmlformats.org/officeDocument/2006/math" xmlns:mc="http://schemas.openxmlformats.org/markup-compatibility/2006" xmlns:mo="http://schemas.microsoft.com/office/mac/office/2008/main" xmlns:mv="urn:schemas-microsoft-com:mac:vml" xmlns:o="urn:schemas-microsoft-com:office:office" xmlns:r="http://schemas.openxmlformats.org/officeDocument/2006/relationships" xmlns:v="urn:schemas-microsoft-com:vml" xmlns:w10="urn:schemas-microsoft-com:office:word" xmlns:w14="http://schemas.microsoft.com/office/word/2010/wordml" xmlns:w="http://schemas.openxmlformats.org/wordprocessingml/2006/main" xmlns:wne="http://schemas.microsoft.com/office/word/2006/wordml" xmlns:wp14="http://schemas.microsoft.com/office/word/2010/wordprocessingDrawing" xmlns:wp="http://schemas.openxmlformats.org/drawingml/2006/wordprocessingDrawing" xmlns:wpc="http://schemas.microsoft.com/office/word/2010/wordprocessingCanvas" xmlns:wpg="http://schemas.microsoft.com/office/word/2010/wordprocessingGroup" xmlns:wpi="http://schemas.microsoft.com/office/word/2010/wordprocessingInk" xmlns:wps="http://schemas.microsoft.com/office/word/2010/wordprocessingShape" mc:Ignorable="w14 wp14">
+  <w:p>
+    <w:pPr>
+      <w:pStyle w:val="Footer"/>
+      <w:jc w:val="center"/>
+    </w:pPr>
+    <w:r>
+      <w:rPr>
+        <w:rFonts w:ascii="Times New Roman" w:hAnsi="Times New Roman"/>
+        <w:sz w:val="20"/>
+      </w:rPr>
+      <w:fldChar w:fldCharType="begin"/>
+      <w:instrText xml:space="preserve"> PAGE </w:instrText>
+      <w:fldChar w:fldCharType="end"/>
+    </w:r>
+  </w:p>
+</w:ftr>
 </file>
 
 <file path=word/numbering.xml><?xml version="1.0" encoding="utf-8"?>

</xml_diff>

<commit_message>
feat: capa UFC no PDF + logo no site + remove slides + README reorganizado
</commit_message>
<xml_diff>
--- a/RELATORIO_FINAL.docx
+++ b/RELATORIO_FINAL.docx
@@ -2,6 +2,363 @@
 <file path=word/document.xml><?xml version="1.0" encoding="utf-8"?>
 <w:document xmlns:wpc="http://schemas.microsoft.com/office/word/2010/wordprocessingCanvas" xmlns:mo="http://schemas.microsoft.com/office/mac/office/2008/main" xmlns:mc="http://schemas.openxmlformats.org/markup-compatibility/2006" xmlns:mv="urn:schemas-microsoft-com:mac:vml" xmlns:o="urn:schemas-microsoft-com:office:office" xmlns:r="http://schemas.openxmlformats.org/officeDocument/2006/relationships" xmlns:m="http://schemas.openxmlformats.org/officeDocument/2006/math" xmlns:v="urn:schemas-microsoft-com:vml" xmlns:wp14="http://schemas.microsoft.com/office/word/2010/wordprocessingDrawing" xmlns:wp="http://schemas.openxmlformats.org/drawingml/2006/wordprocessingDrawing" xmlns:w10="urn:schemas-microsoft-com:office:word" xmlns:w="http://schemas.openxmlformats.org/wordprocessingml/2006/main" xmlns:w14="http://schemas.microsoft.com/office/word/2010/wordml" xmlns:wpg="http://schemas.microsoft.com/office/word/2010/wordprocessingGroup" xmlns:wpi="http://schemas.microsoft.com/office/word/2010/wordprocessingInk" xmlns:wne="http://schemas.microsoft.com/office/word/2006/wordml" xmlns:wps="http://schemas.microsoft.com/office/word/2010/wordprocessingShape" mc:Ignorable="w14 wp14">
   <w:body>
+    <w:p>
+      <w:pPr>
+        <w:jc w:val="center"/>
+        <w:spacing w:after="120" w:line="360" w:lineRule="auto"/>
+      </w:pPr>
+      <w:r>
+        <w:rPr>
+          <w:rFonts w:ascii="Calibri" w:hAnsi="Calibri"/>
+          <w:sz w:val="16"/>
+        </w:rPr>
+        <w:t xml:space="preserve"/>
+      </w:r>
+    </w:p>
+    <w:p>
+      <w:pPr>
+        <w:jc w:val="center"/>
+        <w:spacing w:after="120" w:line="360" w:lineRule="auto"/>
+      </w:pPr>
+      <w:r>
+        <w:rPr>
+          <w:rFonts w:ascii="Calibri" w:hAnsi="Calibri"/>
+          <w:sz w:val="16"/>
+        </w:rPr>
+        <w:t xml:space="preserve"/>
+      </w:r>
+    </w:p>
+    <w:p>
+      <w:pPr>
+        <w:jc w:val="center"/>
+        <w:spacing w:after="120" w:line="360" w:lineRule="auto"/>
+      </w:pPr>
+      <w:r>
+        <w:rPr>
+          <w:rFonts w:ascii="Calibri" w:hAnsi="Calibri"/>
+          <w:sz w:val="16"/>
+        </w:rPr>
+        <w:t xml:space="preserve"/>
+      </w:r>
+    </w:p>
+    <w:p>
+      <w:pPr>
+        <w:jc w:val="center"/>
+        <w:spacing w:after="120" w:line="360" w:lineRule="auto"/>
+      </w:pPr>
+      <w:r>
+        <w:rPr>
+          <w:rFonts w:ascii="Calibri" w:hAnsi="Calibri"/>
+          <w:sz w:val="16"/>
+        </w:rPr>
+        <w:t xml:space="preserve"/>
+      </w:r>
+    </w:p>
+    <w:p>
+      <w:pPr>
+        <w:jc w:val="center"/>
+        <w:spacing w:after="120" w:line="360" w:lineRule="auto"/>
+      </w:pPr>
+      <w:r>
+        <w:rPr>
+          <w:rFonts w:ascii="Calibri" w:hAnsi="Calibri"/>
+          <w:sz w:val="16"/>
+        </w:rPr>
+        <w:t xml:space="preserve"/>
+      </w:r>
+    </w:p>
+    <w:p>
+      <w:pPr>
+        <w:jc w:val="center"/>
+        <w:spacing w:after="120" w:line="360" w:lineRule="auto"/>
+      </w:pPr>
+      <w:r>
+        <w:rPr>
+          <w:rFonts w:ascii="Calibri" w:hAnsi="Calibri"/>
+          <w:sz w:val="16"/>
+        </w:rPr>
+        <w:t xml:space="preserve"/>
+      </w:r>
+    </w:p>
+    <w:p>
+      <w:pPr>
+        <w:jc w:val="center"/>
+        <w:spacing w:after="120" w:line="360" w:lineRule="auto"/>
+      </w:pPr>
+      <w:r>
+        <w:rPr>
+          <w:rFonts w:ascii="Calibri" w:hAnsi="Calibri"/>
+          <w:sz w:val="16"/>
+        </w:rPr>
+        <w:t xml:space="preserve"/>
+      </w:r>
+    </w:p>
+    <w:p>
+      <w:pPr>
+        <w:jc w:val="center"/>
+        <w:spacing w:after="120" w:line="360" w:lineRule="auto"/>
+      </w:pPr>
+      <w:r>
+        <w:rPr>
+          <w:rFonts w:ascii="Calibri" w:hAnsi="Calibri"/>
+          <w:sz w:val="16"/>
+        </w:rPr>
+        <w:t xml:space="preserve"/>
+      </w:r>
+    </w:p>
+    <w:p>
+      <w:pPr>
+        <w:jc w:val="center"/>
+        <w:spacing w:after="120" w:line="360" w:lineRule="auto"/>
+      </w:pPr>
+      <w:r>
+        <w:rPr>
+          <w:rFonts w:ascii="Calibri" w:hAnsi="Calibri"/>
+          <w:sz w:val="26"/>
+          <w:b/>
+          <w:color w:val="1a1a2e"/>
+        </w:rPr>
+        <w:t xml:space="preserve">UNIVERSIDADE FEDERAL DO CEARÁ</w:t>
+      </w:r>
+    </w:p>
+    <w:p>
+      <w:pPr>
+        <w:jc w:val="center"/>
+        <w:spacing w:after="120" w:line="360" w:lineRule="auto"/>
+      </w:pPr>
+      <w:r>
+        <w:rPr>
+          <w:rFonts w:ascii="Calibri" w:hAnsi="Calibri"/>
+          <w:sz w:val="22"/>
+          <w:color w:val="1a1a2e"/>
+        </w:rPr>
+        <w:t xml:space="preserve">CAMPUS DE RUSSAS</w:t>
+      </w:r>
+    </w:p>
+    <w:p>
+      <w:pPr>
+        <w:jc w:val="center"/>
+        <w:spacing w:after="120" w:line="360" w:lineRule="auto"/>
+      </w:pPr>
+      <w:r>
+        <w:rPr>
+          <w:rFonts w:ascii="Calibri" w:hAnsi="Calibri"/>
+          <w:sz w:val="20"/>
+          <w:color w:val="555555"/>
+        </w:rPr>
+        <w:t xml:space="preserve">CURSO DE CIÊNCIA DA COMPUTAÇÃO / ENGENHARIA DE SOFTWARE</w:t>
+      </w:r>
+    </w:p>
+    <w:p>
+      <w:pPr>
+        <w:jc w:val="center"/>
+        <w:spacing w:after="120" w:line="360" w:lineRule="auto"/>
+      </w:pPr>
+      <w:r>
+        <w:rPr>
+          <w:rFonts w:ascii="Calibri" w:hAnsi="Calibri"/>
+          <w:sz w:val="32"/>
+        </w:rPr>
+        <w:t xml:space="preserve"/>
+      </w:r>
+    </w:p>
+    <w:p>
+      <w:pPr>
+        <w:jc w:val="center"/>
+        <w:spacing w:after="120" w:line="360" w:lineRule="auto"/>
+      </w:pPr>
+      <w:r>
+        <w:rPr>
+          <w:rFonts w:ascii="Calibri" w:hAnsi="Calibri"/>
+          <w:sz w:val="20"/>
+          <w:color w:val="FF904D"/>
+        </w:rPr>
+        <w:t xml:space="preserve">═══════════════════════════════════</w:t>
+      </w:r>
+    </w:p>
+    <w:p>
+      <w:pPr>
+        <w:jc w:val="center"/>
+        <w:spacing w:after="120" w:line="360" w:lineRule="auto"/>
+      </w:pPr>
+      <w:r>
+        <w:rPr>
+          <w:rFonts w:ascii="Calibri" w:hAnsi="Calibri"/>
+          <w:sz w:val="24"/>
+        </w:rPr>
+        <w:t xml:space="preserve"/>
+      </w:r>
+    </w:p>
+    <w:p>
+      <w:pPr>
+        <w:jc w:val="center"/>
+        <w:spacing w:after="120" w:line="360" w:lineRule="auto"/>
+      </w:pPr>
+      <w:r>
+        <w:rPr>
+          <w:rFonts w:ascii="Calibri" w:hAnsi="Calibri"/>
+          <w:sz w:val="36"/>
+          <w:b/>
+          <w:color w:val="1a1a2e"/>
+        </w:rPr>
+        <w:t xml:space="preserve">PROGRAMAÇÃO DINÂMICA APLICADA</w:t>
+      </w:r>
+    </w:p>
+    <w:p>
+      <w:pPr>
+        <w:jc w:val="center"/>
+        <w:spacing w:after="120" w:line="360" w:lineRule="auto"/>
+      </w:pPr>
+      <w:r>
+        <w:rPr>
+          <w:rFonts w:ascii="Calibri" w:hAnsi="Calibri"/>
+          <w:sz w:val="36"/>
+          <w:b/>
+          <w:color w:val="1a1a2e"/>
+        </w:rPr>
+        <w:t xml:space="preserve">AO PROBLEMA DA MOCHILA 0/1</w:t>
+      </w:r>
+    </w:p>
+    <w:p>
+      <w:pPr>
+        <w:jc w:val="center"/>
+        <w:spacing w:after="120" w:line="360" w:lineRule="auto"/>
+      </w:pPr>
+      <w:r>
+        <w:rPr>
+          <w:rFonts w:ascii="Calibri" w:hAnsi="Calibri"/>
+          <w:sz w:val="20"/>
+        </w:rPr>
+        <w:t xml:space="preserve"/>
+      </w:r>
+    </w:p>
+    <w:p>
+      <w:pPr>
+        <w:jc w:val="center"/>
+        <w:spacing w:after="120" w:line="360" w:lineRule="auto"/>
+      </w:pPr>
+      <w:r>
+        <w:rPr>
+          <w:rFonts w:ascii="Calibri" w:hAnsi="Calibri"/>
+          <w:sz w:val="26"/>
+          <w:color w:val="555555"/>
+        </w:rPr>
+        <w:t xml:space="preserve">Projeto e Análise de Algoritmos</w:t>
+      </w:r>
+    </w:p>
+    <w:p>
+      <w:pPr>
+        <w:jc w:val="center"/>
+        <w:spacing w:after="120" w:line="360" w:lineRule="auto"/>
+      </w:pPr>
+      <w:r>
+        <w:rPr>
+          <w:rFonts w:ascii="Calibri" w:hAnsi="Calibri"/>
+          <w:sz w:val="24"/>
+        </w:rPr>
+        <w:t xml:space="preserve"/>
+      </w:r>
+    </w:p>
+    <w:p>
+      <w:pPr>
+        <w:jc w:val="center"/>
+        <w:spacing w:after="120" w:line="360" w:lineRule="auto"/>
+      </w:pPr>
+      <w:r>
+        <w:rPr>
+          <w:rFonts w:ascii="Times New Roman" w:hAnsi="Times New Roman"/>
+          <w:sz w:val="24"/>
+          <w:color w:val="1a1a2e"/>
+        </w:rPr>
+        <w:t xml:space="preserve">Kumbu Gomes Kuwonza</w:t>
+      </w:r>
+    </w:p>
+    <w:p>
+      <w:pPr>
+        <w:jc w:val="center"/>
+        <w:spacing w:after="120" w:line="360" w:lineRule="auto"/>
+      </w:pPr>
+      <w:r>
+        <w:rPr>
+          <w:rFonts w:ascii="Calibri" w:hAnsi="Calibri"/>
+          <w:sz w:val="12"/>
+        </w:rPr>
+        <w:t xml:space="preserve"/>
+      </w:r>
+    </w:p>
+    <w:p>
+      <w:pPr>
+        <w:jc w:val="center"/>
+        <w:spacing w:after="120" w:line="360" w:lineRule="auto"/>
+      </w:pPr>
+      <w:r>
+        <w:rPr>
+          <w:rFonts w:ascii="Times New Roman" w:hAnsi="Times New Roman"/>
+          <w:sz w:val="22"/>
+          <w:color w:val="333333"/>
+        </w:rPr>
+        <w:t xml:space="preserve">Prof. Dhioleno Rodrigues da Silva</w:t>
+      </w:r>
+    </w:p>
+    <w:p>
+      <w:pPr>
+        <w:jc w:val="center"/>
+        <w:spacing w:after="120" w:line="360" w:lineRule="auto"/>
+      </w:pPr>
+      <w:r>
+        <w:rPr>
+          <w:rFonts w:ascii="Calibri" w:hAnsi="Calibri"/>
+          <w:sz w:val="24"/>
+        </w:rPr>
+        <w:t xml:space="preserve"/>
+      </w:r>
+    </w:p>
+    <w:p>
+      <w:pPr>
+        <w:jc w:val="center"/>
+        <w:spacing w:after="120" w:line="360" w:lineRule="auto"/>
+      </w:pPr>
+      <w:r>
+        <w:rPr>
+          <w:rFonts w:ascii="Times New Roman" w:hAnsi="Times New Roman"/>
+          <w:sz w:val="22"/>
+          <w:color w:val="666666"/>
+        </w:rPr>
+        <w:t xml:space="preserve">Junho de 2026</w:t>
+      </w:r>
+    </w:p>
+    <w:p>
+      <w:pPr>
+        <w:jc w:val="center"/>
+        <w:spacing w:after="120" w:line="360" w:lineRule="auto"/>
+      </w:pPr>
+      <w:r>
+        <w:rPr>
+          <w:rFonts w:ascii="Times New Roman" w:hAnsi="Times New Roman"/>
+          <w:sz w:val="22"/>
+          <w:color w:val="666666"/>
+        </w:rPr>
+        <w:t xml:space="preserve">Russas – Ceará</w:t>
+      </w:r>
+    </w:p>
+    <w:p>
+      <w:pPr>
+        <w:jc w:val="center"/>
+        <w:spacing w:after="120" w:line="360" w:lineRule="auto"/>
+      </w:pPr>
+      <w:r>
+        <w:rPr>
+          <w:rFonts w:ascii="Calibri" w:hAnsi="Calibri"/>
+          <w:sz w:val="12"/>
+        </w:rPr>
+        <w:t xml:space="preserve"/>
+      </w:r>
+    </w:p>
+    <w:p>
+      <w:r>
+        <w:br w:type="page"/>
+      </w:r>
+    </w:p>
     <w:p>
       <w:pPr>
         <w:jc w:val="center"/>

</xml_diff>

<commit_message>
feat: logo UFC no PDF, site e app + codigo organizado
</commit_message>
<xml_diff>
--- a/RELATORIO_FINAL.docx
+++ b/RELATORIO_FINAL.docx
@@ -2,6 +2,51 @@
 <file path=word/document.xml><?xml version="1.0" encoding="utf-8"?>
 <w:document xmlns:wpc="http://schemas.microsoft.com/office/word/2010/wordprocessingCanvas" xmlns:mo="http://schemas.microsoft.com/office/mac/office/2008/main" xmlns:mc="http://schemas.openxmlformats.org/markup-compatibility/2006" xmlns:mv="urn:schemas-microsoft-com:mac:vml" xmlns:o="urn:schemas-microsoft-com:office:office" xmlns:r="http://schemas.openxmlformats.org/officeDocument/2006/relationships" xmlns:m="http://schemas.openxmlformats.org/officeDocument/2006/math" xmlns:v="urn:schemas-microsoft-com:vml" xmlns:wp14="http://schemas.microsoft.com/office/word/2010/wordprocessingDrawing" xmlns:wp="http://schemas.openxmlformats.org/drawingml/2006/wordprocessingDrawing" xmlns:w10="urn:schemas-microsoft-com:office:word" xmlns:w="http://schemas.openxmlformats.org/wordprocessingml/2006/main" xmlns:w14="http://schemas.microsoft.com/office/word/2010/wordml" xmlns:wpg="http://schemas.microsoft.com/office/word/2010/wordprocessingGroup" xmlns:wpi="http://schemas.microsoft.com/office/word/2010/wordprocessingInk" xmlns:wne="http://schemas.microsoft.com/office/word/2006/wordml" xmlns:wps="http://schemas.microsoft.com/office/word/2010/wordprocessingShape" mc:Ignorable="w14 wp14">
   <w:body>
+    <w:p>
+      <w:pPr>
+        <w:spacing w:after="567"/>
+        <w:jc w:val="center"/>
+      </w:pPr>
+      <w:r>
+        <w:drawing>
+          <wp:inline xmlns:a="http://schemas.openxmlformats.org/drawingml/2006/main" xmlns:pic="http://schemas.openxmlformats.org/drawingml/2006/picture">
+            <wp:extent cx="1620000" cy="2430000"/>
+            <wp:docPr id="1" name="Picture 1"/>
+            <wp:cNvGraphicFramePr>
+              <a:graphicFrameLocks noChangeAspect="1"/>
+            </wp:cNvGraphicFramePr>
+            <a:graphic>
+              <a:graphicData uri="http://schemas.openxmlformats.org/drawingml/2006/picture">
+                <pic:pic>
+                  <pic:nvPicPr>
+                    <pic:cNvPr id="0" name="ufc-logo.png"/>
+                    <pic:cNvPicPr/>
+                  </pic:nvPicPr>
+                  <pic:blipFill>
+                    <a:blip r:embed="rId10"/>
+                    <a:stretch>
+                      <a:fillRect/>
+                    </a:stretch>
+                  </pic:blipFill>
+                  <pic:spPr>
+                    <a:xfrm>
+                      <a:off x="0" y="0"/>
+                      <a:ext cx="1620000" cy="2430000"/>
+                    </a:xfrm>
+                    <a:prstGeom prst="rect"/>
+                  </pic:spPr>
+                </pic:pic>
+              </a:graphicData>
+            </a:graphic>
+          </wp:inline>
+        </w:drawing>
+      </w:r>
+    </w:p>
+    <w:p>
+      <w:pPr>
+        <w:spacing w:after="200" w:line="240" w:lineRule="auto"/>
+      </w:pPr>
+    </w:p>
     <w:p>
       <w:pPr>
         <w:jc w:val="center"/>

</xml_diff>

<commit_message>
fix: curso Engenharia Mecânica + mais espaço entre logo e título
</commit_message>
<xml_diff>
--- a/RELATORIO_FINAL.docx
+++ b/RELATORIO_FINAL.docx
@@ -183,7 +183,7 @@
     <w:p>
       <w:pPr>
         <w:jc w:val="center"/>
-        <w:spacing w:after="120" w:line="360" w:lineRule="auto"/>
+        <w:spacing w:after="850" w:line="360" w:lineRule="auto"/>
       </w:pPr>
       <w:r>
         <w:rPr>
@@ -191,13 +191,13 @@
           <w:sz w:val="20"/>
           <w:color w:val="555555"/>
         </w:rPr>
-        <w:t xml:space="preserve">CURSO DE CIÊNCIA DA COMPUTAÇÃO / ENGENHARIA DE SOFTWARE</w:t>
+        <w:t>CURSO DE ENGENHARIA MECÂNICA</w:t>
       </w:r>
     </w:p>
     <w:p>
       <w:pPr>
         <w:jc w:val="center"/>
-        <w:spacing w:after="120" w:line="360" w:lineRule="auto"/>
+        <w:spacing w:after="1701" w:line="360" w:lineRule="auto"/>
       </w:pPr>
       <w:r>
         <w:rPr>
@@ -4296,6 +4296,7 @@
     <w:p>
       <w:pPr>
         <w:pStyle w:val="Heading3"/>
+        <w:spacing w:after="850"/>
       </w:pPr>
       <w:r>
         <w:rPr>
@@ -4306,7 +4307,9 @@
       </w:r>
     </w:p>
     <w:p>
-      <w:pPr/>
+      <w:pPr>
+        <w:spacing w:after="1701"/>
+      </w:pPr>
       <w:r>
         <w:rPr>
           <w:rFonts w:ascii="Times New Roman" w:hAnsi="Times New Roman"/>
@@ -4318,7 +4321,7 @@
     </w:p>
     <w:p>
       <w:pPr>
-        <w:spacing w:line="240" w:lineRule="auto" w:before="0" w:after="0"/>
+        <w:spacing w:line="240" w:lineRule="auto" w:before="0" w:after="850"/>
         <w:ind w:left="283"/>
       </w:pPr>
       <w:r>
@@ -4331,7 +4334,7 @@
     </w:p>
     <w:p>
       <w:pPr>
-        <w:spacing w:line="240" w:lineRule="auto" w:before="0" w:after="0"/>
+        <w:spacing w:line="240" w:lineRule="auto" w:before="0" w:after="1701"/>
         <w:ind w:left="283"/>
       </w:pPr>
       <w:r>
@@ -4344,7 +4347,7 @@
     </w:p>
     <w:p>
       <w:pPr>
-        <w:spacing w:line="240" w:lineRule="auto" w:before="0" w:after="0"/>
+        <w:spacing w:line="240" w:lineRule="auto" w:before="0" w:after="850"/>
         <w:ind w:left="283"/>
       </w:pPr>
       <w:r>
@@ -4356,7 +4359,9 @@
       </w:r>
     </w:p>
     <w:p>
-      <w:pPr/>
+      <w:pPr>
+        <w:spacing w:after="1701"/>
+      </w:pPr>
       <w:r>
         <w:rPr>
           <w:rFonts w:ascii="Times New Roman" w:hAnsi="Times New Roman"/>
@@ -4368,7 +4373,7 @@
     </w:p>
     <w:p>
       <w:pPr>
-        <w:spacing w:line="240" w:lineRule="auto" w:before="0" w:after="0"/>
+        <w:spacing w:line="240" w:lineRule="auto" w:before="0" w:after="850"/>
         <w:ind w:left="283"/>
       </w:pPr>
       <w:r>
@@ -4381,7 +4386,7 @@
     </w:p>
     <w:p>
       <w:pPr>
-        <w:spacing w:line="240" w:lineRule="auto" w:before="0" w:after="0"/>
+        <w:spacing w:line="240" w:lineRule="auto" w:before="0" w:after="1701"/>
         <w:ind w:left="283"/>
       </w:pPr>
       <w:r>
@@ -4563,7 +4568,7 @@
     </w:p>
     <w:p>
       <w:pPr>
-        <w:spacing w:line="240" w:lineRule="auto" w:before="0" w:after="0"/>
+        <w:spacing w:line="240" w:lineRule="auto" w:before="0" w:after="850"/>
         <w:ind w:left="283"/>
       </w:pPr>
       <w:r>
@@ -4575,7 +4580,9 @@
       </w:r>
     </w:p>
     <w:p>
-      <w:pPr/>
+      <w:pPr>
+        <w:spacing w:after="1701"/>
+      </w:pPr>
       <w:r>
         <w:rPr>
           <w:rFonts w:ascii="Times New Roman" w:hAnsi="Times New Roman"/>
@@ -4587,7 +4594,7 @@
     </w:p>
     <w:p>
       <w:pPr>
-        <w:spacing w:line="240" w:lineRule="auto" w:before="0" w:after="0"/>
+        <w:spacing w:line="240" w:lineRule="auto" w:before="0" w:after="850"/>
         <w:ind w:left="283"/>
       </w:pPr>
       <w:r>
@@ -4600,7 +4607,7 @@
     </w:p>
     <w:p>
       <w:pPr>
-        <w:spacing w:line="240" w:lineRule="auto" w:before="0" w:after="0"/>
+        <w:spacing w:line="240" w:lineRule="auto" w:before="0" w:after="1701"/>
         <w:ind w:left="283"/>
       </w:pPr>
       <w:r>

</xml_diff>

<commit_message>
chore: stage docx TOC + remove temp
</commit_message>
<xml_diff>
--- a/RELATORIO_FINAL.docx
+++ b/RELATORIO_FINAL.docx
@@ -181,14 +181,7 @@
           <w:color w:val="333333"/>
           <w:sz w:val="22"/>
         </w:rPr>
-        <w:t>Prof. Dhioleno</w:t>
-      </w:r>
-      <w:r>
-        <w:rPr>
-          <w:color w:val="333333"/>
-          <w:sz w:val="22"/>
-        </w:rPr>
-        <w:t xml:space="preserve"> Rodrigues da Silva</w:t>
+        <w:t>Prof. Dhioleno Rodrigues da Silva</w:t>
       </w:r>
     </w:p>
     <w:p>
@@ -1860,26 +1853,17 @@
     </w:p>
     <w:p>
       <w:r>
-        <w:t xml:space="preserve">A disciplina de Projeto e Análise de Algoritmos ocupa posição central na formação de estudantes de Ciência da Computação e Engenharia de Software, pois fornece as ferramentas conceituais e analíticas necessárias para projetar soluções computacionais eficientes diante de problemas com alto custo combinatório. Entre as diversas técnicas estudadas ao longo do curso, a Programação Dinâmica destaca-se por sua elegância e capacidade de transformar problemas aparentemente intratáveis em tarefas computacionalmente </w:t>
-      </w:r>
-      <w:r>
-        <w:t>viáveis, por meio do reaproveitamento inteligente de resultados intermediários.</w:t>
+        <w:t>A disciplina de Projeto e Análise de Algoritmos ocupa posição central na formação de estudantes de Ciência da Computação e Engenharia de Software, pois fornece as ferramentas conceituais e analíticas necessárias para projetar soluções computacionais eficientes diante de problemas com alto custo combinatório. Entre as diversas técnicas estudadas ao longo do curso, a Programação Dinâmica destaca-se por sua elegância e capacidade de transformar problemas aparentemente intratáveis em tarefas computacionalmente viáveis, por meio do reaproveitamento inteligente de resultados intermediários.</w:t>
       </w:r>
     </w:p>
     <w:p>
       <w:r>
-        <w:t>O presente trabalho tem como objetivo investigar a aplicação da técnica de Programação Dinâmica ao clássico problema da Mochila 0/1 (0/1 Knapsack Problem), um dos problemas canônicos da otimização combinatória. Busca-se, por meio deste estudo, consolidar a compreensão teórica dos fundamentos da Programação Dinâmica e, simultaneamente, demonstrar sua aplicação prática por meio de implementações funcionais na linguagem JavaScript. O texto percorre desde a fundamentação matemática da técnica até a análise de d</w:t>
-      </w:r>
-      <w:r>
-        <w:t>esempenho de diferentes estratégias de codificação, passando pela exemplificação com cenários realistas de logística e gestão de recursos.</w:t>
+        <w:t>O presente trabalho tem como objetivo investigar a aplicação da técnica de Programação Dinâmica ao clássico problema da Mochila 0/1 (0/1 Knapsack Problem), um dos problemas canônicos da otimização combinatória. Busca-se, por meio deste estudo, consolidar a compreensão teórica dos fundamentos da Programação Dinâmica e, simultaneamente, demonstrar sua aplicação prática por meio de implementações funcionais na linguagem JavaScript. O texto percorre desde a fundamentação matemática da técnica até a análise de desempenho de diferentes estratégias de codificação, passando pela exemplificação com cenários realistas de logística e gestão de recursos.</w:t>
       </w:r>
     </w:p>
     <w:p>
       <w:r>
-        <w:t xml:space="preserve">O relatório está organizado em seis seções principais. A Seção 2 estabelece a fundamentação teórica, cobrindo os conceitos gerais da Programação Dinâmica, suas duas abordagens clássicas de implementação e a formulação do problema da Mochila 0/1. A Seção 3 descreve o desenvolvimento prático realizado, incluindo a definição da recorrência, a construção passo a passo da tabela de soluções e as implementações em JavaScript com exemplos de execução. A Seção 4 apresenta a análise da complexidade computacional do </w:t>
-      </w:r>
-      <w:r>
-        <w:t>algoritmo desenvolvido. A Seção 5 discute aplicações do problema da Mochila em sistemas reais. Por fim, a Seção 6 sintetiza os principais aprendizados e aponta direções para trabalhos futuros.</w:t>
+        <w:t>O relatório está organizado em seis seções principais. A Seção 2 estabelece a fundamentação teórica, cobrindo os conceitos gerais da Programação Dinâmica, suas duas abordagens clássicas de implementação e a formulação do problema da Mochila 0/1. A Seção 3 descreve o desenvolvimento prático realizado, incluindo a definição da recorrência, a construção passo a passo da tabela de soluções e as implementações em JavaScript com exemplos de execução. A Seção 4 apresenta a análise da complexidade computacional do algoritmo desenvolvido. A Seção 5 discute aplicações do problema da Mochila em sistemas reais. Por fim, a Seção 6 sintetiza os principais aprendizados e aponta direções para trabalhos futuros.</w:t>
       </w:r>
     </w:p>
     <w:p>
@@ -1913,18 +1897,12 @@
     </w:p>
     <w:p>
       <w:r>
-        <w:t xml:space="preserve">A Programação Dinâmica (do inglês Dynamic Programming, abreviada como DP) é uma técnica algorítmica de otimização cuja ideia central reside em decompor um problema complexo em subproblemas menores, resolvê-los uma única vez e armazenar seus resultados para consulta futura, evitando assim a recomputação redundante. Ao contrário do que o nome sugere, o termo não se refere a uma forma de programar computadores, mas sim ao sentido matemático de "programação" como planejamento ou tomada de decisão sequencial. A </w:t>
-      </w:r>
-      <w:r>
-        <w:t>técnica é particularmente eficaz quando o espaço de busca é exponencial, mas pode ser reduzido por meio do reaproveitamento de soluções intermediárias, transformando problemas aparentemente intratáveis em soluções de complexidade polinomial ou pseudo-polinomial.</w:t>
+        <w:t>A Programação Dinâmica (do inglês Dynamic Programming, abreviada como DP) é uma técnica algorítmica de otimização cuja ideia central reside em decompor um problema complexo em subproblemas menores, resolvê-los uma única vez e armazenar seus resultados para consulta futura, evitando assim a recomputação redundante. Ao contrário do que o nome sugere, o termo não se refere a uma forma de programar computadores, mas sim ao sentido matemático de "programação" como planejamento ou tomada de decisão sequencial. A técnica é particularmente eficaz quando o espaço de busca é exponencial, mas pode ser reduzido por meio do reaproveitamento de soluções intermediárias, transformando problemas aparentemente intratáveis em soluções de complexidade polinomial ou pseudo-polinomial.</w:t>
       </w:r>
     </w:p>
     <w:p>
       <w:r>
-        <w:t>A origem da Programação Dinâmica remonta à década de 1950, com os trabalhos seminais do matemático americano Richard Bellman, que cunhou o termo enquanto desenvolvia métodos para problemas de decisão multiestágio na RAND Corporation. Bellman formulou o que hoje conhecemos como o Princípio da Otimalidade, segundo o qual "uma política ótima tem a propriedade de que, quaisquer que sejam o estado inicial e a decisão inicial, as decisões restantes devem constituir uma política ótima em relação ao estado resultan</w:t>
-      </w:r>
-      <w:r>
-        <w:t>te da primeira decisão". Esse princípio estabeleceu as bases teóricas para o que viria a se tornar uma das técnicas mais poderosas da ciência da computação, com aplicações que vão da bioinformática à inteligência artificial.</w:t>
+        <w:t>A origem da Programação Dinâmica remonta à década de 1950, com os trabalhos seminais do matemático americano Richard Bellman, que cunhou o termo enquanto desenvolvia métodos para problemas de decisão multiestágio na RAND Corporation. Bellman formulou o que hoje conhecemos como o Princípio da Otimalidade, segundo o qual "uma política ótima tem a propriedade de que, quaisquer que sejam o estado inicial e a decisão inicial, as decisões restantes devem constituir uma política ótima em relação ao estado resultante da primeira decisão". Esse princípio estabeleceu as bases teóricas para o que viria a se tornar uma das técnicas mais poderosas da ciência da computação, com aplicações que vão da bioinformática à inteligência artificial.</w:t>
       </w:r>
     </w:p>
     <w:p>
@@ -1947,19 +1925,13 @@
         <w:t>subestrutura ótima</w:t>
       </w:r>
       <w:r>
-        <w:t>. A sobreposição de subproblemas ocorre quando, ao decompor recursivamente o problema original, os mesmos subproblemas menores são gerados repetidamente: fenômeno que não ocorre, por exemplo, na ordenação por merge sort, em que cada subproblema é distinto. Já a subestrutura ótima é a propriedade que garante que a solução ótima do problema original pode ser construída a partir das soluções ótimas de seus subproblemas, permitindo a composição de respostas sem</w:t>
-      </w:r>
-      <w:r>
-        <w:t xml:space="preserve"> a necessidade de reavaliar decisões anteriores.</w:t>
+        <w:t>. A sobreposição de subproblemas ocorre quando, ao decompor recursivamente o problema original, os mesmos subproblemas menores são gerados repetidamente: fenômeno que não ocorre, por exemplo, na ordenação por merge sort, em que cada subproblema é distinto. Já a subestrutura ótima é a propriedade que garante que a solução ótima do problema original pode ser construída a partir das soluções ótimas de seus subproblemas, permitindo a composição de respostas sem a necessidade de reavaliar decisões anteriores.</w:t>
       </w:r>
     </w:p>
     <w:p>
       <w:r>
         <w:lastRenderedPageBreak/>
-        <w:t>A diferença essencial entre Programação Dinâmica e a técnica de divisão-e-conquista reside justamente na natureza dos subproblemas. Na divisão-e-conquista, os subproblemas são independentes e disjuntos: pense no quicksort ou na busca binária:, de modo que cada subproblema é resolvido recursivamente exatamente uma vez. Na Programação Dinâmica, os subproblemas se sobrepõem, e resolvê-los repetidamente sem memorização resultaria em explosão combinatória. A DP resolve essa ineficiência armazenando resultados em</w:t>
-      </w:r>
-      <w:r>
-        <w:t xml:space="preserve"> estruturas de dados (tipicamente tabelas ou matrizes) e consultando-os quando necessário, um trade-off deliberado de espaço por tempo. A técnica deve ser empregada sempre que o problema exibir as duas propriedades mencionadas e o espaço de estados for gerenciável em memória.</w:t>
+        <w:t>A diferença essencial entre Programação Dinâmica e a técnica de divisão-e-conquista reside justamente na natureza dos subproblemas. Na divisão-e-conquista, os subproblemas são independentes e disjuntos: pense no quicksort ou na busca binária:, de modo que cada subproblema é resolvido recursivamente exatamente uma vez. Na Programação Dinâmica, os subproblemas se sobrepõem, e resolvê-los repetidamente sem memorização resultaria em explosão combinatória. A DP resolve essa ineficiência armazenando resultados em estruturas de dados (tipicamente tabelas ou matrizes) e consultando-os quando necessário, um trade-off deliberado de espaço por tempo. A técnica deve ser empregada sempre que o problema exibir as duas propriedades mencionadas e o espaço de estados for gerenciável em memória.</w:t>
       </w:r>
     </w:p>
     <w:p>
@@ -1978,13 +1950,7 @@
     </w:p>
     <w:p>
       <w:r>
-        <w:t>A Programação Dinâmica admite duas estratégias clássicas de implementação, que diferem fundamentalmente na ordem em que os subproblemas são visitados. A primeira, conhecida como memoização (do inglês memoization), adota uma perspectiva top-down: parte-se do problema original e recorre-se aos subproblemas menores conforme necessário, armazenando os resultados em uma estrutura de cache: tipicamente um dicionário ou vetor indexado: de modo que cada subproblema seja resolvido no máximo uma vez. A principal vant</w:t>
-      </w:r>
-      <w:r>
-        <w:t>agem da memoização é sua elegância conceitual: a implementação segue naturalmente a definição recursiva do problema, preservando a clareza do raciocínio matemático original. Além disso, a memoização resolve apenas os subproblemas estritamente necessários para a solução do problema original: se determinados estados nunca são visitados, seus valores jamais são computados. A desvantagem reside no overhead das chamadas recursivas, que consomem espaço na pilha de execução e podem causar estouro de pilha para pro</w:t>
-      </w:r>
-      <w:r>
-        <w:t>blemas com profundidade de recursão elevada.</w:t>
+        <w:t>A Programação Dinâmica admite duas estratégias clássicas de implementação, que diferem fundamentalmente na ordem em que os subproblemas são visitados. A primeira, conhecida como memoização (do inglês memoization), adota uma perspectiva top-down: parte-se do problema original e recorre-se aos subproblemas menores conforme necessário, armazenando os resultados em uma estrutura de cache: tipicamente um dicionário ou vetor indexado: de modo que cada subproblema seja resolvido no máximo uma vez. A principal vantagem da memoização é sua elegância conceitual: a implementação segue naturalmente a definição recursiva do problema, preservando a clareza do raciocínio matemático original. Além disso, a memoização resolve apenas os subproblemas estritamente necessários para a solução do problema original: se determinados estados nunca são visitados, seus valores jamais são computados. A desvantagem reside no overhead das chamadas recursivas, que consomem espaço na pilha de execução e podem causar estouro de pilha para problemas com profundidade de recursão elevada.</w:t>
       </w:r>
     </w:p>
     <w:p>
@@ -1998,10 +1964,7 @@
     </w:p>
     <w:p>
       <w:r>
-        <w:t>A análise de complexidade em Programação Dinâmica é parametrizada pelo número de estados distintos do problema e pelo custo de transição entre estados. Se um problema possui S estados distintos e cada transição pode ser computada em tempo T, a complexidade temporal será O(S · T). No caso do tabelamento, essa análise é direta: preenchemos S entradas da tabela, cada uma exigindo T operações. A complexidade espacial é O(S), podendo ser reduzida quando as transições dependem apenas de um subconjunto limitado de</w:t>
-      </w:r>
-      <w:r>
-        <w:t xml:space="preserve"> estados anteriores. É importante notar que, para problemas cujo número de estados depende de parâmetros numéricos do domínio (como a capacidade W no problema da mochila), a complexidade resultante é pseudo-polinomial: polinomial no valor numérico da entrada, mas não no número de bits necessários para representá-la:, o que distingue esses problemas dos genuinamente polinomiais.</w:t>
+        <w:t>A análise de complexidade em Programação Dinâmica é parametrizada pelo número de estados distintos do problema e pelo custo de transição entre estados. Se um problema possui S estados distintos e cada transição pode ser computada em tempo T, a complexidade temporal será O(S · T). No caso do tabelamento, essa análise é direta: preenchemos S entradas da tabela, cada uma exigindo T operações. A complexidade espacial é O(S), podendo ser reduzida quando as transições dependem apenas de um subconjunto limitado de estados anteriores. É importante notar que, para problemas cujo número de estados depende de parâmetros numéricos do domínio (como a capacidade W no problema da mochila), a complexidade resultante é pseudo-polinomial: polinomial no valor numérico da entrada, mas não no número de bits necessários para representá-la:, o que distingue esses problemas dos genuinamente polinomiais.</w:t>
       </w:r>
     </w:p>
     <w:p>
@@ -2020,10 +1983,7 @@
     </w:p>
     <w:p>
       <w:r>
-        <w:t>O problema da Mochila 0/1 é um dos mais estudados na literatura de otimização combinatória e pertence à classe dos problemas NP-difíceis. Sua formulação clássica é notavelmente simples: dados n itens, cada qual com um peso w_i e um valor v_i, e uma mochila com capacidade máxima W, deseja-se selecionar um subconjunto de itens cujo peso total não exceda W e cujo valor total seja o maior possível. O qualificador "0/1" indica que cada item pode ser incluído no máximo uma vez: ou seja, trata-se de uma decisão bi</w:t>
-      </w:r>
-      <w:r>
-        <w:t>nária: levar ou não levar o item. Formalmente, o problema pode ser expresso como:</w:t>
+        <w:t>O problema da Mochila 0/1 é um dos mais estudados na literatura de otimização combinatória e pertence à classe dos problemas NP-difíceis. Sua formulação clássica é notavelmente simples: dados n itens, cada qual com um peso w_i e um valor v_i, e uma mochila com capacidade máxima W, deseja-se selecionar um subconjunto de itens cujo peso total não exceda W e cujo valor total seja o maior possível. O qualificador "0/1" indica que cada item pode ser incluído no máximo uma vez: ou seja, trata-se de uma decisão binária: levar ou não levar o item. Formalmente, o problema pode ser expresso como:</w:t>
       </w:r>
     </w:p>
     <w:p>
@@ -3809,14 +3769,7 @@
           <w:sz w:val="18"/>
         </w:rPr>
         <w:br/>
-        <w:t xml:space="preserve"> } e</w:t>
-      </w:r>
-      <w:r>
-        <w:rPr>
-          <w:rFonts w:ascii="Courier New" w:hAnsi="Courier New"/>
-          <w:sz w:val="18"/>
-        </w:rPr>
-        <w:t>lse { dp[i][w] = semItem; }</w:t>
+        <w:t xml:space="preserve"> } else { dp[i][w] = semItem; }</w:t>
       </w:r>
       <w:r>
         <w:rPr>
@@ -3995,12 +3948,6 @@
           <w:sz w:val="18"/>
         </w:rPr>
         <w:br/>
-      </w:r>
-      <w:r>
-        <w:rPr>
-          <w:rFonts w:ascii="Courier New" w:hAnsi="Courier New"/>
-          <w:sz w:val="18"/>
-        </w:rPr>
         <w:t xml:space="preserve"> const dp = Array(capacidade + 1).fill(0);</w:t>
       </w:r>
       <w:r>
@@ -4150,14 +4097,7 @@
           <w:sz w:val="18"/>
         </w:rPr>
         <w:br/>
-        <w:t xml:space="preserve"> for (let i = n; i </w:t>
-      </w:r>
-      <w:r>
-        <w:rPr>
-          <w:rFonts w:ascii="Courier New" w:hAnsi="Courier New"/>
-          <w:sz w:val="18"/>
-        </w:rPr>
-        <w:t>&gt;= 1; i--) {</w:t>
+        <w:t xml:space="preserve"> for (let i = n; i &gt;= 1; i--) {</w:t>
       </w:r>
       <w:r>
         <w:rPr>

</xml_diff>